<commit_message>
Add G10 NC/CC/PF two-panel figure re-timed to latency budget
PF follows NC until STATCOM action at 0.649 s (no step change in rotor
angle); adds a T_comm = 200 ms case. Tables document updated.

Co-Authored-By: Claude Opus 5.5 <noreply@anthropic.com>
Claude-Session: https://claude.ai/code/session_017mvBckRxt83VPQqr9i583E
</commit_message>
<xml_diff>
--- a/figures/Timing_and_Results_Tables.docx
+++ b/figures/Timing_and_Results_Tables.docx
@@ -2370,6 +2370,188 @@
                 <w:sz w:val="18"/>
                 <w:szCs w:val="18"/>
               </w:rPr>
+              <w:t xml:space="preserve">G10 NC / CC / PF</w:t>
+            </w:r>
+          </w:p>
+        </w:tc>
+        <w:tc>
+          <w:tcPr>
+            <w:tcW w:type="dxa" w:w="1250"/>
+            <w:tcBorders>
+              <w:top w:val="none" w:color="FFFFFF" w:sz="0"/>
+              <w:left w:val="none" w:color="FFFFFF" w:sz="0"/>
+              <w:bottom w:val="none" w:color="FFFFFF" w:sz="0"/>
+              <w:right w:val="none" w:color="FFFFFF" w:sz="0"/>
+            </w:tcBorders>
+            <w:tcMar>
+              <w:top w:type="dxa" w:w="50"/>
+              <w:left w:type="dxa" w:w="90"/>
+              <w:bottom w:type="dxa" w:w="50"/>
+              <w:right w:type="dxa" w:w="90"/>
+            </w:tcMar>
+          </w:tcPr>
+          <w:p>
+            <w:pPr>
+              <w:jc w:val="center"/>
+            </w:pPr>
+            <w:r>
+              <w:rPr>
+                <w:rFonts w:ascii="Times New Roman" w:cs="Times New Roman" w:eastAsia="Times New Roman" w:hAnsi="Times New Roman"/>
+                <w:sz w:val="18"/>
+                <w:szCs w:val="18"/>
+              </w:rPr>
+              <w:t xml:space="preserve">STATCOM</w:t>
+            </w:r>
+          </w:p>
+        </w:tc>
+        <w:tc>
+          <w:tcPr>
+            <w:tcW w:type="dxa" w:w="1350"/>
+            <w:tcBorders>
+              <w:top w:val="none" w:color="FFFFFF" w:sz="0"/>
+              <w:left w:val="none" w:color="FFFFFF" w:sz="0"/>
+              <w:bottom w:val="none" w:color="FFFFFF" w:sz="0"/>
+              <w:right w:val="none" w:color="FFFFFF" w:sz="0"/>
+            </w:tcBorders>
+            <w:tcMar>
+              <w:top w:type="dxa" w:w="50"/>
+              <w:left w:type="dxa" w:w="90"/>
+              <w:bottom w:type="dxa" w:w="50"/>
+              <w:right w:type="dxa" w:w="90"/>
+            </w:tcMar>
+          </w:tcPr>
+          <w:p>
+            <w:pPr>
+              <w:jc w:val="center"/>
+            </w:pPr>
+            <w:r>
+              <w:rPr>
+                <w:rFonts w:ascii="Times New Roman" w:cs="Times New Roman" w:eastAsia="Times New Roman" w:hAnsi="Times New Roman"/>
+                <w:sz w:val="18"/>
+                <w:szCs w:val="18"/>
+              </w:rPr>
+              <w:t xml:space="preserve">0.10</w:t>
+            </w:r>
+          </w:p>
+        </w:tc>
+        <w:tc>
+          <w:tcPr>
+            <w:tcW w:type="dxa" w:w="1300"/>
+            <w:tcBorders>
+              <w:top w:val="none" w:color="FFFFFF" w:sz="0"/>
+              <w:left w:val="none" w:color="FFFFFF" w:sz="0"/>
+              <w:bottom w:val="none" w:color="FFFFFF" w:sz="0"/>
+              <w:right w:val="none" w:color="FFFFFF" w:sz="0"/>
+            </w:tcBorders>
+            <w:tcMar>
+              <w:top w:type="dxa" w:w="50"/>
+              <w:left w:type="dxa" w:w="90"/>
+              <w:bottom w:type="dxa" w:w="50"/>
+              <w:right w:type="dxa" w:w="90"/>
+            </w:tcMar>
+          </w:tcPr>
+          <w:p>
+            <w:pPr>
+              <w:jc w:val="center"/>
+            </w:pPr>
+            <w:r>
+              <w:rPr>
+                <w:rFonts w:ascii="Times New Roman" w:cs="Times New Roman" w:eastAsia="Times New Roman" w:hAnsi="Times New Roman"/>
+                <w:sz w:val="18"/>
+                <w:szCs w:val="18"/>
+              </w:rPr>
+              <w:t xml:space="preserve">0.619</w:t>
+            </w:r>
+          </w:p>
+        </w:tc>
+        <w:tc>
+          <w:tcPr>
+            <w:tcW w:type="dxa" w:w="1480"/>
+            <w:tcBorders>
+              <w:top w:val="none" w:color="FFFFFF" w:sz="0"/>
+              <w:left w:val="none" w:color="FFFFFF" w:sz="0"/>
+              <w:bottom w:val="none" w:color="FFFFFF" w:sz="0"/>
+              <w:right w:val="none" w:color="FFFFFF" w:sz="0"/>
+            </w:tcBorders>
+            <w:tcMar>
+              <w:top w:type="dxa" w:w="50"/>
+              <w:left w:type="dxa" w:w="90"/>
+              <w:bottom w:type="dxa" w:w="50"/>
+              <w:right w:type="dxa" w:w="90"/>
+            </w:tcMar>
+          </w:tcPr>
+          <w:p>
+            <w:pPr>
+              <w:jc w:val="center"/>
+            </w:pPr>
+            <w:r>
+              <w:rPr>
+                <w:rFonts w:ascii="Times New Roman" w:cs="Times New Roman" w:eastAsia="Times New Roman" w:hAnsi="Times New Roman"/>
+                <w:sz w:val="18"/>
+                <w:szCs w:val="18"/>
+              </w:rPr>
+              <w:t xml:space="preserve">0.649</w:t>
+            </w:r>
+          </w:p>
+        </w:tc>
+        <w:tc>
+          <w:tcPr>
+            <w:tcW w:type="dxa" w:w="1480"/>
+            <w:tcBorders>
+              <w:top w:val="none" w:color="FFFFFF" w:sz="0"/>
+              <w:left w:val="none" w:color="FFFFFF" w:sz="0"/>
+              <w:bottom w:val="none" w:color="FFFFFF" w:sz="0"/>
+              <w:right w:val="none" w:color="FFFFFF" w:sz="0"/>
+            </w:tcBorders>
+            <w:tcMar>
+              <w:top w:type="dxa" w:w="50"/>
+              <w:left w:type="dxa" w:w="90"/>
+              <w:bottom w:type="dxa" w:w="50"/>
+              <w:right w:type="dxa" w:w="90"/>
+            </w:tcMar>
+          </w:tcPr>
+          <w:p>
+            <w:pPr>
+              <w:jc w:val="center"/>
+            </w:pPr>
+            <w:r>
+              <w:rPr>
+                <w:rFonts w:ascii="Times New Roman" w:cs="Times New Roman" w:eastAsia="Times New Roman" w:hAnsi="Times New Roman"/>
+                <w:sz w:val="18"/>
+                <w:szCs w:val="18"/>
+              </w:rPr>
+              <w:t xml:space="preserve">0.849</w:t>
+            </w:r>
+          </w:p>
+        </w:tc>
+      </w:tr>
+      <w:tr>
+        <w:tc>
+          <w:tcPr>
+            <w:tcW w:type="dxa" w:w="2500"/>
+            <w:tcBorders>
+              <w:top w:val="none" w:color="FFFFFF" w:sz="0"/>
+              <w:left w:val="none" w:color="FFFFFF" w:sz="0"/>
+              <w:bottom w:val="none" w:color="FFFFFF" w:sz="0"/>
+              <w:right w:val="none" w:color="FFFFFF" w:sz="0"/>
+            </w:tcBorders>
+            <w:tcMar>
+              <w:top w:type="dxa" w:w="50"/>
+              <w:left w:type="dxa" w:w="90"/>
+              <w:bottom w:type="dxa" w:w="50"/>
+              <w:right w:type="dxa" w:w="90"/>
+            </w:tcMar>
+          </w:tcPr>
+          <w:p>
+            <w:pPr>
+              <w:jc w:val="left"/>
+            </w:pPr>
+            <w:r>
+              <w:rPr>
+                <w:rFonts w:ascii="Times New Roman" w:cs="Times New Roman" w:eastAsia="Times New Roman" w:hAnsi="Times New Roman"/>
+                <w:sz w:val="18"/>
+                <w:szCs w:val="18"/>
+              </w:rPr>
               <w:t xml:space="preserve">G10 delay sensitivity</w:t>
             </w:r>
           </w:p>
@@ -5392,6 +5574,544 @@
                 <w:szCs w:val="18"/>
               </w:rPr>
               <w:t xml:space="preserve">0.827 p.u. / 1.5 s</w:t>
+            </w:r>
+          </w:p>
+        </w:tc>
+      </w:tr>
+      <w:tr>
+        <w:tc>
+          <w:tcPr>
+            <w:tcW w:type="dxa" w:w="2300"/>
+            <w:tcBorders>
+              <w:top w:val="none" w:color="FFFFFF" w:sz="0"/>
+              <w:left w:val="none" w:color="FFFFFF" w:sz="0"/>
+              <w:bottom w:val="none" w:color="FFFFFF" w:sz="0"/>
+              <w:right w:val="none" w:color="FFFFFF" w:sz="0"/>
+            </w:tcBorders>
+            <w:tcMar>
+              <w:top w:type="dxa" w:w="50"/>
+              <w:left w:type="dxa" w:w="90"/>
+              <w:bottom w:type="dxa" w:w="50"/>
+              <w:right w:type="dxa" w:w="90"/>
+            </w:tcMar>
+          </w:tcPr>
+          <w:p>
+            <w:pPr>
+              <w:jc w:val="left"/>
+            </w:pPr>
+            <w:r>
+              <w:rPr>
+                <w:rFonts w:ascii="Times New Roman" w:cs="Times New Roman" w:eastAsia="Times New Roman" w:hAnsi="Times New Roman"/>
+                <w:sz w:val="18"/>
+                <w:szCs w:val="18"/>
+              </w:rPr>
+              <w:t xml:space="preserve">G10 NC / CC / PF</w:t>
+            </w:r>
+          </w:p>
+        </w:tc>
+        <w:tc>
+          <w:tcPr>
+            <w:tcW w:type="dxa" w:w="3000"/>
+            <w:tcBorders>
+              <w:top w:val="none" w:color="FFFFFF" w:sz="0"/>
+              <w:left w:val="none" w:color="FFFFFF" w:sz="0"/>
+              <w:bottom w:val="none" w:color="FFFFFF" w:sz="0"/>
+              <w:right w:val="none" w:color="FFFFFF" w:sz="0"/>
+            </w:tcBorders>
+            <w:tcMar>
+              <w:top w:type="dxa" w:w="50"/>
+              <w:left w:type="dxa" w:w="90"/>
+              <w:bottom w:type="dxa" w:w="50"/>
+              <w:right w:type="dxa" w:w="90"/>
+            </w:tcMar>
+          </w:tcPr>
+          <w:p>
+            <w:pPr>
+              <w:jc w:val="center"/>
+            </w:pPr>
+            <w:r>
+              <w:rPr>
+                <w:rFonts w:ascii="Times New Roman" w:cs="Times New Roman" w:eastAsia="Times New Roman" w:hAnsi="Times New Roman"/>
+                <w:sz w:val="18"/>
+                <w:szCs w:val="18"/>
+              </w:rPr>
+              <w:t xml:space="preserve">NC</w:t>
+            </w:r>
+          </w:p>
+        </w:tc>
+        <w:tc>
+          <w:tcPr>
+            <w:tcW w:type="dxa" w:w="2000"/>
+            <w:tcBorders>
+              <w:top w:val="none" w:color="FFFFFF" w:sz="0"/>
+              <w:left w:val="none" w:color="FFFFFF" w:sz="0"/>
+              <w:bottom w:val="none" w:color="FFFFFF" w:sz="0"/>
+              <w:right w:val="none" w:color="FFFFFF" w:sz="0"/>
+            </w:tcBorders>
+            <w:tcMar>
+              <w:top w:type="dxa" w:w="50"/>
+              <w:left w:type="dxa" w:w="90"/>
+              <w:bottom w:type="dxa" w:w="50"/>
+              <w:right w:type="dxa" w:w="90"/>
+            </w:tcMar>
+          </w:tcPr>
+          <w:p>
+            <w:pPr>
+              <w:jc w:val="center"/>
+            </w:pPr>
+            <w:r>
+              <w:rPr>
+                <w:rFonts w:ascii="Times New Roman" w:cs="Times New Roman" w:eastAsia="Times New Roman" w:hAnsi="Times New Roman"/>
+                <w:sz w:val="18"/>
+                <w:szCs w:val="18"/>
+              </w:rPr>
+              <w:t xml:space="preserve">Loss of synchronism</w:t>
+            </w:r>
+          </w:p>
+        </w:tc>
+        <w:tc>
+          <w:tcPr>
+            <w:tcW w:type="dxa" w:w="2060"/>
+            <w:tcBorders>
+              <w:top w:val="none" w:color="FFFFFF" w:sz="0"/>
+              <w:left w:val="none" w:color="FFFFFF" w:sz="0"/>
+              <w:bottom w:val="none" w:color="FFFFFF" w:sz="0"/>
+              <w:right w:val="none" w:color="FFFFFF" w:sz="0"/>
+            </w:tcBorders>
+            <w:tcMar>
+              <w:top w:type="dxa" w:w="50"/>
+              <w:left w:type="dxa" w:w="90"/>
+              <w:bottom w:type="dxa" w:w="50"/>
+              <w:right w:type="dxa" w:w="90"/>
+            </w:tcMar>
+          </w:tcPr>
+          <w:p>
+            <w:pPr>
+              <w:jc w:val="center"/>
+            </w:pPr>
+            <w:r>
+              <w:rPr>
+                <w:rFonts w:ascii="Times New Roman" w:cs="Times New Roman" w:eastAsia="Times New Roman" w:hAnsi="Times New Roman"/>
+                <w:sz w:val="18"/>
+                <w:szCs w:val="18"/>
+              </w:rPr>
+              <w:t xml:space="preserve">1.44 s</w:t>
+            </w:r>
+          </w:p>
+        </w:tc>
+      </w:tr>
+      <w:tr>
+        <w:tc>
+          <w:tcPr>
+            <w:tcW w:type="dxa" w:w="2300"/>
+            <w:tcBorders>
+              <w:top w:val="none" w:color="FFFFFF" w:sz="0"/>
+              <w:left w:val="none" w:color="FFFFFF" w:sz="0"/>
+              <w:bottom w:val="none" w:color="FFFFFF" w:sz="0"/>
+              <w:right w:val="none" w:color="FFFFFF" w:sz="0"/>
+            </w:tcBorders>
+            <w:tcMar>
+              <w:top w:type="dxa" w:w="50"/>
+              <w:left w:type="dxa" w:w="90"/>
+              <w:bottom w:type="dxa" w:w="50"/>
+              <w:right w:type="dxa" w:w="90"/>
+            </w:tcMar>
+          </w:tcPr>
+          <w:p>
+            <w:pPr>
+              <w:jc w:val="left"/>
+            </w:pPr>
+            <w:r>
+              <w:rPr>
+                <w:rFonts w:ascii="Times New Roman" w:cs="Times New Roman" w:eastAsia="Times New Roman" w:hAnsi="Times New Roman"/>
+                <w:sz w:val="18"/>
+                <w:szCs w:val="18"/>
+              </w:rPr>
+              <w:t xml:space="preserve"/>
+            </w:r>
+          </w:p>
+        </w:tc>
+        <w:tc>
+          <w:tcPr>
+            <w:tcW w:type="dxa" w:w="3000"/>
+            <w:tcBorders>
+              <w:top w:val="none" w:color="FFFFFF" w:sz="0"/>
+              <w:left w:val="none" w:color="FFFFFF" w:sz="0"/>
+              <w:bottom w:val="none" w:color="FFFFFF" w:sz="0"/>
+              <w:right w:val="none" w:color="FFFFFF" w:sz="0"/>
+            </w:tcBorders>
+            <w:tcMar>
+              <w:top w:type="dxa" w:w="50"/>
+              <w:left w:type="dxa" w:w="90"/>
+              <w:bottom w:type="dxa" w:w="50"/>
+              <w:right w:type="dxa" w:w="90"/>
+            </w:tcMar>
+          </w:tcPr>
+          <w:p>
+            <w:pPr>
+              <w:jc w:val="center"/>
+            </w:pPr>
+            <w:r>
+              <w:rPr>
+                <w:rFonts w:ascii="Times New Roman" w:cs="Times New Roman" w:eastAsia="Times New Roman" w:hAnsi="Times New Roman"/>
+                <w:sz w:val="18"/>
+                <w:szCs w:val="18"/>
+              </w:rPr>
+              <w:t xml:space="preserve">CC</w:t>
+            </w:r>
+          </w:p>
+        </w:tc>
+        <w:tc>
+          <w:tcPr>
+            <w:tcW w:type="dxa" w:w="2000"/>
+            <w:tcBorders>
+              <w:top w:val="none" w:color="FFFFFF" w:sz="0"/>
+              <w:left w:val="none" w:color="FFFFFF" w:sz="0"/>
+              <w:bottom w:val="none" w:color="FFFFFF" w:sz="0"/>
+              <w:right w:val="none" w:color="FFFFFF" w:sz="0"/>
+            </w:tcBorders>
+            <w:tcMar>
+              <w:top w:type="dxa" w:w="50"/>
+              <w:left w:type="dxa" w:w="90"/>
+              <w:bottom w:type="dxa" w:w="50"/>
+              <w:right w:type="dxa" w:w="90"/>
+            </w:tcMar>
+          </w:tcPr>
+          <w:p>
+            <w:pPr>
+              <w:jc w:val="center"/>
+            </w:pPr>
+            <w:r>
+              <w:rPr>
+                <w:rFonts w:ascii="Times New Roman" w:cs="Times New Roman" w:eastAsia="Times New Roman" w:hAnsi="Times New Roman"/>
+                <w:sz w:val="18"/>
+                <w:szCs w:val="18"/>
+              </w:rPr>
+              <w:t xml:space="preserve">Loss of synchronism</w:t>
+            </w:r>
+          </w:p>
+        </w:tc>
+        <w:tc>
+          <w:tcPr>
+            <w:tcW w:type="dxa" w:w="2060"/>
+            <w:tcBorders>
+              <w:top w:val="none" w:color="FFFFFF" w:sz="0"/>
+              <w:left w:val="none" w:color="FFFFFF" w:sz="0"/>
+              <w:bottom w:val="none" w:color="FFFFFF" w:sz="0"/>
+              <w:right w:val="none" w:color="FFFFFF" w:sz="0"/>
+            </w:tcBorders>
+            <w:tcMar>
+              <w:top w:type="dxa" w:w="50"/>
+              <w:left w:type="dxa" w:w="90"/>
+              <w:bottom w:type="dxa" w:w="50"/>
+              <w:right w:type="dxa" w:w="90"/>
+            </w:tcMar>
+          </w:tcPr>
+          <w:p>
+            <w:pPr>
+              <w:jc w:val="center"/>
+            </w:pPr>
+            <w:r>
+              <w:rPr>
+                <w:rFonts w:ascii="Times New Roman" w:cs="Times New Roman" w:eastAsia="Times New Roman" w:hAnsi="Times New Roman"/>
+                <w:sz w:val="18"/>
+                <w:szCs w:val="18"/>
+              </w:rPr>
+              <w:t xml:space="preserve">1.68 s</w:t>
+            </w:r>
+          </w:p>
+        </w:tc>
+      </w:tr>
+      <w:tr>
+        <w:tc>
+          <w:tcPr>
+            <w:tcW w:type="dxa" w:w="2300"/>
+            <w:tcBorders>
+              <w:top w:val="none" w:color="FFFFFF" w:sz="0"/>
+              <w:left w:val="none" w:color="FFFFFF" w:sz="0"/>
+              <w:bottom w:val="none" w:color="FFFFFF" w:sz="0"/>
+              <w:right w:val="none" w:color="FFFFFF" w:sz="0"/>
+            </w:tcBorders>
+            <w:tcMar>
+              <w:top w:type="dxa" w:w="50"/>
+              <w:left w:type="dxa" w:w="90"/>
+              <w:bottom w:type="dxa" w:w="50"/>
+              <w:right w:type="dxa" w:w="90"/>
+            </w:tcMar>
+          </w:tcPr>
+          <w:p>
+            <w:pPr>
+              <w:jc w:val="left"/>
+            </w:pPr>
+            <w:r>
+              <w:rPr>
+                <w:rFonts w:ascii="Times New Roman" w:cs="Times New Roman" w:eastAsia="Times New Roman" w:hAnsi="Times New Roman"/>
+                <w:sz w:val="18"/>
+                <w:szCs w:val="18"/>
+              </w:rPr>
+              <w:t xml:space="preserve"/>
+            </w:r>
+          </w:p>
+        </w:tc>
+        <w:tc>
+          <w:tcPr>
+            <w:tcW w:type="dxa" w:w="3000"/>
+            <w:tcBorders>
+              <w:top w:val="none" w:color="FFFFFF" w:sz="0"/>
+              <w:left w:val="none" w:color="FFFFFF" w:sz="0"/>
+              <w:bottom w:val="none" w:color="FFFFFF" w:sz="0"/>
+              <w:right w:val="none" w:color="FFFFFF" w:sz="0"/>
+            </w:tcBorders>
+            <w:tcMar>
+              <w:top w:type="dxa" w:w="50"/>
+              <w:left w:type="dxa" w:w="90"/>
+              <w:bottom w:type="dxa" w:w="50"/>
+              <w:right w:type="dxa" w:w="90"/>
+            </w:tcMar>
+          </w:tcPr>
+          <w:p>
+            <w:pPr>
+              <w:jc w:val="center"/>
+            </w:pPr>
+            <w:r>
+              <w:rPr>
+                <w:rFonts w:ascii="Times New Roman" w:cs="Times New Roman" w:eastAsia="Times New Roman" w:hAnsi="Times New Roman"/>
+                <w:sz w:val="18"/>
+                <w:szCs w:val="18"/>
+              </w:rPr>
+              <w:t xml:space="preserve">PF, </w:t>
+            </w:r>
+            <w:r>
+              <w:rPr>
+                <w:rFonts w:ascii="Times New Roman" w:cs="Times New Roman" w:eastAsia="Times New Roman" w:hAnsi="Times New Roman"/>
+                <w:sz w:val="18"/>
+                <w:szCs w:val="18"/>
+              </w:rPr>
+              <w:t xml:space="preserve">T</w:t>
+            </w:r>
+            <w:r>
+              <w:rPr>
+                <w:rFonts w:ascii="Times New Roman" w:cs="Times New Roman" w:eastAsia="Times New Roman" w:hAnsi="Times New Roman"/>
+                <w:sz w:val="18"/>
+                <w:szCs w:val="18"/>
+                <w:vertAlign w:val="subscript"/>
+              </w:rPr>
+              <w:t xml:space="preserve">comm</w:t>
+            </w:r>
+            <w:r>
+              <w:rPr>
+                <w:rFonts w:ascii="Times New Roman" w:cs="Times New Roman" w:eastAsia="Times New Roman" w:hAnsi="Times New Roman"/>
+                <w:sz w:val="18"/>
+                <w:szCs w:val="18"/>
+              </w:rPr>
+              <w:t xml:space="preserve">=0</w:t>
+            </w:r>
+          </w:p>
+        </w:tc>
+        <w:tc>
+          <w:tcPr>
+            <w:tcW w:type="dxa" w:w="2000"/>
+            <w:tcBorders>
+              <w:top w:val="none" w:color="FFFFFF" w:sz="0"/>
+              <w:left w:val="none" w:color="FFFFFF" w:sz="0"/>
+              <w:bottom w:val="none" w:color="FFFFFF" w:sz="0"/>
+              <w:right w:val="none" w:color="FFFFFF" w:sz="0"/>
+            </w:tcBorders>
+            <w:tcMar>
+              <w:top w:type="dxa" w:w="50"/>
+              <w:left w:type="dxa" w:w="90"/>
+              <w:bottom w:type="dxa" w:w="50"/>
+              <w:right w:type="dxa" w:w="90"/>
+            </w:tcMar>
+          </w:tcPr>
+          <w:p>
+            <w:pPr>
+              <w:jc w:val="center"/>
+            </w:pPr>
+            <w:r>
+              <w:rPr>
+                <w:rFonts w:ascii="Times New Roman" w:cs="Times New Roman" w:eastAsia="Times New Roman" w:hAnsi="Times New Roman"/>
+                <w:sz w:val="18"/>
+                <w:szCs w:val="18"/>
+              </w:rPr>
+              <w:t xml:space="preserve">Peak δ</w:t>
+            </w:r>
+          </w:p>
+        </w:tc>
+        <w:tc>
+          <w:tcPr>
+            <w:tcW w:type="dxa" w:w="2060"/>
+            <w:tcBorders>
+              <w:top w:val="none" w:color="FFFFFF" w:sz="0"/>
+              <w:left w:val="none" w:color="FFFFFF" w:sz="0"/>
+              <w:bottom w:val="none" w:color="FFFFFF" w:sz="0"/>
+              <w:right w:val="none" w:color="FFFFFF" w:sz="0"/>
+            </w:tcBorders>
+            <w:tcMar>
+              <w:top w:type="dxa" w:w="50"/>
+              <w:left w:type="dxa" w:w="90"/>
+              <w:bottom w:type="dxa" w:w="50"/>
+              <w:right w:type="dxa" w:w="90"/>
+            </w:tcMar>
+          </w:tcPr>
+          <w:p>
+            <w:pPr>
+              <w:jc w:val="center"/>
+            </w:pPr>
+            <w:r>
+              <w:rPr>
+                <w:rFonts w:ascii="Times New Roman" w:cs="Times New Roman" w:eastAsia="Times New Roman" w:hAnsi="Times New Roman"/>
+                <w:sz w:val="18"/>
+                <w:szCs w:val="18"/>
+              </w:rPr>
+              <w:t xml:space="preserve">51.6°</w:t>
+            </w:r>
+          </w:p>
+        </w:tc>
+      </w:tr>
+      <w:tr>
+        <w:tc>
+          <w:tcPr>
+            <w:tcW w:type="dxa" w:w="2300"/>
+            <w:tcBorders>
+              <w:top w:val="none" w:color="FFFFFF" w:sz="0"/>
+              <w:left w:val="none" w:color="FFFFFF" w:sz="0"/>
+              <w:bottom w:val="none" w:color="FFFFFF" w:sz="0"/>
+              <w:right w:val="none" w:color="FFFFFF" w:sz="0"/>
+            </w:tcBorders>
+            <w:tcMar>
+              <w:top w:type="dxa" w:w="50"/>
+              <w:left w:type="dxa" w:w="90"/>
+              <w:bottom w:type="dxa" w:w="50"/>
+              <w:right w:type="dxa" w:w="90"/>
+            </w:tcMar>
+          </w:tcPr>
+          <w:p>
+            <w:pPr>
+              <w:jc w:val="left"/>
+            </w:pPr>
+            <w:r>
+              <w:rPr>
+                <w:rFonts w:ascii="Times New Roman" w:cs="Times New Roman" w:eastAsia="Times New Roman" w:hAnsi="Times New Roman"/>
+                <w:sz w:val="18"/>
+                <w:szCs w:val="18"/>
+              </w:rPr>
+              <w:t xml:space="preserve"/>
+            </w:r>
+          </w:p>
+        </w:tc>
+        <w:tc>
+          <w:tcPr>
+            <w:tcW w:type="dxa" w:w="3000"/>
+            <w:tcBorders>
+              <w:top w:val="none" w:color="FFFFFF" w:sz="0"/>
+              <w:left w:val="none" w:color="FFFFFF" w:sz="0"/>
+              <w:bottom w:val="none" w:color="FFFFFF" w:sz="0"/>
+              <w:right w:val="none" w:color="FFFFFF" w:sz="0"/>
+            </w:tcBorders>
+            <w:tcMar>
+              <w:top w:type="dxa" w:w="50"/>
+              <w:left w:type="dxa" w:w="90"/>
+              <w:bottom w:type="dxa" w:w="50"/>
+              <w:right w:type="dxa" w:w="90"/>
+            </w:tcMar>
+          </w:tcPr>
+          <w:p>
+            <w:pPr>
+              <w:jc w:val="center"/>
+            </w:pPr>
+            <w:r>
+              <w:rPr>
+                <w:rFonts w:ascii="Times New Roman" w:cs="Times New Roman" w:eastAsia="Times New Roman" w:hAnsi="Times New Roman"/>
+                <w:sz w:val="18"/>
+                <w:szCs w:val="18"/>
+              </w:rPr>
+              <w:t xml:space="preserve">PF, </w:t>
+            </w:r>
+            <w:r>
+              <w:rPr>
+                <w:rFonts w:ascii="Times New Roman" w:cs="Times New Roman" w:eastAsia="Times New Roman" w:hAnsi="Times New Roman"/>
+                <w:sz w:val="18"/>
+                <w:szCs w:val="18"/>
+              </w:rPr>
+              <w:t xml:space="preserve">T</w:t>
+            </w:r>
+            <w:r>
+              <w:rPr>
+                <w:rFonts w:ascii="Times New Roman" w:cs="Times New Roman" w:eastAsia="Times New Roman" w:hAnsi="Times New Roman"/>
+                <w:sz w:val="18"/>
+                <w:szCs w:val="18"/>
+                <w:vertAlign w:val="subscript"/>
+              </w:rPr>
+              <w:t xml:space="preserve">comm</w:t>
+            </w:r>
+            <w:r>
+              <w:rPr>
+                <w:rFonts w:ascii="Times New Roman" w:cs="Times New Roman" w:eastAsia="Times New Roman" w:hAnsi="Times New Roman"/>
+                <w:sz w:val="18"/>
+                <w:szCs w:val="18"/>
+              </w:rPr>
+              <w:t xml:space="preserve">=200 ms</w:t>
+            </w:r>
+          </w:p>
+        </w:tc>
+        <w:tc>
+          <w:tcPr>
+            <w:tcW w:type="dxa" w:w="2000"/>
+            <w:tcBorders>
+              <w:top w:val="none" w:color="FFFFFF" w:sz="0"/>
+              <w:left w:val="none" w:color="FFFFFF" w:sz="0"/>
+              <w:bottom w:val="none" w:color="FFFFFF" w:sz="0"/>
+              <w:right w:val="none" w:color="FFFFFF" w:sz="0"/>
+            </w:tcBorders>
+            <w:tcMar>
+              <w:top w:type="dxa" w:w="50"/>
+              <w:left w:type="dxa" w:w="90"/>
+              <w:bottom w:type="dxa" w:w="50"/>
+              <w:right w:type="dxa" w:w="90"/>
+            </w:tcMar>
+          </w:tcPr>
+          <w:p>
+            <w:pPr>
+              <w:jc w:val="center"/>
+            </w:pPr>
+            <w:r>
+              <w:rPr>
+                <w:rFonts w:ascii="Times New Roman" w:cs="Times New Roman" w:eastAsia="Times New Roman" w:hAnsi="Times New Roman"/>
+                <w:sz w:val="18"/>
+                <w:szCs w:val="18"/>
+              </w:rPr>
+              <w:t xml:space="preserve">Peak δ</w:t>
+            </w:r>
+          </w:p>
+        </w:tc>
+        <w:tc>
+          <w:tcPr>
+            <w:tcW w:type="dxa" w:w="2060"/>
+            <w:tcBorders>
+              <w:top w:val="none" w:color="FFFFFF" w:sz="0"/>
+              <w:left w:val="none" w:color="FFFFFF" w:sz="0"/>
+              <w:bottom w:val="none" w:color="FFFFFF" w:sz="0"/>
+              <w:right w:val="none" w:color="FFFFFF" w:sz="0"/>
+            </w:tcBorders>
+            <w:tcMar>
+              <w:top w:type="dxa" w:w="50"/>
+              <w:left w:type="dxa" w:w="90"/>
+              <w:bottom w:type="dxa" w:w="50"/>
+              <w:right w:type="dxa" w:w="90"/>
+            </w:tcMar>
+          </w:tcPr>
+          <w:p>
+            <w:pPr>
+              <w:jc w:val="center"/>
+            </w:pPr>
+            <w:r>
+              <w:rPr>
+                <w:rFonts w:ascii="Times New Roman" w:cs="Times New Roman" w:eastAsia="Times New Roman" w:hAnsi="Times New Roman"/>
+                <w:sz w:val="18"/>
+                <w:szCs w:val="18"/>
+              </w:rPr>
+              <w:t xml:space="preserve">79.5°</w:t>
             </w:r>
           </w:p>
         </w:tc>

</xml_diff>

<commit_message>
Add two-panel frequency-deviation figure re-timed to latency budget
CNN-LSTM + SVC trajectories follow each system's uncontrolled response
until SVC action at 1.169 s; tables document updated.

Co-Authored-By: Claude Opus 5.5 <noreply@anthropic.com>
Claude-Session: https://claude.ai/code/session_017mvBckRxt83VPQqr9i583E
</commit_message>
<xml_diff>
--- a/figures/Timing_and_Results_Tables.docx
+++ b/figures/Timing_and_Results_Tables.docx
@@ -2370,6 +2370,188 @@
                 <w:sz w:val="18"/>
                 <w:szCs w:val="18"/>
               </w:rPr>
+              <w:t xml:space="preserve">Frequency deviation (9/39/118-bus)</w:t>
+            </w:r>
+          </w:p>
+        </w:tc>
+        <w:tc>
+          <w:tcPr>
+            <w:tcW w:type="dxa" w:w="1250"/>
+            <w:tcBorders>
+              <w:top w:val="none" w:color="FFFFFF" w:sz="0"/>
+              <w:left w:val="none" w:color="FFFFFF" w:sz="0"/>
+              <w:bottom w:val="none" w:color="FFFFFF" w:sz="0"/>
+              <w:right w:val="none" w:color="FFFFFF" w:sz="0"/>
+            </w:tcBorders>
+            <w:tcMar>
+              <w:top w:type="dxa" w:w="50"/>
+              <w:left w:type="dxa" w:w="90"/>
+              <w:bottom w:type="dxa" w:w="50"/>
+              <w:right w:type="dxa" w:w="90"/>
+            </w:tcMar>
+          </w:tcPr>
+          <w:p>
+            <w:pPr>
+              <w:jc w:val="center"/>
+            </w:pPr>
+            <w:r>
+              <w:rPr>
+                <w:rFonts w:ascii="Times New Roman" w:cs="Times New Roman" w:eastAsia="Times New Roman" w:hAnsi="Times New Roman"/>
+                <w:sz w:val="18"/>
+                <w:szCs w:val="18"/>
+              </w:rPr>
+              <w:t xml:space="preserve">SVC</w:t>
+            </w:r>
+          </w:p>
+        </w:tc>
+        <w:tc>
+          <w:tcPr>
+            <w:tcW w:type="dxa" w:w="1350"/>
+            <w:tcBorders>
+              <w:top w:val="none" w:color="FFFFFF" w:sz="0"/>
+              <w:left w:val="none" w:color="FFFFFF" w:sz="0"/>
+              <w:bottom w:val="none" w:color="FFFFFF" w:sz="0"/>
+              <w:right w:val="none" w:color="FFFFFF" w:sz="0"/>
+            </w:tcBorders>
+            <w:tcMar>
+              <w:top w:type="dxa" w:w="50"/>
+              <w:left w:type="dxa" w:w="90"/>
+              <w:bottom w:type="dxa" w:w="50"/>
+              <w:right w:type="dxa" w:w="90"/>
+            </w:tcMar>
+          </w:tcPr>
+          <w:p>
+            <w:pPr>
+              <w:jc w:val="center"/>
+            </w:pPr>
+            <w:r>
+              <w:rPr>
+                <w:rFonts w:ascii="Times New Roman" w:cs="Times New Roman" w:eastAsia="Times New Roman" w:hAnsi="Times New Roman"/>
+                <w:sz w:val="18"/>
+                <w:szCs w:val="18"/>
+              </w:rPr>
+              <w:t xml:space="preserve">0.50</w:t>
+            </w:r>
+          </w:p>
+        </w:tc>
+        <w:tc>
+          <w:tcPr>
+            <w:tcW w:type="dxa" w:w="1300"/>
+            <w:tcBorders>
+              <w:top w:val="none" w:color="FFFFFF" w:sz="0"/>
+              <w:left w:val="none" w:color="FFFFFF" w:sz="0"/>
+              <w:bottom w:val="none" w:color="FFFFFF" w:sz="0"/>
+              <w:right w:val="none" w:color="FFFFFF" w:sz="0"/>
+            </w:tcBorders>
+            <w:tcMar>
+              <w:top w:type="dxa" w:w="50"/>
+              <w:left w:type="dxa" w:w="90"/>
+              <w:bottom w:type="dxa" w:w="50"/>
+              <w:right w:type="dxa" w:w="90"/>
+            </w:tcMar>
+          </w:tcPr>
+          <w:p>
+            <w:pPr>
+              <w:jc w:val="center"/>
+            </w:pPr>
+            <w:r>
+              <w:rPr>
+                <w:rFonts w:ascii="Times New Roman" w:cs="Times New Roman" w:eastAsia="Times New Roman" w:hAnsi="Times New Roman"/>
+                <w:sz w:val="18"/>
+                <w:szCs w:val="18"/>
+              </w:rPr>
+              <w:t xml:space="preserve">1.019</w:t>
+            </w:r>
+          </w:p>
+        </w:tc>
+        <w:tc>
+          <w:tcPr>
+            <w:tcW w:type="dxa" w:w="1480"/>
+            <w:tcBorders>
+              <w:top w:val="none" w:color="FFFFFF" w:sz="0"/>
+              <w:left w:val="none" w:color="FFFFFF" w:sz="0"/>
+              <w:bottom w:val="none" w:color="FFFFFF" w:sz="0"/>
+              <w:right w:val="none" w:color="FFFFFF" w:sz="0"/>
+            </w:tcBorders>
+            <w:tcMar>
+              <w:top w:type="dxa" w:w="50"/>
+              <w:left w:type="dxa" w:w="90"/>
+              <w:bottom w:type="dxa" w:w="50"/>
+              <w:right w:type="dxa" w:w="90"/>
+            </w:tcMar>
+          </w:tcPr>
+          <w:p>
+            <w:pPr>
+              <w:jc w:val="center"/>
+            </w:pPr>
+            <w:r>
+              <w:rPr>
+                <w:rFonts w:ascii="Times New Roman" w:cs="Times New Roman" w:eastAsia="Times New Roman" w:hAnsi="Times New Roman"/>
+                <w:sz w:val="18"/>
+                <w:szCs w:val="18"/>
+              </w:rPr>
+              <w:t xml:space="preserve">1.169</w:t>
+            </w:r>
+          </w:p>
+        </w:tc>
+        <w:tc>
+          <w:tcPr>
+            <w:tcW w:type="dxa" w:w="1480"/>
+            <w:tcBorders>
+              <w:top w:val="none" w:color="FFFFFF" w:sz="0"/>
+              <w:left w:val="none" w:color="FFFFFF" w:sz="0"/>
+              <w:bottom w:val="none" w:color="FFFFFF" w:sz="0"/>
+              <w:right w:val="none" w:color="FFFFFF" w:sz="0"/>
+            </w:tcBorders>
+            <w:tcMar>
+              <w:top w:type="dxa" w:w="50"/>
+              <w:left w:type="dxa" w:w="90"/>
+              <w:bottom w:type="dxa" w:w="50"/>
+              <w:right w:type="dxa" w:w="90"/>
+            </w:tcMar>
+          </w:tcPr>
+          <w:p>
+            <w:pPr>
+              <w:jc w:val="center"/>
+            </w:pPr>
+            <w:r>
+              <w:rPr>
+                <w:rFonts w:ascii="Times New Roman" w:cs="Times New Roman" w:eastAsia="Times New Roman" w:hAnsi="Times New Roman"/>
+                <w:sz w:val="18"/>
+                <w:szCs w:val="18"/>
+              </w:rPr>
+              <w:t xml:space="preserve">—</w:t>
+            </w:r>
+          </w:p>
+        </w:tc>
+      </w:tr>
+      <w:tr>
+        <w:tc>
+          <w:tcPr>
+            <w:tcW w:type="dxa" w:w="2500"/>
+            <w:tcBorders>
+              <w:top w:val="none" w:color="FFFFFF" w:sz="0"/>
+              <w:left w:val="none" w:color="FFFFFF" w:sz="0"/>
+              <w:bottom w:val="none" w:color="FFFFFF" w:sz="0"/>
+              <w:right w:val="none" w:color="FFFFFF" w:sz="0"/>
+            </w:tcBorders>
+            <w:tcMar>
+              <w:top w:type="dxa" w:w="50"/>
+              <w:left w:type="dxa" w:w="90"/>
+              <w:bottom w:type="dxa" w:w="50"/>
+              <w:right w:type="dxa" w:w="90"/>
+            </w:tcMar>
+          </w:tcPr>
+          <w:p>
+            <w:pPr>
+              <w:jc w:val="left"/>
+            </w:pPr>
+            <w:r>
+              <w:rPr>
+                <w:rFonts w:ascii="Times New Roman" w:cs="Times New Roman" w:eastAsia="Times New Roman" w:hAnsi="Times New Roman"/>
+                <w:sz w:val="18"/>
+                <w:szCs w:val="18"/>
+              </w:rPr>
               <w:t xml:space="preserve">G10 NC / CC / PF</w:t>
             </w:r>
           </w:p>
@@ -5574,6 +5756,494 @@
                 <w:szCs w:val="18"/>
               </w:rPr>
               <w:t xml:space="preserve">0.827 p.u. / 1.5 s</w:t>
+            </w:r>
+          </w:p>
+        </w:tc>
+      </w:tr>
+      <w:tr>
+        <w:tc>
+          <w:tcPr>
+            <w:tcW w:type="dxa" w:w="2300"/>
+            <w:tcBorders>
+              <w:top w:val="none" w:color="FFFFFF" w:sz="0"/>
+              <w:left w:val="none" w:color="FFFFFF" w:sz="0"/>
+              <w:bottom w:val="none" w:color="FFFFFF" w:sz="0"/>
+              <w:right w:val="none" w:color="FFFFFF" w:sz="0"/>
+            </w:tcBorders>
+            <w:tcMar>
+              <w:top w:type="dxa" w:w="50"/>
+              <w:left w:type="dxa" w:w="90"/>
+              <w:bottom w:type="dxa" w:w="50"/>
+              <w:right w:type="dxa" w:w="90"/>
+            </w:tcMar>
+          </w:tcPr>
+          <w:p>
+            <w:pPr>
+              <w:jc w:val="left"/>
+            </w:pPr>
+            <w:r>
+              <w:rPr>
+                <w:rFonts w:ascii="Times New Roman" w:cs="Times New Roman" w:eastAsia="Times New Roman" w:hAnsi="Times New Roman"/>
+                <w:sz w:val="18"/>
+                <w:szCs w:val="18"/>
+              </w:rPr>
+              <w:t xml:space="preserve">Frequency deviation (a), 39-bus</w:t>
+            </w:r>
+          </w:p>
+        </w:tc>
+        <w:tc>
+          <w:tcPr>
+            <w:tcW w:type="dxa" w:w="3000"/>
+            <w:tcBorders>
+              <w:top w:val="none" w:color="FFFFFF" w:sz="0"/>
+              <w:left w:val="none" w:color="FFFFFF" w:sz="0"/>
+              <w:bottom w:val="none" w:color="FFFFFF" w:sz="0"/>
+              <w:right w:val="none" w:color="FFFFFF" w:sz="0"/>
+            </w:tcBorders>
+            <w:tcMar>
+              <w:top w:type="dxa" w:w="50"/>
+              <w:left w:type="dxa" w:w="90"/>
+              <w:bottom w:type="dxa" w:w="50"/>
+              <w:right w:type="dxa" w:w="90"/>
+            </w:tcMar>
+          </w:tcPr>
+          <w:p>
+            <w:pPr>
+              <w:jc w:val="center"/>
+            </w:pPr>
+            <w:r>
+              <w:rPr>
+                <w:rFonts w:ascii="Times New Roman" w:cs="Times New Roman" w:eastAsia="Times New Roman" w:hAnsi="Times New Roman"/>
+                <w:sz w:val="18"/>
+                <w:szCs w:val="18"/>
+              </w:rPr>
+              <w:t xml:space="preserve">No control / PI-AGC</w:t>
+            </w:r>
+          </w:p>
+        </w:tc>
+        <w:tc>
+          <w:tcPr>
+            <w:tcW w:type="dxa" w:w="2000"/>
+            <w:tcBorders>
+              <w:top w:val="none" w:color="FFFFFF" w:sz="0"/>
+              <w:left w:val="none" w:color="FFFFFF" w:sz="0"/>
+              <w:bottom w:val="none" w:color="FFFFFF" w:sz="0"/>
+              <w:right w:val="none" w:color="FFFFFF" w:sz="0"/>
+            </w:tcBorders>
+            <w:tcMar>
+              <w:top w:type="dxa" w:w="50"/>
+              <w:left w:type="dxa" w:w="90"/>
+              <w:bottom w:type="dxa" w:w="50"/>
+              <w:right w:type="dxa" w:w="90"/>
+            </w:tcMar>
+          </w:tcPr>
+          <w:p>
+            <w:pPr>
+              <w:jc w:val="center"/>
+            </w:pPr>
+            <w:r>
+              <w:rPr>
+                <w:rFonts w:ascii="Times New Roman" w:cs="Times New Roman" w:eastAsia="Times New Roman" w:hAnsi="Times New Roman"/>
+                <w:sz w:val="18"/>
+                <w:szCs w:val="18"/>
+              </w:rPr>
+              <w:t xml:space="preserve">Δf nadir</w:t>
+            </w:r>
+          </w:p>
+        </w:tc>
+        <w:tc>
+          <w:tcPr>
+            <w:tcW w:type="dxa" w:w="2060"/>
+            <w:tcBorders>
+              <w:top w:val="none" w:color="FFFFFF" w:sz="0"/>
+              <w:left w:val="none" w:color="FFFFFF" w:sz="0"/>
+              <w:bottom w:val="none" w:color="FFFFFF" w:sz="0"/>
+              <w:right w:val="none" w:color="FFFFFF" w:sz="0"/>
+            </w:tcBorders>
+            <w:tcMar>
+              <w:top w:type="dxa" w:w="50"/>
+              <w:left w:type="dxa" w:w="90"/>
+              <w:bottom w:type="dxa" w:w="50"/>
+              <w:right w:type="dxa" w:w="90"/>
+            </w:tcMar>
+          </w:tcPr>
+          <w:p>
+            <w:pPr>
+              <w:jc w:val="center"/>
+            </w:pPr>
+            <w:r>
+              <w:rPr>
+                <w:rFonts w:ascii="Times New Roman" w:cs="Times New Roman" w:eastAsia="Times New Roman" w:hAnsi="Times New Roman"/>
+                <w:sz w:val="18"/>
+                <w:szCs w:val="18"/>
+              </w:rPr>
+              <w:t xml:space="preserve">−1.70 / −0.90 Hz</w:t>
+            </w:r>
+          </w:p>
+        </w:tc>
+      </w:tr>
+      <w:tr>
+        <w:tc>
+          <w:tcPr>
+            <w:tcW w:type="dxa" w:w="2300"/>
+            <w:tcBorders>
+              <w:top w:val="none" w:color="FFFFFF" w:sz="0"/>
+              <w:left w:val="none" w:color="FFFFFF" w:sz="0"/>
+              <w:bottom w:val="none" w:color="FFFFFF" w:sz="0"/>
+              <w:right w:val="none" w:color="FFFFFF" w:sz="0"/>
+            </w:tcBorders>
+            <w:tcMar>
+              <w:top w:type="dxa" w:w="50"/>
+              <w:left w:type="dxa" w:w="90"/>
+              <w:bottom w:type="dxa" w:w="50"/>
+              <w:right w:type="dxa" w:w="90"/>
+            </w:tcMar>
+          </w:tcPr>
+          <w:p>
+            <w:pPr>
+              <w:jc w:val="left"/>
+            </w:pPr>
+            <w:r>
+              <w:rPr>
+                <w:rFonts w:ascii="Times New Roman" w:cs="Times New Roman" w:eastAsia="Times New Roman" w:hAnsi="Times New Roman"/>
+                <w:sz w:val="18"/>
+                <w:szCs w:val="18"/>
+              </w:rPr>
+              <w:t xml:space="preserve"/>
+            </w:r>
+          </w:p>
+        </w:tc>
+        <w:tc>
+          <w:tcPr>
+            <w:tcW w:type="dxa" w:w="3000"/>
+            <w:tcBorders>
+              <w:top w:val="none" w:color="FFFFFF" w:sz="0"/>
+              <w:left w:val="none" w:color="FFFFFF" w:sz="0"/>
+              <w:bottom w:val="none" w:color="FFFFFF" w:sz="0"/>
+              <w:right w:val="none" w:color="FFFFFF" w:sz="0"/>
+            </w:tcBorders>
+            <w:tcMar>
+              <w:top w:type="dxa" w:w="50"/>
+              <w:left w:type="dxa" w:w="90"/>
+              <w:bottom w:type="dxa" w:w="50"/>
+              <w:right w:type="dxa" w:w="90"/>
+            </w:tcMar>
+          </w:tcPr>
+          <w:p>
+            <w:pPr>
+              <w:jc w:val="center"/>
+            </w:pPr>
+            <w:r>
+              <w:rPr>
+                <w:rFonts w:ascii="Times New Roman" w:cs="Times New Roman" w:eastAsia="Times New Roman" w:hAnsi="Times New Roman"/>
+                <w:sz w:val="18"/>
+                <w:szCs w:val="18"/>
+              </w:rPr>
+              <w:t xml:space="preserve">CNN-LSTM + SVC</w:t>
+            </w:r>
+          </w:p>
+        </w:tc>
+        <w:tc>
+          <w:tcPr>
+            <w:tcW w:type="dxa" w:w="2000"/>
+            <w:tcBorders>
+              <w:top w:val="none" w:color="FFFFFF" w:sz="0"/>
+              <w:left w:val="none" w:color="FFFFFF" w:sz="0"/>
+              <w:bottom w:val="none" w:color="FFFFFF" w:sz="0"/>
+              <w:right w:val="none" w:color="FFFFFF" w:sz="0"/>
+            </w:tcBorders>
+            <w:tcMar>
+              <w:top w:type="dxa" w:w="50"/>
+              <w:left w:type="dxa" w:w="90"/>
+              <w:bottom w:type="dxa" w:w="50"/>
+              <w:right w:type="dxa" w:w="90"/>
+            </w:tcMar>
+          </w:tcPr>
+          <w:p>
+            <w:pPr>
+              <w:jc w:val="center"/>
+            </w:pPr>
+            <w:r>
+              <w:rPr>
+                <w:rFonts w:ascii="Times New Roman" w:cs="Times New Roman" w:eastAsia="Times New Roman" w:hAnsi="Times New Roman"/>
+                <w:sz w:val="18"/>
+                <w:szCs w:val="18"/>
+              </w:rPr>
+              <w:t xml:space="preserve">Δf nadir</w:t>
+            </w:r>
+          </w:p>
+        </w:tc>
+        <w:tc>
+          <w:tcPr>
+            <w:tcW w:type="dxa" w:w="2060"/>
+            <w:tcBorders>
+              <w:top w:val="none" w:color="FFFFFF" w:sz="0"/>
+              <w:left w:val="none" w:color="FFFFFF" w:sz="0"/>
+              <w:bottom w:val="none" w:color="FFFFFF" w:sz="0"/>
+              <w:right w:val="none" w:color="FFFFFF" w:sz="0"/>
+            </w:tcBorders>
+            <w:tcMar>
+              <w:top w:type="dxa" w:w="50"/>
+              <w:left w:type="dxa" w:w="90"/>
+              <w:bottom w:type="dxa" w:w="50"/>
+              <w:right w:type="dxa" w:w="90"/>
+            </w:tcMar>
+          </w:tcPr>
+          <w:p>
+            <w:pPr>
+              <w:jc w:val="center"/>
+            </w:pPr>
+            <w:r>
+              <w:rPr>
+                <w:rFonts w:ascii="Times New Roman" w:cs="Times New Roman" w:eastAsia="Times New Roman" w:hAnsi="Times New Roman"/>
+                <w:sz w:val="18"/>
+                <w:szCs w:val="18"/>
+              </w:rPr>
+              <w:t xml:space="preserve">−1.70 Hz (before action)</w:t>
+            </w:r>
+          </w:p>
+        </w:tc>
+      </w:tr>
+      <w:tr>
+        <w:tc>
+          <w:tcPr>
+            <w:tcW w:type="dxa" w:w="2300"/>
+            <w:tcBorders>
+              <w:top w:val="none" w:color="FFFFFF" w:sz="0"/>
+              <w:left w:val="none" w:color="FFFFFF" w:sz="0"/>
+              <w:bottom w:val="none" w:color="FFFFFF" w:sz="0"/>
+              <w:right w:val="none" w:color="FFFFFF" w:sz="0"/>
+            </w:tcBorders>
+            <w:tcMar>
+              <w:top w:type="dxa" w:w="50"/>
+              <w:left w:type="dxa" w:w="90"/>
+              <w:bottom w:type="dxa" w:w="50"/>
+              <w:right w:type="dxa" w:w="90"/>
+            </w:tcMar>
+          </w:tcPr>
+          <w:p>
+            <w:pPr>
+              <w:jc w:val="left"/>
+            </w:pPr>
+            <w:r>
+              <w:rPr>
+                <w:rFonts w:ascii="Times New Roman" w:cs="Times New Roman" w:eastAsia="Times New Roman" w:hAnsi="Times New Roman"/>
+                <w:sz w:val="18"/>
+                <w:szCs w:val="18"/>
+              </w:rPr>
+              <w:t xml:space="preserve">Frequency deviation (b)</w:t>
+            </w:r>
+          </w:p>
+        </w:tc>
+        <w:tc>
+          <w:tcPr>
+            <w:tcW w:type="dxa" w:w="3000"/>
+            <w:tcBorders>
+              <w:top w:val="none" w:color="FFFFFF" w:sz="0"/>
+              <w:left w:val="none" w:color="FFFFFF" w:sz="0"/>
+              <w:bottom w:val="none" w:color="FFFFFF" w:sz="0"/>
+              <w:right w:val="none" w:color="FFFFFF" w:sz="0"/>
+            </w:tcBorders>
+            <w:tcMar>
+              <w:top w:type="dxa" w:w="50"/>
+              <w:left w:type="dxa" w:w="90"/>
+              <w:bottom w:type="dxa" w:w="50"/>
+              <w:right w:type="dxa" w:w="90"/>
+            </w:tcMar>
+          </w:tcPr>
+          <w:p>
+            <w:pPr>
+              <w:jc w:val="center"/>
+            </w:pPr>
+            <w:r>
+              <w:rPr>
+                <w:rFonts w:ascii="Times New Roman" w:cs="Times New Roman" w:eastAsia="Times New Roman" w:hAnsi="Times New Roman"/>
+                <w:sz w:val="18"/>
+                <w:szCs w:val="18"/>
+              </w:rPr>
+              <w:t xml:space="preserve">9 / 39 / 118-bus, CNN-LSTM + SVC</w:t>
+            </w:r>
+          </w:p>
+        </w:tc>
+        <w:tc>
+          <w:tcPr>
+            <w:tcW w:type="dxa" w:w="2000"/>
+            <w:tcBorders>
+              <w:top w:val="none" w:color="FFFFFF" w:sz="0"/>
+              <w:left w:val="none" w:color="FFFFFF" w:sz="0"/>
+              <w:bottom w:val="none" w:color="FFFFFF" w:sz="0"/>
+              <w:right w:val="none" w:color="FFFFFF" w:sz="0"/>
+            </w:tcBorders>
+            <w:tcMar>
+              <w:top w:type="dxa" w:w="50"/>
+              <w:left w:type="dxa" w:w="90"/>
+              <w:bottom w:type="dxa" w:w="50"/>
+              <w:right w:type="dxa" w:w="90"/>
+            </w:tcMar>
+          </w:tcPr>
+          <w:p>
+            <w:pPr>
+              <w:jc w:val="center"/>
+            </w:pPr>
+            <w:r>
+              <w:rPr>
+                <w:rFonts w:ascii="Times New Roman" w:cs="Times New Roman" w:eastAsia="Times New Roman" w:hAnsi="Times New Roman"/>
+                <w:sz w:val="18"/>
+                <w:szCs w:val="18"/>
+              </w:rPr>
+              <w:t xml:space="preserve">Δf nadir</w:t>
+            </w:r>
+          </w:p>
+        </w:tc>
+        <w:tc>
+          <w:tcPr>
+            <w:tcW w:type="dxa" w:w="2060"/>
+            <w:tcBorders>
+              <w:top w:val="none" w:color="FFFFFF" w:sz="0"/>
+              <w:left w:val="none" w:color="FFFFFF" w:sz="0"/>
+              <w:bottom w:val="none" w:color="FFFFFF" w:sz="0"/>
+              <w:right w:val="none" w:color="FFFFFF" w:sz="0"/>
+            </w:tcBorders>
+            <w:tcMar>
+              <w:top w:type="dxa" w:w="50"/>
+              <w:left w:type="dxa" w:w="90"/>
+              <w:bottom w:type="dxa" w:w="50"/>
+              <w:right w:type="dxa" w:w="90"/>
+            </w:tcMar>
+          </w:tcPr>
+          <w:p>
+            <w:pPr>
+              <w:jc w:val="center"/>
+            </w:pPr>
+            <w:r>
+              <w:rPr>
+                <w:rFonts w:ascii="Times New Roman" w:cs="Times New Roman" w:eastAsia="Times New Roman" w:hAnsi="Times New Roman"/>
+                <w:sz w:val="18"/>
+                <w:szCs w:val="18"/>
+              </w:rPr>
+              <w:t xml:space="preserve">−0.57 / −0.67 / −0.75 Hz</w:t>
+            </w:r>
+          </w:p>
+        </w:tc>
+      </w:tr>
+      <w:tr>
+        <w:tc>
+          <w:tcPr>
+            <w:tcW w:type="dxa" w:w="2300"/>
+            <w:tcBorders>
+              <w:top w:val="none" w:color="FFFFFF" w:sz="0"/>
+              <w:left w:val="none" w:color="FFFFFF" w:sz="0"/>
+              <w:bottom w:val="none" w:color="FFFFFF" w:sz="0"/>
+              <w:right w:val="none" w:color="FFFFFF" w:sz="0"/>
+            </w:tcBorders>
+            <w:tcMar>
+              <w:top w:type="dxa" w:w="50"/>
+              <w:left w:type="dxa" w:w="90"/>
+              <w:bottom w:type="dxa" w:w="50"/>
+              <w:right w:type="dxa" w:w="90"/>
+            </w:tcMar>
+          </w:tcPr>
+          <w:p>
+            <w:pPr>
+              <w:jc w:val="left"/>
+            </w:pPr>
+            <w:r>
+              <w:rPr>
+                <w:rFonts w:ascii="Times New Roman" w:cs="Times New Roman" w:eastAsia="Times New Roman" w:hAnsi="Times New Roman"/>
+                <w:sz w:val="18"/>
+                <w:szCs w:val="18"/>
+              </w:rPr>
+              <w:t xml:space="preserve"/>
+            </w:r>
+          </w:p>
+        </w:tc>
+        <w:tc>
+          <w:tcPr>
+            <w:tcW w:type="dxa" w:w="3000"/>
+            <w:tcBorders>
+              <w:top w:val="none" w:color="FFFFFF" w:sz="0"/>
+              <w:left w:val="none" w:color="FFFFFF" w:sz="0"/>
+              <w:bottom w:val="none" w:color="FFFFFF" w:sz="0"/>
+              <w:right w:val="none" w:color="FFFFFF" w:sz="0"/>
+            </w:tcBorders>
+            <w:tcMar>
+              <w:top w:type="dxa" w:w="50"/>
+              <w:left w:type="dxa" w:w="90"/>
+              <w:bottom w:type="dxa" w:w="50"/>
+              <w:right w:type="dxa" w:w="90"/>
+            </w:tcMar>
+          </w:tcPr>
+          <w:p>
+            <w:pPr>
+              <w:jc w:val="center"/>
+            </w:pPr>
+            <w:r>
+              <w:rPr>
+                <w:rFonts w:ascii="Times New Roman" w:cs="Times New Roman" w:eastAsia="Times New Roman" w:hAnsi="Times New Roman"/>
+                <w:sz w:val="18"/>
+                <w:szCs w:val="18"/>
+              </w:rPr>
+              <w:t xml:space="preserve">9 / 39 / 118-bus, second dip</w:t>
+            </w:r>
+          </w:p>
+        </w:tc>
+        <w:tc>
+          <w:tcPr>
+            <w:tcW w:type="dxa" w:w="2000"/>
+            <w:tcBorders>
+              <w:top w:val="none" w:color="FFFFFF" w:sz="0"/>
+              <w:left w:val="none" w:color="FFFFFF" w:sz="0"/>
+              <w:bottom w:val="none" w:color="FFFFFF" w:sz="0"/>
+              <w:right w:val="none" w:color="FFFFFF" w:sz="0"/>
+            </w:tcBorders>
+            <w:tcMar>
+              <w:top w:type="dxa" w:w="50"/>
+              <w:left w:type="dxa" w:w="90"/>
+              <w:bottom w:type="dxa" w:w="50"/>
+              <w:right w:type="dxa" w:w="90"/>
+            </w:tcMar>
+          </w:tcPr>
+          <w:p>
+            <w:pPr>
+              <w:jc w:val="center"/>
+            </w:pPr>
+            <w:r>
+              <w:rPr>
+                <w:rFonts w:ascii="Times New Roman" w:cs="Times New Roman" w:eastAsia="Times New Roman" w:hAnsi="Times New Roman"/>
+                <w:sz w:val="18"/>
+                <w:szCs w:val="18"/>
+              </w:rPr>
+              <w:t xml:space="preserve">No control → CNN-LSTM</w:t>
+            </w:r>
+          </w:p>
+        </w:tc>
+        <w:tc>
+          <w:tcPr>
+            <w:tcW w:type="dxa" w:w="2060"/>
+            <w:tcBorders>
+              <w:top w:val="none" w:color="FFFFFF" w:sz="0"/>
+              <w:left w:val="none" w:color="FFFFFF" w:sz="0"/>
+              <w:bottom w:val="none" w:color="FFFFFF" w:sz="0"/>
+              <w:right w:val="none" w:color="FFFFFF" w:sz="0"/>
+            </w:tcBorders>
+            <w:tcMar>
+              <w:top w:type="dxa" w:w="50"/>
+              <w:left w:type="dxa" w:w="90"/>
+              <w:bottom w:type="dxa" w:w="50"/>
+              <w:right w:type="dxa" w:w="90"/>
+            </w:tcMar>
+          </w:tcPr>
+          <w:p>
+            <w:pPr>
+              <w:jc w:val="center"/>
+            </w:pPr>
+            <w:r>
+              <w:rPr>
+                <w:rFonts w:ascii="Times New Roman" w:cs="Times New Roman" w:eastAsia="Times New Roman" w:hAnsi="Times New Roman"/>
+                <w:sz w:val="18"/>
+                <w:szCs w:val="18"/>
+              </w:rPr>
+              <w:t xml:space="preserve">−0.27/−0.31/−0.35 → ≈ −0.04 Hz</w:t>
             </w:r>
           </w:p>
         </w:tc>

</xml_diff>

<commit_message>
Add frequency/ROCOF figure with UFLS stages re-timed to latency budget
System-frequency-response model with governor, staged UFLS (0.25 s
pickup) and SVC support from 1.169 s; tables document updated.

Co-Authored-By: Claude Opus 5.5 <noreply@anthropic.com>
Claude-Session: https://claude.ai/code/session_017mvBckRxt83VPQqr9i583E
</commit_message>
<xml_diff>
--- a/figures/Timing_and_Results_Tables.docx
+++ b/figures/Timing_and_Results_Tables.docx
@@ -2552,6 +2552,188 @@
                 <w:sz w:val="18"/>
                 <w:szCs w:val="18"/>
               </w:rPr>
+              <w:t xml:space="preserve">Frequency and ROCOF (UFLS)</w:t>
+            </w:r>
+          </w:p>
+        </w:tc>
+        <w:tc>
+          <w:tcPr>
+            <w:tcW w:type="dxa" w:w="1250"/>
+            <w:tcBorders>
+              <w:top w:val="none" w:color="FFFFFF" w:sz="0"/>
+              <w:left w:val="none" w:color="FFFFFF" w:sz="0"/>
+              <w:bottom w:val="none" w:color="FFFFFF" w:sz="0"/>
+              <w:right w:val="none" w:color="FFFFFF" w:sz="0"/>
+            </w:tcBorders>
+            <w:tcMar>
+              <w:top w:type="dxa" w:w="50"/>
+              <w:left w:type="dxa" w:w="90"/>
+              <w:bottom w:type="dxa" w:w="50"/>
+              <w:right w:type="dxa" w:w="90"/>
+            </w:tcMar>
+          </w:tcPr>
+          <w:p>
+            <w:pPr>
+              <w:jc w:val="center"/>
+            </w:pPr>
+            <w:r>
+              <w:rPr>
+                <w:rFonts w:ascii="Times New Roman" w:cs="Times New Roman" w:eastAsia="Times New Roman" w:hAnsi="Times New Roman"/>
+                <w:sz w:val="18"/>
+                <w:szCs w:val="18"/>
+              </w:rPr>
+              <w:t xml:space="preserve">SVC</w:t>
+            </w:r>
+          </w:p>
+        </w:tc>
+        <w:tc>
+          <w:tcPr>
+            <w:tcW w:type="dxa" w:w="1350"/>
+            <w:tcBorders>
+              <w:top w:val="none" w:color="FFFFFF" w:sz="0"/>
+              <w:left w:val="none" w:color="FFFFFF" w:sz="0"/>
+              <w:bottom w:val="none" w:color="FFFFFF" w:sz="0"/>
+              <w:right w:val="none" w:color="FFFFFF" w:sz="0"/>
+            </w:tcBorders>
+            <w:tcMar>
+              <w:top w:type="dxa" w:w="50"/>
+              <w:left w:type="dxa" w:w="90"/>
+              <w:bottom w:type="dxa" w:w="50"/>
+              <w:right w:type="dxa" w:w="90"/>
+            </w:tcMar>
+          </w:tcPr>
+          <w:p>
+            <w:pPr>
+              <w:jc w:val="center"/>
+            </w:pPr>
+            <w:r>
+              <w:rPr>
+                <w:rFonts w:ascii="Times New Roman" w:cs="Times New Roman" w:eastAsia="Times New Roman" w:hAnsi="Times New Roman"/>
+                <w:sz w:val="18"/>
+                <w:szCs w:val="18"/>
+              </w:rPr>
+              <w:t xml:space="preserve">0.50</w:t>
+            </w:r>
+          </w:p>
+        </w:tc>
+        <w:tc>
+          <w:tcPr>
+            <w:tcW w:type="dxa" w:w="1300"/>
+            <w:tcBorders>
+              <w:top w:val="none" w:color="FFFFFF" w:sz="0"/>
+              <w:left w:val="none" w:color="FFFFFF" w:sz="0"/>
+              <w:bottom w:val="none" w:color="FFFFFF" w:sz="0"/>
+              <w:right w:val="none" w:color="FFFFFF" w:sz="0"/>
+            </w:tcBorders>
+            <w:tcMar>
+              <w:top w:type="dxa" w:w="50"/>
+              <w:left w:type="dxa" w:w="90"/>
+              <w:bottom w:type="dxa" w:w="50"/>
+              <w:right w:type="dxa" w:w="90"/>
+            </w:tcMar>
+          </w:tcPr>
+          <w:p>
+            <w:pPr>
+              <w:jc w:val="center"/>
+            </w:pPr>
+            <w:r>
+              <w:rPr>
+                <w:rFonts w:ascii="Times New Roman" w:cs="Times New Roman" w:eastAsia="Times New Roman" w:hAnsi="Times New Roman"/>
+                <w:sz w:val="18"/>
+                <w:szCs w:val="18"/>
+              </w:rPr>
+              <w:t xml:space="preserve">1.019</w:t>
+            </w:r>
+          </w:p>
+        </w:tc>
+        <w:tc>
+          <w:tcPr>
+            <w:tcW w:type="dxa" w:w="1480"/>
+            <w:tcBorders>
+              <w:top w:val="none" w:color="FFFFFF" w:sz="0"/>
+              <w:left w:val="none" w:color="FFFFFF" w:sz="0"/>
+              <w:bottom w:val="none" w:color="FFFFFF" w:sz="0"/>
+              <w:right w:val="none" w:color="FFFFFF" w:sz="0"/>
+            </w:tcBorders>
+            <w:tcMar>
+              <w:top w:type="dxa" w:w="50"/>
+              <w:left w:type="dxa" w:w="90"/>
+              <w:bottom w:type="dxa" w:w="50"/>
+              <w:right w:type="dxa" w:w="90"/>
+            </w:tcMar>
+          </w:tcPr>
+          <w:p>
+            <w:pPr>
+              <w:jc w:val="center"/>
+            </w:pPr>
+            <w:r>
+              <w:rPr>
+                <w:rFonts w:ascii="Times New Roman" w:cs="Times New Roman" w:eastAsia="Times New Roman" w:hAnsi="Times New Roman"/>
+                <w:sz w:val="18"/>
+                <w:szCs w:val="18"/>
+              </w:rPr>
+              <w:t xml:space="preserve">1.169</w:t>
+            </w:r>
+          </w:p>
+        </w:tc>
+        <w:tc>
+          <w:tcPr>
+            <w:tcW w:type="dxa" w:w="1480"/>
+            <w:tcBorders>
+              <w:top w:val="none" w:color="FFFFFF" w:sz="0"/>
+              <w:left w:val="none" w:color="FFFFFF" w:sz="0"/>
+              <w:bottom w:val="none" w:color="FFFFFF" w:sz="0"/>
+              <w:right w:val="none" w:color="FFFFFF" w:sz="0"/>
+            </w:tcBorders>
+            <w:tcMar>
+              <w:top w:type="dxa" w:w="50"/>
+              <w:left w:type="dxa" w:w="90"/>
+              <w:bottom w:type="dxa" w:w="50"/>
+              <w:right w:type="dxa" w:w="90"/>
+            </w:tcMar>
+          </w:tcPr>
+          <w:p>
+            <w:pPr>
+              <w:jc w:val="center"/>
+            </w:pPr>
+            <w:r>
+              <w:rPr>
+                <w:rFonts w:ascii="Times New Roman" w:cs="Times New Roman" w:eastAsia="Times New Roman" w:hAnsi="Times New Roman"/>
+                <w:sz w:val="18"/>
+                <w:szCs w:val="18"/>
+              </w:rPr>
+              <w:t xml:space="preserve">1.369</w:t>
+            </w:r>
+          </w:p>
+        </w:tc>
+      </w:tr>
+      <w:tr>
+        <w:tc>
+          <w:tcPr>
+            <w:tcW w:type="dxa" w:w="2500"/>
+            <w:tcBorders>
+              <w:top w:val="none" w:color="FFFFFF" w:sz="0"/>
+              <w:left w:val="none" w:color="FFFFFF" w:sz="0"/>
+              <w:bottom w:val="none" w:color="FFFFFF" w:sz="0"/>
+              <w:right w:val="none" w:color="FFFFFF" w:sz="0"/>
+            </w:tcBorders>
+            <w:tcMar>
+              <w:top w:type="dxa" w:w="50"/>
+              <w:left w:type="dxa" w:w="90"/>
+              <w:bottom w:type="dxa" w:w="50"/>
+              <w:right w:type="dxa" w:w="90"/>
+            </w:tcMar>
+          </w:tcPr>
+          <w:p>
+            <w:pPr>
+              <w:jc w:val="left"/>
+            </w:pPr>
+            <w:r>
+              <w:rPr>
+                <w:rFonts w:ascii="Times New Roman" w:cs="Times New Roman" w:eastAsia="Times New Roman" w:hAnsi="Times New Roman"/>
+                <w:sz w:val="18"/>
+                <w:szCs w:val="18"/>
+              </w:rPr>
               <w:t xml:space="preserve">G10 NC / CC / PF</w:t>
             </w:r>
           </w:p>
@@ -6244,6 +6426,666 @@
                 <w:szCs w:val="18"/>
               </w:rPr>
               <w:t xml:space="preserve">−0.27/−0.31/−0.35 → ≈ −0.04 Hz</w:t>
+            </w:r>
+          </w:p>
+        </w:tc>
+      </w:tr>
+      <w:tr>
+        <w:tc>
+          <w:tcPr>
+            <w:tcW w:type="dxa" w:w="2300"/>
+            <w:tcBorders>
+              <w:top w:val="none" w:color="FFFFFF" w:sz="0"/>
+              <w:left w:val="none" w:color="FFFFFF" w:sz="0"/>
+              <w:bottom w:val="none" w:color="FFFFFF" w:sz="0"/>
+              <w:right w:val="none" w:color="FFFFFF" w:sz="0"/>
+            </w:tcBorders>
+            <w:tcMar>
+              <w:top w:type="dxa" w:w="50"/>
+              <w:left w:type="dxa" w:w="90"/>
+              <w:bottom w:type="dxa" w:w="50"/>
+              <w:right w:type="dxa" w:w="90"/>
+            </w:tcMar>
+          </w:tcPr>
+          <w:p>
+            <w:pPr>
+              <w:jc w:val="left"/>
+            </w:pPr>
+            <w:r>
+              <w:rPr>
+                <w:rFonts w:ascii="Times New Roman" w:cs="Times New Roman" w:eastAsia="Times New Roman" w:hAnsi="Times New Roman"/>
+                <w:sz w:val="18"/>
+                <w:szCs w:val="18"/>
+              </w:rPr>
+              <w:t xml:space="preserve">Frequency and ROCOF (UFLS)</w:t>
+            </w:r>
+          </w:p>
+        </w:tc>
+        <w:tc>
+          <w:tcPr>
+            <w:tcW w:type="dxa" w:w="3000"/>
+            <w:tcBorders>
+              <w:top w:val="none" w:color="FFFFFF" w:sz="0"/>
+              <w:left w:val="none" w:color="FFFFFF" w:sz="0"/>
+              <w:bottom w:val="none" w:color="FFFFFF" w:sz="0"/>
+              <w:right w:val="none" w:color="FFFFFF" w:sz="0"/>
+            </w:tcBorders>
+            <w:tcMar>
+              <w:top w:type="dxa" w:w="50"/>
+              <w:left w:type="dxa" w:w="90"/>
+              <w:bottom w:type="dxa" w:w="50"/>
+              <w:right w:type="dxa" w:w="90"/>
+            </w:tcMar>
+          </w:tcPr>
+          <w:p>
+            <w:pPr>
+              <w:jc w:val="center"/>
+            </w:pPr>
+            <w:r>
+              <w:rPr>
+                <w:rFonts w:ascii="Times New Roman" w:cs="Times New Roman" w:eastAsia="Times New Roman" w:hAnsi="Times New Roman"/>
+                <w:sz w:val="18"/>
+                <w:szCs w:val="18"/>
+              </w:rPr>
+              <w:t xml:space="preserve">NC</w:t>
+            </w:r>
+          </w:p>
+        </w:tc>
+        <w:tc>
+          <w:tcPr>
+            <w:tcW w:type="dxa" w:w="2000"/>
+            <w:tcBorders>
+              <w:top w:val="none" w:color="FFFFFF" w:sz="0"/>
+              <w:left w:val="none" w:color="FFFFFF" w:sz="0"/>
+              <w:bottom w:val="none" w:color="FFFFFF" w:sz="0"/>
+              <w:right w:val="none" w:color="FFFFFF" w:sz="0"/>
+            </w:tcBorders>
+            <w:tcMar>
+              <w:top w:type="dxa" w:w="50"/>
+              <w:left w:type="dxa" w:w="90"/>
+              <w:bottom w:type="dxa" w:w="50"/>
+              <w:right w:type="dxa" w:w="90"/>
+            </w:tcMar>
+          </w:tcPr>
+          <w:p>
+            <w:pPr>
+              <w:jc w:val="center"/>
+            </w:pPr>
+            <w:r>
+              <w:rPr>
+                <w:rFonts w:ascii="Times New Roman" w:cs="Times New Roman" w:eastAsia="Times New Roman" w:hAnsi="Times New Roman"/>
+                <w:sz w:val="18"/>
+                <w:szCs w:val="18"/>
+              </w:rPr>
+              <w:t xml:space="preserve">Nadir / UFLS / |ROCOF|max</w:t>
+            </w:r>
+          </w:p>
+        </w:tc>
+        <w:tc>
+          <w:tcPr>
+            <w:tcW w:type="dxa" w:w="2060"/>
+            <w:tcBorders>
+              <w:top w:val="none" w:color="FFFFFF" w:sz="0"/>
+              <w:left w:val="none" w:color="FFFFFF" w:sz="0"/>
+              <w:bottom w:val="none" w:color="FFFFFF" w:sz="0"/>
+              <w:right w:val="none" w:color="FFFFFF" w:sz="0"/>
+            </w:tcBorders>
+            <w:tcMar>
+              <w:top w:type="dxa" w:w="50"/>
+              <w:left w:type="dxa" w:w="90"/>
+              <w:bottom w:type="dxa" w:w="50"/>
+              <w:right w:type="dxa" w:w="90"/>
+            </w:tcMar>
+          </w:tcPr>
+          <w:p>
+            <w:pPr>
+              <w:jc w:val="center"/>
+            </w:pPr>
+            <w:r>
+              <w:rPr>
+                <w:rFonts w:ascii="Times New Roman" w:cs="Times New Roman" w:eastAsia="Times New Roman" w:hAnsi="Times New Roman"/>
+                <w:sz w:val="18"/>
+                <w:szCs w:val="18"/>
+              </w:rPr>
+              <w:t xml:space="preserve">48.02 Hz / stages 1+2 / 2.48 Hz/s</w:t>
+            </w:r>
+          </w:p>
+        </w:tc>
+      </w:tr>
+      <w:tr>
+        <w:tc>
+          <w:tcPr>
+            <w:tcW w:type="dxa" w:w="2300"/>
+            <w:tcBorders>
+              <w:top w:val="none" w:color="FFFFFF" w:sz="0"/>
+              <w:left w:val="none" w:color="FFFFFF" w:sz="0"/>
+              <w:bottom w:val="none" w:color="FFFFFF" w:sz="0"/>
+              <w:right w:val="none" w:color="FFFFFF" w:sz="0"/>
+            </w:tcBorders>
+            <w:tcMar>
+              <w:top w:type="dxa" w:w="50"/>
+              <w:left w:type="dxa" w:w="90"/>
+              <w:bottom w:type="dxa" w:w="50"/>
+              <w:right w:type="dxa" w:w="90"/>
+            </w:tcMar>
+          </w:tcPr>
+          <w:p>
+            <w:pPr>
+              <w:jc w:val="left"/>
+            </w:pPr>
+            <w:r>
+              <w:rPr>
+                <w:rFonts w:ascii="Times New Roman" w:cs="Times New Roman" w:eastAsia="Times New Roman" w:hAnsi="Times New Roman"/>
+                <w:sz w:val="18"/>
+                <w:szCs w:val="18"/>
+              </w:rPr>
+              <w:t xml:space="preserve"/>
+            </w:r>
+          </w:p>
+        </w:tc>
+        <w:tc>
+          <w:tcPr>
+            <w:tcW w:type="dxa" w:w="3000"/>
+            <w:tcBorders>
+              <w:top w:val="none" w:color="FFFFFF" w:sz="0"/>
+              <w:left w:val="none" w:color="FFFFFF" w:sz="0"/>
+              <w:bottom w:val="none" w:color="FFFFFF" w:sz="0"/>
+              <w:right w:val="none" w:color="FFFFFF" w:sz="0"/>
+            </w:tcBorders>
+            <w:tcMar>
+              <w:top w:type="dxa" w:w="50"/>
+              <w:left w:type="dxa" w:w="90"/>
+              <w:bottom w:type="dxa" w:w="50"/>
+              <w:right w:type="dxa" w:w="90"/>
+            </w:tcMar>
+          </w:tcPr>
+          <w:p>
+            <w:pPr>
+              <w:jc w:val="center"/>
+            </w:pPr>
+            <w:r>
+              <w:rPr>
+                <w:rFonts w:ascii="Times New Roman" w:cs="Times New Roman" w:eastAsia="Times New Roman" w:hAnsi="Times New Roman"/>
+                <w:sz w:val="18"/>
+                <w:szCs w:val="18"/>
+              </w:rPr>
+              <w:t xml:space="preserve">CC/PI-AGC</w:t>
+            </w:r>
+          </w:p>
+        </w:tc>
+        <w:tc>
+          <w:tcPr>
+            <w:tcW w:type="dxa" w:w="2000"/>
+            <w:tcBorders>
+              <w:top w:val="none" w:color="FFFFFF" w:sz="0"/>
+              <w:left w:val="none" w:color="FFFFFF" w:sz="0"/>
+              <w:bottom w:val="none" w:color="FFFFFF" w:sz="0"/>
+              <w:right w:val="none" w:color="FFFFFF" w:sz="0"/>
+            </w:tcBorders>
+            <w:tcMar>
+              <w:top w:type="dxa" w:w="50"/>
+              <w:left w:type="dxa" w:w="90"/>
+              <w:bottom w:type="dxa" w:w="50"/>
+              <w:right w:type="dxa" w:w="90"/>
+            </w:tcMar>
+          </w:tcPr>
+          <w:p>
+            <w:pPr>
+              <w:jc w:val="center"/>
+            </w:pPr>
+            <w:r>
+              <w:rPr>
+                <w:rFonts w:ascii="Times New Roman" w:cs="Times New Roman" w:eastAsia="Times New Roman" w:hAnsi="Times New Roman"/>
+                <w:sz w:val="18"/>
+                <w:szCs w:val="18"/>
+              </w:rPr>
+              <w:t xml:space="preserve">Nadir / UFLS / |ROCOF|max</w:t>
+            </w:r>
+          </w:p>
+        </w:tc>
+        <w:tc>
+          <w:tcPr>
+            <w:tcW w:type="dxa" w:w="2060"/>
+            <w:tcBorders>
+              <w:top w:val="none" w:color="FFFFFF" w:sz="0"/>
+              <w:left w:val="none" w:color="FFFFFF" w:sz="0"/>
+              <w:bottom w:val="none" w:color="FFFFFF" w:sz="0"/>
+              <w:right w:val="none" w:color="FFFFFF" w:sz="0"/>
+            </w:tcBorders>
+            <w:tcMar>
+              <w:top w:type="dxa" w:w="50"/>
+              <w:left w:type="dxa" w:w="90"/>
+              <w:bottom w:type="dxa" w:w="50"/>
+              <w:right w:type="dxa" w:w="90"/>
+            </w:tcMar>
+          </w:tcPr>
+          <w:p>
+            <w:pPr>
+              <w:jc w:val="center"/>
+            </w:pPr>
+            <w:r>
+              <w:rPr>
+                <w:rFonts w:ascii="Times New Roman" w:cs="Times New Roman" w:eastAsia="Times New Roman" w:hAnsi="Times New Roman"/>
+                <w:sz w:val="18"/>
+                <w:szCs w:val="18"/>
+              </w:rPr>
+              <w:t xml:space="preserve">48.22 Hz / stages 1+2 / 2.45 Hz/s</w:t>
+            </w:r>
+          </w:p>
+        </w:tc>
+      </w:tr>
+      <w:tr>
+        <w:tc>
+          <w:tcPr>
+            <w:tcW w:type="dxa" w:w="2300"/>
+            <w:tcBorders>
+              <w:top w:val="none" w:color="FFFFFF" w:sz="0"/>
+              <w:left w:val="none" w:color="FFFFFF" w:sz="0"/>
+              <w:bottom w:val="none" w:color="FFFFFF" w:sz="0"/>
+              <w:right w:val="none" w:color="FFFFFF" w:sz="0"/>
+            </w:tcBorders>
+            <w:tcMar>
+              <w:top w:type="dxa" w:w="50"/>
+              <w:left w:type="dxa" w:w="90"/>
+              <w:bottom w:type="dxa" w:w="50"/>
+              <w:right w:type="dxa" w:w="90"/>
+            </w:tcMar>
+          </w:tcPr>
+          <w:p>
+            <w:pPr>
+              <w:jc w:val="left"/>
+            </w:pPr>
+            <w:r>
+              <w:rPr>
+                <w:rFonts w:ascii="Times New Roman" w:cs="Times New Roman" w:eastAsia="Times New Roman" w:hAnsi="Times New Roman"/>
+                <w:sz w:val="18"/>
+                <w:szCs w:val="18"/>
+              </w:rPr>
+              <w:t xml:space="preserve"/>
+            </w:r>
+          </w:p>
+        </w:tc>
+        <w:tc>
+          <w:tcPr>
+            <w:tcW w:type="dxa" w:w="3000"/>
+            <w:tcBorders>
+              <w:top w:val="none" w:color="FFFFFF" w:sz="0"/>
+              <w:left w:val="none" w:color="FFFFFF" w:sz="0"/>
+              <w:bottom w:val="none" w:color="FFFFFF" w:sz="0"/>
+              <w:right w:val="none" w:color="FFFFFF" w:sz="0"/>
+            </w:tcBorders>
+            <w:tcMar>
+              <w:top w:type="dxa" w:w="50"/>
+              <w:left w:type="dxa" w:w="90"/>
+              <w:bottom w:type="dxa" w:w="50"/>
+              <w:right w:type="dxa" w:w="90"/>
+            </w:tcMar>
+          </w:tcPr>
+          <w:p>
+            <w:pPr>
+              <w:jc w:val="center"/>
+            </w:pPr>
+            <w:r>
+              <w:rPr>
+                <w:rFonts w:ascii="Times New Roman" w:cs="Times New Roman" w:eastAsia="Times New Roman" w:hAnsi="Times New Roman"/>
+                <w:sz w:val="18"/>
+                <w:szCs w:val="18"/>
+              </w:rPr>
+              <w:t xml:space="preserve">PF, </w:t>
+            </w:r>
+            <w:r>
+              <w:rPr>
+                <w:rFonts w:ascii="Times New Roman" w:cs="Times New Roman" w:eastAsia="Times New Roman" w:hAnsi="Times New Roman"/>
+                <w:sz w:val="18"/>
+                <w:szCs w:val="18"/>
+              </w:rPr>
+              <w:t xml:space="preserve">T</w:t>
+            </w:r>
+            <w:r>
+              <w:rPr>
+                <w:rFonts w:ascii="Times New Roman" w:cs="Times New Roman" w:eastAsia="Times New Roman" w:hAnsi="Times New Roman"/>
+                <w:sz w:val="18"/>
+                <w:szCs w:val="18"/>
+                <w:vertAlign w:val="subscript"/>
+              </w:rPr>
+              <w:t xml:space="preserve">comm</w:t>
+            </w:r>
+            <w:r>
+              <w:rPr>
+                <w:rFonts w:ascii="Times New Roman" w:cs="Times New Roman" w:eastAsia="Times New Roman" w:hAnsi="Times New Roman"/>
+                <w:sz w:val="18"/>
+                <w:szCs w:val="18"/>
+              </w:rPr>
+              <w:t xml:space="preserve">=0</w:t>
+            </w:r>
+          </w:p>
+        </w:tc>
+        <w:tc>
+          <w:tcPr>
+            <w:tcW w:type="dxa" w:w="2000"/>
+            <w:tcBorders>
+              <w:top w:val="none" w:color="FFFFFF" w:sz="0"/>
+              <w:left w:val="none" w:color="FFFFFF" w:sz="0"/>
+              <w:bottom w:val="none" w:color="FFFFFF" w:sz="0"/>
+              <w:right w:val="none" w:color="FFFFFF" w:sz="0"/>
+            </w:tcBorders>
+            <w:tcMar>
+              <w:top w:type="dxa" w:w="50"/>
+              <w:left w:type="dxa" w:w="90"/>
+              <w:bottom w:type="dxa" w:w="50"/>
+              <w:right w:type="dxa" w:w="90"/>
+            </w:tcMar>
+          </w:tcPr>
+          <w:p>
+            <w:pPr>
+              <w:jc w:val="center"/>
+            </w:pPr>
+            <w:r>
+              <w:rPr>
+                <w:rFonts w:ascii="Times New Roman" w:cs="Times New Roman" w:eastAsia="Times New Roman" w:hAnsi="Times New Roman"/>
+                <w:sz w:val="18"/>
+                <w:szCs w:val="18"/>
+              </w:rPr>
+              <w:t xml:space="preserve">Nadir / UFLS / |ROCOF|max</w:t>
+            </w:r>
+          </w:p>
+        </w:tc>
+        <w:tc>
+          <w:tcPr>
+            <w:tcW w:type="dxa" w:w="2060"/>
+            <w:tcBorders>
+              <w:top w:val="none" w:color="FFFFFF" w:sz="0"/>
+              <w:left w:val="none" w:color="FFFFFF" w:sz="0"/>
+              <w:bottom w:val="none" w:color="FFFFFF" w:sz="0"/>
+              <w:right w:val="none" w:color="FFFFFF" w:sz="0"/>
+            </w:tcBorders>
+            <w:tcMar>
+              <w:top w:type="dxa" w:w="50"/>
+              <w:left w:type="dxa" w:w="90"/>
+              <w:bottom w:type="dxa" w:w="50"/>
+              <w:right w:type="dxa" w:w="90"/>
+            </w:tcMar>
+          </w:tcPr>
+          <w:p>
+            <w:pPr>
+              <w:jc w:val="center"/>
+            </w:pPr>
+            <w:r>
+              <w:rPr>
+                <w:rFonts w:ascii="Times New Roman" w:cs="Times New Roman" w:eastAsia="Times New Roman" w:hAnsi="Times New Roman"/>
+                <w:sz w:val="18"/>
+                <w:szCs w:val="18"/>
+              </w:rPr>
+              <w:t xml:space="preserve">48.28 Hz / stages 1+2 / 2.48 Hz/s</w:t>
+            </w:r>
+          </w:p>
+        </w:tc>
+      </w:tr>
+      <w:tr>
+        <w:tc>
+          <w:tcPr>
+            <w:tcW w:type="dxa" w:w="2300"/>
+            <w:tcBorders>
+              <w:top w:val="none" w:color="FFFFFF" w:sz="0"/>
+              <w:left w:val="none" w:color="FFFFFF" w:sz="0"/>
+              <w:bottom w:val="none" w:color="FFFFFF" w:sz="0"/>
+              <w:right w:val="none" w:color="FFFFFF" w:sz="0"/>
+            </w:tcBorders>
+            <w:tcMar>
+              <w:top w:type="dxa" w:w="50"/>
+              <w:left w:type="dxa" w:w="90"/>
+              <w:bottom w:type="dxa" w:w="50"/>
+              <w:right w:type="dxa" w:w="90"/>
+            </w:tcMar>
+          </w:tcPr>
+          <w:p>
+            <w:pPr>
+              <w:jc w:val="left"/>
+            </w:pPr>
+            <w:r>
+              <w:rPr>
+                <w:rFonts w:ascii="Times New Roman" w:cs="Times New Roman" w:eastAsia="Times New Roman" w:hAnsi="Times New Roman"/>
+                <w:sz w:val="18"/>
+                <w:szCs w:val="18"/>
+              </w:rPr>
+              <w:t xml:space="preserve"/>
+            </w:r>
+          </w:p>
+        </w:tc>
+        <w:tc>
+          <w:tcPr>
+            <w:tcW w:type="dxa" w:w="3000"/>
+            <w:tcBorders>
+              <w:top w:val="none" w:color="FFFFFF" w:sz="0"/>
+              <w:left w:val="none" w:color="FFFFFF" w:sz="0"/>
+              <w:bottom w:val="none" w:color="FFFFFF" w:sz="0"/>
+              <w:right w:val="none" w:color="FFFFFF" w:sz="0"/>
+            </w:tcBorders>
+            <w:tcMar>
+              <w:top w:type="dxa" w:w="50"/>
+              <w:left w:type="dxa" w:w="90"/>
+              <w:bottom w:type="dxa" w:w="50"/>
+              <w:right w:type="dxa" w:w="90"/>
+            </w:tcMar>
+          </w:tcPr>
+          <w:p>
+            <w:pPr>
+              <w:jc w:val="center"/>
+            </w:pPr>
+            <w:r>
+              <w:rPr>
+                <w:rFonts w:ascii="Times New Roman" w:cs="Times New Roman" w:eastAsia="Times New Roman" w:hAnsi="Times New Roman"/>
+                <w:sz w:val="18"/>
+                <w:szCs w:val="18"/>
+              </w:rPr>
+              <w:t xml:space="preserve">PF, </w:t>
+            </w:r>
+            <w:r>
+              <w:rPr>
+                <w:rFonts w:ascii="Times New Roman" w:cs="Times New Roman" w:eastAsia="Times New Roman" w:hAnsi="Times New Roman"/>
+                <w:sz w:val="18"/>
+                <w:szCs w:val="18"/>
+              </w:rPr>
+              <w:t xml:space="preserve">T</w:t>
+            </w:r>
+            <w:r>
+              <w:rPr>
+                <w:rFonts w:ascii="Times New Roman" w:cs="Times New Roman" w:eastAsia="Times New Roman" w:hAnsi="Times New Roman"/>
+                <w:sz w:val="18"/>
+                <w:szCs w:val="18"/>
+                <w:vertAlign w:val="subscript"/>
+              </w:rPr>
+              <w:t xml:space="preserve">comm</w:t>
+            </w:r>
+            <w:r>
+              <w:rPr>
+                <w:rFonts w:ascii="Times New Roman" w:cs="Times New Roman" w:eastAsia="Times New Roman" w:hAnsi="Times New Roman"/>
+                <w:sz w:val="18"/>
+                <w:szCs w:val="18"/>
+              </w:rPr>
+              <w:t xml:space="preserve">=200 ms</w:t>
+            </w:r>
+          </w:p>
+        </w:tc>
+        <w:tc>
+          <w:tcPr>
+            <w:tcW w:type="dxa" w:w="2000"/>
+            <w:tcBorders>
+              <w:top w:val="none" w:color="FFFFFF" w:sz="0"/>
+              <w:left w:val="none" w:color="FFFFFF" w:sz="0"/>
+              <w:bottom w:val="none" w:color="FFFFFF" w:sz="0"/>
+              <w:right w:val="none" w:color="FFFFFF" w:sz="0"/>
+            </w:tcBorders>
+            <w:tcMar>
+              <w:top w:type="dxa" w:w="50"/>
+              <w:left w:type="dxa" w:w="90"/>
+              <w:bottom w:type="dxa" w:w="50"/>
+              <w:right w:type="dxa" w:w="90"/>
+            </w:tcMar>
+          </w:tcPr>
+          <w:p>
+            <w:pPr>
+              <w:jc w:val="center"/>
+            </w:pPr>
+            <w:r>
+              <w:rPr>
+                <w:rFonts w:ascii="Times New Roman" w:cs="Times New Roman" w:eastAsia="Times New Roman" w:hAnsi="Times New Roman"/>
+                <w:sz w:val="18"/>
+                <w:szCs w:val="18"/>
+              </w:rPr>
+              <w:t xml:space="preserve">Nadir / UFLS / |ROCOF|max</w:t>
+            </w:r>
+          </w:p>
+        </w:tc>
+        <w:tc>
+          <w:tcPr>
+            <w:tcW w:type="dxa" w:w="2060"/>
+            <w:tcBorders>
+              <w:top w:val="none" w:color="FFFFFF" w:sz="0"/>
+              <w:left w:val="none" w:color="FFFFFF" w:sz="0"/>
+              <w:bottom w:val="none" w:color="FFFFFF" w:sz="0"/>
+              <w:right w:val="none" w:color="FFFFFF" w:sz="0"/>
+            </w:tcBorders>
+            <w:tcMar>
+              <w:top w:type="dxa" w:w="50"/>
+              <w:left w:type="dxa" w:w="90"/>
+              <w:bottom w:type="dxa" w:w="50"/>
+              <w:right w:type="dxa" w:w="90"/>
+            </w:tcMar>
+          </w:tcPr>
+          <w:p>
+            <w:pPr>
+              <w:jc w:val="center"/>
+            </w:pPr>
+            <w:r>
+              <w:rPr>
+                <w:rFonts w:ascii="Times New Roman" w:cs="Times New Roman" w:eastAsia="Times New Roman" w:hAnsi="Times New Roman"/>
+                <w:sz w:val="18"/>
+                <w:szCs w:val="18"/>
+              </w:rPr>
+              <w:t xml:space="preserve">48.09 Hz / stages 1+2 / 2.48 Hz/s</w:t>
+            </w:r>
+          </w:p>
+        </w:tc>
+      </w:tr>
+      <w:tr>
+        <w:tc>
+          <w:tcPr>
+            <w:tcW w:type="dxa" w:w="2300"/>
+            <w:tcBorders>
+              <w:top w:val="none" w:color="FFFFFF" w:sz="0"/>
+              <w:left w:val="none" w:color="FFFFFF" w:sz="0"/>
+              <w:bottom w:val="none" w:color="FFFFFF" w:sz="0"/>
+              <w:right w:val="none" w:color="FFFFFF" w:sz="0"/>
+            </w:tcBorders>
+            <w:tcMar>
+              <w:top w:type="dxa" w:w="50"/>
+              <w:left w:type="dxa" w:w="90"/>
+              <w:bottom w:type="dxa" w:w="50"/>
+              <w:right w:type="dxa" w:w="90"/>
+            </w:tcMar>
+          </w:tcPr>
+          <w:p>
+            <w:pPr>
+              <w:jc w:val="left"/>
+            </w:pPr>
+            <w:r>
+              <w:rPr>
+                <w:rFonts w:ascii="Times New Roman" w:cs="Times New Roman" w:eastAsia="Times New Roman" w:hAnsi="Times New Roman"/>
+                <w:sz w:val="18"/>
+                <w:szCs w:val="18"/>
+              </w:rPr>
+              <w:t xml:space="preserve"/>
+            </w:r>
+          </w:p>
+        </w:tc>
+        <w:tc>
+          <w:tcPr>
+            <w:tcW w:type="dxa" w:w="3000"/>
+            <w:tcBorders>
+              <w:top w:val="none" w:color="FFFFFF" w:sz="0"/>
+              <w:left w:val="none" w:color="FFFFFF" w:sz="0"/>
+              <w:bottom w:val="none" w:color="FFFFFF" w:sz="0"/>
+              <w:right w:val="none" w:color="FFFFFF" w:sz="0"/>
+            </w:tcBorders>
+            <w:tcMar>
+              <w:top w:type="dxa" w:w="50"/>
+              <w:left w:type="dxa" w:w="90"/>
+              <w:bottom w:type="dxa" w:w="50"/>
+              <w:right w:type="dxa" w:w="90"/>
+            </w:tcMar>
+          </w:tcPr>
+          <w:p>
+            <w:pPr>
+              <w:jc w:val="center"/>
+            </w:pPr>
+            <w:r>
+              <w:rPr>
+                <w:rFonts w:ascii="Times New Roman" w:cs="Times New Roman" w:eastAsia="Times New Roman" w:hAnsi="Times New Roman"/>
+                <w:sz w:val="18"/>
+                <w:szCs w:val="18"/>
+              </w:rPr>
+              <w:t xml:space="preserve">All cases</w:t>
+            </w:r>
+          </w:p>
+        </w:tc>
+        <w:tc>
+          <w:tcPr>
+            <w:tcW w:type="dxa" w:w="2000"/>
+            <w:tcBorders>
+              <w:top w:val="none" w:color="FFFFFF" w:sz="0"/>
+              <w:left w:val="none" w:color="FFFFFF" w:sz="0"/>
+              <w:bottom w:val="none" w:color="FFFFFF" w:sz="0"/>
+              <w:right w:val="none" w:color="FFFFFF" w:sz="0"/>
+            </w:tcBorders>
+            <w:tcMar>
+              <w:top w:type="dxa" w:w="50"/>
+              <w:left w:type="dxa" w:w="90"/>
+              <w:bottom w:type="dxa" w:w="50"/>
+              <w:right w:type="dxa" w:w="90"/>
+            </w:tcMar>
+          </w:tcPr>
+          <w:p>
+            <w:pPr>
+              <w:jc w:val="center"/>
+            </w:pPr>
+            <w:r>
+              <w:rPr>
+                <w:rFonts w:ascii="Times New Roman" w:cs="Times New Roman" w:eastAsia="Times New Roman" w:hAnsi="Times New Roman"/>
+                <w:sz w:val="18"/>
+                <w:szCs w:val="18"/>
+              </w:rPr>
+              <w:t xml:space="preserve">UFLS-1 / UFLS-2 pickup (NC)</w:t>
+            </w:r>
+          </w:p>
+        </w:tc>
+        <w:tc>
+          <w:tcPr>
+            <w:tcW w:type="dxa" w:w="2060"/>
+            <w:tcBorders>
+              <w:top w:val="none" w:color="FFFFFF" w:sz="0"/>
+              <w:left w:val="none" w:color="FFFFFF" w:sz="0"/>
+              <w:bottom w:val="none" w:color="FFFFFF" w:sz="0"/>
+              <w:right w:val="none" w:color="FFFFFF" w:sz="0"/>
+            </w:tcBorders>
+            <w:tcMar>
+              <w:top w:type="dxa" w:w="50"/>
+              <w:left w:type="dxa" w:w="90"/>
+              <w:bottom w:type="dxa" w:w="50"/>
+              <w:right w:type="dxa" w:w="90"/>
+            </w:tcMar>
+          </w:tcPr>
+          <w:p>
+            <w:pPr>
+              <w:jc w:val="center"/>
+            </w:pPr>
+            <w:r>
+              <w:rPr>
+                <w:rFonts w:ascii="Times New Roman" w:cs="Times New Roman" w:eastAsia="Times New Roman" w:hAnsi="Times New Roman"/>
+                <w:sz w:val="18"/>
+                <w:szCs w:val="18"/>
+              </w:rPr>
+              <w:t xml:space="preserve">0.92 s / 1.13 s (before SVC action)</w:t>
             </w:r>
           </w:p>
         </w:tc>

</xml_diff>

<commit_message>
Add generator/BESS active-power figure re-timed to latency budget
BESS dispatch follows the CNN-LSTM decision (1.019 s) and ramps at
250 MW/s; tables document updated.

Co-Authored-By: Claude Opus 5.5 <noreply@anthropic.com>
Claude-Session: https://claude.ai/code/session_017mvBckRxt83VPQqr9i583E
</commit_message>
<xml_diff>
--- a/figures/Timing_and_Results_Tables.docx
+++ b/figures/Timing_and_Results_Tables.docx
@@ -2734,6 +2734,188 @@
                 <w:sz w:val="18"/>
                 <w:szCs w:val="18"/>
               </w:rPr>
+              <w:t xml:space="preserve">Generator and BESS power</w:t>
+            </w:r>
+          </w:p>
+        </w:tc>
+        <w:tc>
+          <w:tcPr>
+            <w:tcW w:type="dxa" w:w="1250"/>
+            <w:tcBorders>
+              <w:top w:val="none" w:color="FFFFFF" w:sz="0"/>
+              <w:left w:val="none" w:color="FFFFFF" w:sz="0"/>
+              <w:bottom w:val="none" w:color="FFFFFF" w:sz="0"/>
+              <w:right w:val="none" w:color="FFFFFF" w:sz="0"/>
+            </w:tcBorders>
+            <w:tcMar>
+              <w:top w:type="dxa" w:w="50"/>
+              <w:left w:type="dxa" w:w="90"/>
+              <w:bottom w:type="dxa" w:w="50"/>
+              <w:right w:type="dxa" w:w="90"/>
+            </w:tcMar>
+          </w:tcPr>
+          <w:p>
+            <w:pPr>
+              <w:jc w:val="center"/>
+            </w:pPr>
+            <w:r>
+              <w:rPr>
+                <w:rFonts w:ascii="Times New Roman" w:cs="Times New Roman" w:eastAsia="Times New Roman" w:hAnsi="Times New Roman"/>
+                <w:sz w:val="18"/>
+                <w:szCs w:val="18"/>
+              </w:rPr>
+              <w:t xml:space="preserve">BESS</w:t>
+            </w:r>
+          </w:p>
+        </w:tc>
+        <w:tc>
+          <w:tcPr>
+            <w:tcW w:type="dxa" w:w="1350"/>
+            <w:tcBorders>
+              <w:top w:val="none" w:color="FFFFFF" w:sz="0"/>
+              <w:left w:val="none" w:color="FFFFFF" w:sz="0"/>
+              <w:bottom w:val="none" w:color="FFFFFF" w:sz="0"/>
+              <w:right w:val="none" w:color="FFFFFF" w:sz="0"/>
+            </w:tcBorders>
+            <w:tcMar>
+              <w:top w:type="dxa" w:w="50"/>
+              <w:left w:type="dxa" w:w="90"/>
+              <w:bottom w:type="dxa" w:w="50"/>
+              <w:right w:type="dxa" w:w="90"/>
+            </w:tcMar>
+          </w:tcPr>
+          <w:p>
+            <w:pPr>
+              <w:jc w:val="center"/>
+            </w:pPr>
+            <w:r>
+              <w:rPr>
+                <w:rFonts w:ascii="Times New Roman" w:cs="Times New Roman" w:eastAsia="Times New Roman" w:hAnsi="Times New Roman"/>
+                <w:sz w:val="18"/>
+                <w:szCs w:val="18"/>
+              </w:rPr>
+              <w:t xml:space="preserve">0.50</w:t>
+            </w:r>
+          </w:p>
+        </w:tc>
+        <w:tc>
+          <w:tcPr>
+            <w:tcW w:type="dxa" w:w="1300"/>
+            <w:tcBorders>
+              <w:top w:val="none" w:color="FFFFFF" w:sz="0"/>
+              <w:left w:val="none" w:color="FFFFFF" w:sz="0"/>
+              <w:bottom w:val="none" w:color="FFFFFF" w:sz="0"/>
+              <w:right w:val="none" w:color="FFFFFF" w:sz="0"/>
+            </w:tcBorders>
+            <w:tcMar>
+              <w:top w:type="dxa" w:w="50"/>
+              <w:left w:type="dxa" w:w="90"/>
+              <w:bottom w:type="dxa" w:w="50"/>
+              <w:right w:type="dxa" w:w="90"/>
+            </w:tcMar>
+          </w:tcPr>
+          <w:p>
+            <w:pPr>
+              <w:jc w:val="center"/>
+            </w:pPr>
+            <w:r>
+              <w:rPr>
+                <w:rFonts w:ascii="Times New Roman" w:cs="Times New Roman" w:eastAsia="Times New Roman" w:hAnsi="Times New Roman"/>
+                <w:sz w:val="18"/>
+                <w:szCs w:val="18"/>
+              </w:rPr>
+              <w:t xml:space="preserve">1.019</w:t>
+            </w:r>
+          </w:p>
+        </w:tc>
+        <w:tc>
+          <w:tcPr>
+            <w:tcW w:type="dxa" w:w="1480"/>
+            <w:tcBorders>
+              <w:top w:val="none" w:color="FFFFFF" w:sz="0"/>
+              <w:left w:val="none" w:color="FFFFFF" w:sz="0"/>
+              <w:bottom w:val="none" w:color="FFFFFF" w:sz="0"/>
+              <w:right w:val="none" w:color="FFFFFF" w:sz="0"/>
+            </w:tcBorders>
+            <w:tcMar>
+              <w:top w:type="dxa" w:w="50"/>
+              <w:left w:type="dxa" w:w="90"/>
+              <w:bottom w:type="dxa" w:w="50"/>
+              <w:right w:type="dxa" w:w="90"/>
+            </w:tcMar>
+          </w:tcPr>
+          <w:p>
+            <w:pPr>
+              <w:jc w:val="center"/>
+            </w:pPr>
+            <w:r>
+              <w:rPr>
+                <w:rFonts w:ascii="Times New Roman" w:cs="Times New Roman" w:eastAsia="Times New Roman" w:hAnsi="Times New Roman"/>
+                <w:sz w:val="18"/>
+                <w:szCs w:val="18"/>
+              </w:rPr>
+              <w:t xml:space="preserve">1.019 (ramp 250 MW/s)</w:t>
+            </w:r>
+          </w:p>
+        </w:tc>
+        <w:tc>
+          <w:tcPr>
+            <w:tcW w:type="dxa" w:w="1480"/>
+            <w:tcBorders>
+              <w:top w:val="none" w:color="FFFFFF" w:sz="0"/>
+              <w:left w:val="none" w:color="FFFFFF" w:sz="0"/>
+              <w:bottom w:val="none" w:color="FFFFFF" w:sz="0"/>
+              <w:right w:val="none" w:color="FFFFFF" w:sz="0"/>
+            </w:tcBorders>
+            <w:tcMar>
+              <w:top w:type="dxa" w:w="50"/>
+              <w:left w:type="dxa" w:w="90"/>
+              <w:bottom w:type="dxa" w:w="50"/>
+              <w:right w:type="dxa" w:w="90"/>
+            </w:tcMar>
+          </w:tcPr>
+          <w:p>
+            <w:pPr>
+              <w:jc w:val="center"/>
+            </w:pPr>
+            <w:r>
+              <w:rPr>
+                <w:rFonts w:ascii="Times New Roman" w:cs="Times New Roman" w:eastAsia="Times New Roman" w:hAnsi="Times New Roman"/>
+                <w:sz w:val="18"/>
+                <w:szCs w:val="18"/>
+              </w:rPr>
+              <w:t xml:space="preserve">1.219</w:t>
+            </w:r>
+          </w:p>
+        </w:tc>
+      </w:tr>
+      <w:tr>
+        <w:tc>
+          <w:tcPr>
+            <w:tcW w:type="dxa" w:w="2500"/>
+            <w:tcBorders>
+              <w:top w:val="none" w:color="FFFFFF" w:sz="0"/>
+              <w:left w:val="none" w:color="FFFFFF" w:sz="0"/>
+              <w:bottom w:val="none" w:color="FFFFFF" w:sz="0"/>
+              <w:right w:val="none" w:color="FFFFFF" w:sz="0"/>
+            </w:tcBorders>
+            <w:tcMar>
+              <w:top w:type="dxa" w:w="50"/>
+              <w:left w:type="dxa" w:w="90"/>
+              <w:bottom w:type="dxa" w:w="50"/>
+              <w:right w:type="dxa" w:w="90"/>
+            </w:tcMar>
+          </w:tcPr>
+          <w:p>
+            <w:pPr>
+              <w:jc w:val="left"/>
+            </w:pPr>
+            <w:r>
+              <w:rPr>
+                <w:rFonts w:ascii="Times New Roman" w:cs="Times New Roman" w:eastAsia="Times New Roman" w:hAnsi="Times New Roman"/>
+                <w:sz w:val="18"/>
+                <w:szCs w:val="18"/>
+              </w:rPr>
               <w:t xml:space="preserve">G10 NC / CC / PF</w:t>
             </w:r>
           </w:p>
@@ -7086,6 +7268,250 @@
                 <w:szCs w:val="18"/>
               </w:rPr>
               <w:t xml:space="preserve">0.92 s / 1.13 s (before SVC action)</w:t>
+            </w:r>
+          </w:p>
+        </w:tc>
+      </w:tr>
+      <w:tr>
+        <w:tc>
+          <w:tcPr>
+            <w:tcW w:type="dxa" w:w="2300"/>
+            <w:tcBorders>
+              <w:top w:val="none" w:color="FFFFFF" w:sz="0"/>
+              <w:left w:val="none" w:color="FFFFFF" w:sz="0"/>
+              <w:bottom w:val="none" w:color="FFFFFF" w:sz="0"/>
+              <w:right w:val="none" w:color="FFFFFF" w:sz="0"/>
+            </w:tcBorders>
+            <w:tcMar>
+              <w:top w:type="dxa" w:w="50"/>
+              <w:left w:type="dxa" w:w="90"/>
+              <w:bottom w:type="dxa" w:w="50"/>
+              <w:right w:type="dxa" w:w="90"/>
+            </w:tcMar>
+          </w:tcPr>
+          <w:p>
+            <w:pPr>
+              <w:jc w:val="left"/>
+            </w:pPr>
+            <w:r>
+              <w:rPr>
+                <w:rFonts w:ascii="Times New Roman" w:cs="Times New Roman" w:eastAsia="Times New Roman" w:hAnsi="Times New Roman"/>
+                <w:sz w:val="18"/>
+                <w:szCs w:val="18"/>
+              </w:rPr>
+              <w:t xml:space="preserve">Generator and BESS power</w:t>
+            </w:r>
+          </w:p>
+        </w:tc>
+        <w:tc>
+          <w:tcPr>
+            <w:tcW w:type="dxa" w:w="3000"/>
+            <w:tcBorders>
+              <w:top w:val="none" w:color="FFFFFF" w:sz="0"/>
+              <w:left w:val="none" w:color="FFFFFF" w:sz="0"/>
+              <w:bottom w:val="none" w:color="FFFFFF" w:sz="0"/>
+              <w:right w:val="none" w:color="FFFFFF" w:sz="0"/>
+            </w:tcBorders>
+            <w:tcMar>
+              <w:top w:type="dxa" w:w="50"/>
+              <w:left w:type="dxa" w:w="90"/>
+              <w:bottom w:type="dxa" w:w="50"/>
+              <w:right w:type="dxa" w:w="90"/>
+            </w:tcMar>
+          </w:tcPr>
+          <w:p>
+            <w:pPr>
+              <w:jc w:val="center"/>
+            </w:pPr>
+            <w:r>
+              <w:rPr>
+                <w:rFonts w:ascii="Times New Roman" w:cs="Times New Roman" w:eastAsia="Times New Roman" w:hAnsi="Times New Roman"/>
+                <w:sz w:val="18"/>
+                <w:szCs w:val="18"/>
+              </w:rPr>
+              <w:t xml:space="preserve">BESS Bus 3 / Bus 29</w:t>
+            </w:r>
+          </w:p>
+        </w:tc>
+        <w:tc>
+          <w:tcPr>
+            <w:tcW w:type="dxa" w:w="2000"/>
+            <w:tcBorders>
+              <w:top w:val="none" w:color="FFFFFF" w:sz="0"/>
+              <w:left w:val="none" w:color="FFFFFF" w:sz="0"/>
+              <w:bottom w:val="none" w:color="FFFFFF" w:sz="0"/>
+              <w:right w:val="none" w:color="FFFFFF" w:sz="0"/>
+            </w:tcBorders>
+            <w:tcMar>
+              <w:top w:type="dxa" w:w="50"/>
+              <w:left w:type="dxa" w:w="90"/>
+              <w:bottom w:type="dxa" w:w="50"/>
+              <w:right w:type="dxa" w:w="90"/>
+            </w:tcMar>
+          </w:tcPr>
+          <w:p>
+            <w:pPr>
+              <w:jc w:val="center"/>
+            </w:pPr>
+            <w:r>
+              <w:rPr>
+                <w:rFonts w:ascii="Times New Roman" w:cs="Times New Roman" w:eastAsia="Times New Roman" w:hAnsi="Times New Roman"/>
+                <w:sz w:val="18"/>
+                <w:szCs w:val="18"/>
+              </w:rPr>
+              <w:t xml:space="preserve">Full output reached</w:t>
+            </w:r>
+          </w:p>
+        </w:tc>
+        <w:tc>
+          <w:tcPr>
+            <w:tcW w:type="dxa" w:w="2060"/>
+            <w:tcBorders>
+              <w:top w:val="none" w:color="FFFFFF" w:sz="0"/>
+              <w:left w:val="none" w:color="FFFFFF" w:sz="0"/>
+              <w:bottom w:val="none" w:color="FFFFFF" w:sz="0"/>
+              <w:right w:val="none" w:color="FFFFFF" w:sz="0"/>
+            </w:tcBorders>
+            <w:tcMar>
+              <w:top w:type="dxa" w:w="50"/>
+              <w:left w:type="dxa" w:w="90"/>
+              <w:bottom w:type="dxa" w:w="50"/>
+              <w:right w:type="dxa" w:w="90"/>
+            </w:tcMar>
+          </w:tcPr>
+          <w:p>
+            <w:pPr>
+              <w:jc w:val="center"/>
+            </w:pPr>
+            <w:r>
+              <w:rPr>
+                <w:rFonts w:ascii="Times New Roman" w:cs="Times New Roman" w:eastAsia="Times New Roman" w:hAnsi="Times New Roman"/>
+                <w:sz w:val="18"/>
+                <w:szCs w:val="18"/>
+              </w:rPr>
+              <w:t xml:space="preserve">1.219 s / 1.331 s</w:t>
+            </w:r>
+          </w:p>
+        </w:tc>
+      </w:tr>
+      <w:tr>
+        <w:tc>
+          <w:tcPr>
+            <w:tcW w:type="dxa" w:w="2300"/>
+            <w:tcBorders>
+              <w:top w:val="none" w:color="FFFFFF" w:sz="0"/>
+              <w:left w:val="none" w:color="FFFFFF" w:sz="0"/>
+              <w:bottom w:val="none" w:color="FFFFFF" w:sz="0"/>
+              <w:right w:val="none" w:color="FFFFFF" w:sz="0"/>
+            </w:tcBorders>
+            <w:tcMar>
+              <w:top w:type="dxa" w:w="50"/>
+              <w:left w:type="dxa" w:w="90"/>
+              <w:bottom w:type="dxa" w:w="50"/>
+              <w:right w:type="dxa" w:w="90"/>
+            </w:tcMar>
+          </w:tcPr>
+          <w:p>
+            <w:pPr>
+              <w:jc w:val="left"/>
+            </w:pPr>
+            <w:r>
+              <w:rPr>
+                <w:rFonts w:ascii="Times New Roman" w:cs="Times New Roman" w:eastAsia="Times New Roman" w:hAnsi="Times New Roman"/>
+                <w:sz w:val="18"/>
+                <w:szCs w:val="18"/>
+              </w:rPr>
+              <w:t xml:space="preserve"/>
+            </w:r>
+          </w:p>
+        </w:tc>
+        <w:tc>
+          <w:tcPr>
+            <w:tcW w:type="dxa" w:w="3000"/>
+            <w:tcBorders>
+              <w:top w:val="none" w:color="FFFFFF" w:sz="0"/>
+              <w:left w:val="none" w:color="FFFFFF" w:sz="0"/>
+              <w:bottom w:val="none" w:color="FFFFFF" w:sz="0"/>
+              <w:right w:val="none" w:color="FFFFFF" w:sz="0"/>
+            </w:tcBorders>
+            <w:tcMar>
+              <w:top w:type="dxa" w:w="50"/>
+              <w:left w:type="dxa" w:w="90"/>
+              <w:bottom w:type="dxa" w:w="50"/>
+              <w:right w:type="dxa" w:w="90"/>
+            </w:tcMar>
+          </w:tcPr>
+          <w:p>
+            <w:pPr>
+              <w:jc w:val="center"/>
+            </w:pPr>
+            <w:r>
+              <w:rPr>
+                <w:rFonts w:ascii="Times New Roman" w:cs="Times New Roman" w:eastAsia="Times New Roman" w:hAnsi="Times New Roman"/>
+                <w:sz w:val="18"/>
+                <w:szCs w:val="18"/>
+              </w:rPr>
+              <w:t xml:space="preserve">BESS total</w:t>
+            </w:r>
+          </w:p>
+        </w:tc>
+        <w:tc>
+          <w:tcPr>
+            <w:tcW w:type="dxa" w:w="2000"/>
+            <w:tcBorders>
+              <w:top w:val="none" w:color="FFFFFF" w:sz="0"/>
+              <w:left w:val="none" w:color="FFFFFF" w:sz="0"/>
+              <w:bottom w:val="none" w:color="FFFFFF" w:sz="0"/>
+              <w:right w:val="none" w:color="FFFFFF" w:sz="0"/>
+            </w:tcBorders>
+            <w:tcMar>
+              <w:top w:type="dxa" w:w="50"/>
+              <w:left w:type="dxa" w:w="90"/>
+              <w:bottom w:type="dxa" w:w="50"/>
+              <w:right w:type="dxa" w:w="90"/>
+            </w:tcMar>
+          </w:tcPr>
+          <w:p>
+            <w:pPr>
+              <w:jc w:val="center"/>
+            </w:pPr>
+            <w:r>
+              <w:rPr>
+                <w:rFonts w:ascii="Times New Roman" w:cs="Times New Roman" w:eastAsia="Times New Roman" w:hAnsi="Times New Roman"/>
+                <w:sz w:val="18"/>
+                <w:szCs w:val="18"/>
+              </w:rPr>
+              <w:t xml:space="preserve">Delivered in first-swing window (0.50–0.70 s)</w:t>
+            </w:r>
+          </w:p>
+        </w:tc>
+        <w:tc>
+          <w:tcPr>
+            <w:tcW w:type="dxa" w:w="2060"/>
+            <w:tcBorders>
+              <w:top w:val="none" w:color="FFFFFF" w:sz="0"/>
+              <w:left w:val="none" w:color="FFFFFF" w:sz="0"/>
+              <w:bottom w:val="none" w:color="FFFFFF" w:sz="0"/>
+              <w:right w:val="none" w:color="FFFFFF" w:sz="0"/>
+            </w:tcBorders>
+            <w:tcMar>
+              <w:top w:type="dxa" w:w="50"/>
+              <w:left w:type="dxa" w:w="90"/>
+              <w:bottom w:type="dxa" w:w="50"/>
+              <w:right w:type="dxa" w:w="90"/>
+            </w:tcMar>
+          </w:tcPr>
+          <w:p>
+            <w:pPr>
+              <w:jc w:val="center"/>
+            </w:pPr>
+            <w:r>
+              <w:rPr>
+                <w:rFonts w:ascii="Times New Roman" w:cs="Times New Roman" w:eastAsia="Times New Roman" w:hAnsi="Times New Roman"/>
+                <w:sz w:val="18"/>
+                <w:szCs w:val="18"/>
+              </w:rPr>
+              <w:t xml:space="preserve">0 MW</w:t>
             </w:r>
           </w:p>
         </w:tc>

</xml_diff>

<commit_message>
Unify all rotor-angle figures on one shared G10 model
rotor_angle, delta_delta, delay_sensitivity, g10_nc_cc_pf and
statcom_saturation now import g10_model.py: one pre-fault angle (19 deg),
one fault timing (onset 0.10 s, cleared 0.25 s, decision 0.619 s), one
G1/G4/G7 set and one G10 trajectory per case, so the same case gives the
same peak in every figure. The tables document reads its G10 rows and the
delay sweep from g10_results.json written by the model.

Co-Authored-By: Claude Opus 5.5 <noreply@anthropic.com>
Claude-Session: https://claude.ai/code/session_017mvBckRxt83VPQqr9i583E
</commit_message>
<xml_diff>
--- a/figures/Timing_and_Results_Tables.docx
+++ b/figures/Timing_and_Results_Tables.docx
@@ -3357,7 +3357,7 @@
                 <w:sz w:val="18"/>
                 <w:szCs w:val="18"/>
               </w:rPr>
-              <w:t xml:space="preserve">0.25</w:t>
+              <w:t xml:space="preserve">0.10</w:t>
             </w:r>
           </w:p>
         </w:tc>
@@ -3387,7 +3387,7 @@
                 <w:sz w:val="18"/>
                 <w:szCs w:val="18"/>
               </w:rPr>
-              <w:t xml:space="preserve">0.769</w:t>
+              <w:t xml:space="preserve">0.619</w:t>
             </w:r>
           </w:p>
         </w:tc>
@@ -3417,7 +3417,7 @@
                 <w:sz w:val="18"/>
                 <w:szCs w:val="18"/>
               </w:rPr>
-              <w:t xml:space="preserve">0.799</w:t>
+              <w:t xml:space="preserve">0.649</w:t>
             </w:r>
           </w:p>
         </w:tc>
@@ -3680,7 +3680,7 @@
                 <w:sz w:val="18"/>
                 <w:szCs w:val="18"/>
               </w:rPr>
-              <w:t xml:space="preserve">Rotor angle (G10)</w:t>
+              <w:t xml:space="preserve">All rotor-angle figures</w:t>
             </w:r>
           </w:p>
         </w:tc>
@@ -3710,7 +3710,7 @@
                 <w:sz w:val="18"/>
                 <w:szCs w:val="18"/>
               </w:rPr>
-              <w:t xml:space="preserve">No control</w:t>
+              <w:t xml:space="preserve">G10 pre-fault angle</w:t>
             </w:r>
           </w:p>
         </w:tc>
@@ -3740,7 +3740,7 @@
                 <w:sz w:val="18"/>
                 <w:szCs w:val="18"/>
               </w:rPr>
-              <w:t xml:space="preserve">Peak δ</w:t>
+              <w:t xml:space="preserve">δ0</w:t>
             </w:r>
           </w:p>
         </w:tc>
@@ -3770,7 +3770,7 @@
                 <w:sz w:val="18"/>
                 <w:szCs w:val="18"/>
               </w:rPr>
-              <w:t xml:space="preserve">Loses synchronism</w:t>
+              <w:t xml:space="preserve">19.0°</w:t>
             </w:r>
           </w:p>
         </w:tc>
@@ -3832,32 +3832,7 @@
                 <w:sz w:val="18"/>
                 <w:szCs w:val="18"/>
               </w:rPr>
-              <w:t xml:space="preserve">STATCOM, </w:t>
-            </w:r>
-            <w:r>
-              <w:rPr>
-                <w:rFonts w:ascii="Times New Roman" w:cs="Times New Roman" w:eastAsia="Times New Roman" w:hAnsi="Times New Roman"/>
-                <w:sz w:val="18"/>
-                <w:szCs w:val="18"/>
-              </w:rPr>
-              <w:t xml:space="preserve">T</w:t>
-            </w:r>
-            <w:r>
-              <w:rPr>
-                <w:rFonts w:ascii="Times New Roman" w:cs="Times New Roman" w:eastAsia="Times New Roman" w:hAnsi="Times New Roman"/>
-                <w:sz w:val="18"/>
-                <w:szCs w:val="18"/>
-                <w:vertAlign w:val="subscript"/>
-              </w:rPr>
-              <w:t xml:space="preserve">comm</w:t>
-            </w:r>
-            <w:r>
-              <w:rPr>
-                <w:rFonts w:ascii="Times New Roman" w:cs="Times New Roman" w:eastAsia="Times New Roman" w:hAnsi="Times New Roman"/>
-                <w:sz w:val="18"/>
-                <w:szCs w:val="18"/>
-              </w:rPr>
-              <w:t xml:space="preserve">=0</w:t>
+              <w:t xml:space="preserve">G1 / G4 / G7</w:t>
             </w:r>
           </w:p>
         </w:tc>
@@ -3887,7 +3862,7 @@
                 <w:sz w:val="18"/>
                 <w:szCs w:val="18"/>
               </w:rPr>
-              <w:t xml:space="preserve">Peak δ</w:t>
+              <w:t xml:space="preserve">Peak δ (Δδ)</w:t>
             </w:r>
           </w:p>
         </w:tc>
@@ -3917,7 +3892,7 @@
                 <w:sz w:val="18"/>
                 <w:szCs w:val="18"/>
               </w:rPr>
-              <w:t xml:space="preserve">52.9°</w:t>
+              <w:t xml:space="preserve">46.5° / 58.4° / 66.1° (26.5° / 33.4° / 38.1°)</w:t>
             </w:r>
           </w:p>
         </w:tc>
@@ -3949,7 +3924,7 @@
                 <w:sz w:val="18"/>
                 <w:szCs w:val="18"/>
               </w:rPr>
-              <w:t xml:space="preserve"/>
+              <w:t xml:space="preserve">Rotor angle (G10)</w:t>
             </w:r>
           </w:p>
         </w:tc>
@@ -3979,32 +3954,7 @@
                 <w:sz w:val="18"/>
                 <w:szCs w:val="18"/>
               </w:rPr>
-              <w:t xml:space="preserve">STATCOM, </w:t>
-            </w:r>
-            <w:r>
-              <w:rPr>
-                <w:rFonts w:ascii="Times New Roman" w:cs="Times New Roman" w:eastAsia="Times New Roman" w:hAnsi="Times New Roman"/>
-                <w:sz w:val="18"/>
-                <w:szCs w:val="18"/>
-              </w:rPr>
-              <w:t xml:space="preserve">T</w:t>
-            </w:r>
-            <w:r>
-              <w:rPr>
-                <w:rFonts w:ascii="Times New Roman" w:cs="Times New Roman" w:eastAsia="Times New Roman" w:hAnsi="Times New Roman"/>
-                <w:sz w:val="18"/>
-                <w:szCs w:val="18"/>
-                <w:vertAlign w:val="subscript"/>
-              </w:rPr>
-              <w:t xml:space="preserve">comm</w:t>
-            </w:r>
-            <w:r>
-              <w:rPr>
-                <w:rFonts w:ascii="Times New Roman" w:cs="Times New Roman" w:eastAsia="Times New Roman" w:hAnsi="Times New Roman"/>
-                <w:sz w:val="18"/>
-                <w:szCs w:val="18"/>
-              </w:rPr>
-              <w:t xml:space="preserve">=200 ms</w:t>
+              <w:t xml:space="preserve">No control</w:t>
             </w:r>
           </w:p>
         </w:tc>
@@ -4034,7 +3984,7 @@
                 <w:sz w:val="18"/>
                 <w:szCs w:val="18"/>
               </w:rPr>
-              <w:t xml:space="preserve">Peak δ</w:t>
+              <w:t xml:space="preserve">180° crossing</w:t>
             </w:r>
           </w:p>
         </w:tc>
@@ -4064,7 +4014,7 @@
                 <w:sz w:val="18"/>
                 <w:szCs w:val="18"/>
               </w:rPr>
-              <w:t xml:space="preserve">117.4°</w:t>
+              <w:t xml:space="preserve">1.47 s</w:t>
             </w:r>
           </w:p>
         </w:tc>
@@ -4126,7 +4076,7 @@
                 <w:sz w:val="18"/>
                 <w:szCs w:val="18"/>
               </w:rPr>
-              <w:t xml:space="preserve">SVC, </w:t>
+              <w:t xml:space="preserve">STATCOM, </w:t>
             </w:r>
             <w:r>
               <w:rPr>
@@ -4211,7 +4161,7 @@
                 <w:sz w:val="18"/>
                 <w:szCs w:val="18"/>
               </w:rPr>
-              <w:t xml:space="preserve">97.1°</w:t>
+              <w:t xml:space="preserve">64.1°</w:t>
             </w:r>
           </w:p>
         </w:tc>
@@ -4243,7 +4193,7 @@
                 <w:sz w:val="18"/>
                 <w:szCs w:val="18"/>
               </w:rPr>
-              <w:t xml:space="preserve">System frequency</w:t>
+              <w:t xml:space="preserve"/>
             </w:r>
           </w:p>
         </w:tc>
@@ -4273,7 +4223,32 @@
                 <w:sz w:val="18"/>
                 <w:szCs w:val="18"/>
               </w:rPr>
-              <w:t xml:space="preserve">No control</w:t>
+              <w:t xml:space="preserve">STATCOM, </w:t>
+            </w:r>
+            <w:r>
+              <w:rPr>
+                <w:rFonts w:ascii="Times New Roman" w:cs="Times New Roman" w:eastAsia="Times New Roman" w:hAnsi="Times New Roman"/>
+                <w:sz w:val="18"/>
+                <w:szCs w:val="18"/>
+              </w:rPr>
+              <w:t xml:space="preserve">T</w:t>
+            </w:r>
+            <w:r>
+              <w:rPr>
+                <w:rFonts w:ascii="Times New Roman" w:cs="Times New Roman" w:eastAsia="Times New Roman" w:hAnsi="Times New Roman"/>
+                <w:sz w:val="18"/>
+                <w:szCs w:val="18"/>
+                <w:vertAlign w:val="subscript"/>
+              </w:rPr>
+              <w:t xml:space="preserve">comm</w:t>
+            </w:r>
+            <w:r>
+              <w:rPr>
+                <w:rFonts w:ascii="Times New Roman" w:cs="Times New Roman" w:eastAsia="Times New Roman" w:hAnsi="Times New Roman"/>
+                <w:sz w:val="18"/>
+                <w:szCs w:val="18"/>
+              </w:rPr>
+              <w:t xml:space="preserve">=200 ms</w:t>
             </w:r>
           </w:p>
         </w:tc>
@@ -4303,7 +4278,7 @@
                 <w:sz w:val="18"/>
                 <w:szCs w:val="18"/>
               </w:rPr>
-              <w:t xml:space="preserve">Nadir</w:t>
+              <w:t xml:space="preserve">Peak δ</w:t>
             </w:r>
           </w:p>
         </w:tc>
@@ -4333,7 +4308,7 @@
                 <w:sz w:val="18"/>
                 <w:szCs w:val="18"/>
               </w:rPr>
-              <w:t xml:space="preserve">48.30 Hz</w:t>
+              <w:t xml:space="preserve">90.6°</w:t>
             </w:r>
           </w:p>
         </w:tc>
@@ -4395,7 +4370,32 @@
                 <w:sz w:val="18"/>
                 <w:szCs w:val="18"/>
               </w:rPr>
-              <w:t xml:space="preserve">Conventional PI-AGC</w:t>
+              <w:t xml:space="preserve">SVC, </w:t>
+            </w:r>
+            <w:r>
+              <w:rPr>
+                <w:rFonts w:ascii="Times New Roman" w:cs="Times New Roman" w:eastAsia="Times New Roman" w:hAnsi="Times New Roman"/>
+                <w:sz w:val="18"/>
+                <w:szCs w:val="18"/>
+              </w:rPr>
+              <w:t xml:space="preserve">T</w:t>
+            </w:r>
+            <w:r>
+              <w:rPr>
+                <w:rFonts w:ascii="Times New Roman" w:cs="Times New Roman" w:eastAsia="Times New Roman" w:hAnsi="Times New Roman"/>
+                <w:sz w:val="18"/>
+                <w:szCs w:val="18"/>
+                <w:vertAlign w:val="subscript"/>
+              </w:rPr>
+              <w:t xml:space="preserve">comm</w:t>
+            </w:r>
+            <w:r>
+              <w:rPr>
+                <w:rFonts w:ascii="Times New Roman" w:cs="Times New Roman" w:eastAsia="Times New Roman" w:hAnsi="Times New Roman"/>
+                <w:sz w:val="18"/>
+                <w:szCs w:val="18"/>
+              </w:rPr>
+              <w:t xml:space="preserve">=0</w:t>
             </w:r>
           </w:p>
         </w:tc>
@@ -4425,7 +4425,7 @@
                 <w:sz w:val="18"/>
                 <w:szCs w:val="18"/>
               </w:rPr>
-              <w:t xml:space="preserve">Nadir</w:t>
+              <w:t xml:space="preserve">Peak δ</w:t>
             </w:r>
           </w:p>
         </w:tc>
@@ -4455,7 +4455,7 @@
                 <w:sz w:val="18"/>
                 <w:szCs w:val="18"/>
               </w:rPr>
-              <w:t xml:space="preserve">49.10 Hz</w:t>
+              <w:t xml:space="preserve">68.5°</w:t>
             </w:r>
           </w:p>
         </w:tc>
@@ -4487,7 +4487,7 @@
                 <w:sz w:val="18"/>
                 <w:szCs w:val="18"/>
               </w:rPr>
-              <w:t xml:space="preserve"/>
+              <w:t xml:space="preserve">System frequency</w:t>
             </w:r>
           </w:p>
         </w:tc>
@@ -4517,32 +4517,7 @@
                 <w:sz w:val="18"/>
                 <w:szCs w:val="18"/>
               </w:rPr>
-              <w:t xml:space="preserve">CNN-LSTM + SVC, </w:t>
-            </w:r>
-            <w:r>
-              <w:rPr>
-                <w:rFonts w:ascii="Times New Roman" w:cs="Times New Roman" w:eastAsia="Times New Roman" w:hAnsi="Times New Roman"/>
-                <w:sz w:val="18"/>
-                <w:szCs w:val="18"/>
-              </w:rPr>
-              <w:t xml:space="preserve">T</w:t>
-            </w:r>
-            <w:r>
-              <w:rPr>
-                <w:rFonts w:ascii="Times New Roman" w:cs="Times New Roman" w:eastAsia="Times New Roman" w:hAnsi="Times New Roman"/>
-                <w:sz w:val="18"/>
-                <w:szCs w:val="18"/>
-                <w:vertAlign w:val="subscript"/>
-              </w:rPr>
-              <w:t xml:space="preserve">comm</w:t>
-            </w:r>
-            <w:r>
-              <w:rPr>
-                <w:rFonts w:ascii="Times New Roman" w:cs="Times New Roman" w:eastAsia="Times New Roman" w:hAnsi="Times New Roman"/>
-                <w:sz w:val="18"/>
-                <w:szCs w:val="18"/>
-              </w:rPr>
-              <w:t xml:space="preserve">=0 / 200 ms</w:t>
+              <w:t xml:space="preserve">No control</w:t>
             </w:r>
           </w:p>
         </w:tc>
@@ -4602,7 +4577,7 @@
                 <w:sz w:val="18"/>
                 <w:szCs w:val="18"/>
               </w:rPr>
-              <w:t xml:space="preserve">48.30 Hz (before action)</w:t>
+              <w:t xml:space="preserve">48.30 Hz</w:t>
             </w:r>
           </w:p>
         </w:tc>
@@ -4634,7 +4609,7 @@
                 <w:sz w:val="18"/>
                 <w:szCs w:val="18"/>
               </w:rPr>
-              <w:t xml:space="preserve">Two-panel Δδ (G10)</w:t>
+              <w:t xml:space="preserve"/>
             </w:r>
           </w:p>
         </w:tc>
@@ -4664,32 +4639,7 @@
                 <w:sz w:val="18"/>
                 <w:szCs w:val="18"/>
               </w:rPr>
-              <w:t xml:space="preserve">STATCOM, </w:t>
-            </w:r>
-            <w:r>
-              <w:rPr>
-                <w:rFonts w:ascii="Times New Roman" w:cs="Times New Roman" w:eastAsia="Times New Roman" w:hAnsi="Times New Roman"/>
-                <w:sz w:val="18"/>
-                <w:szCs w:val="18"/>
-              </w:rPr>
-              <w:t xml:space="preserve">T</w:t>
-            </w:r>
-            <w:r>
-              <w:rPr>
-                <w:rFonts w:ascii="Times New Roman" w:cs="Times New Roman" w:eastAsia="Times New Roman" w:hAnsi="Times New Roman"/>
-                <w:sz w:val="18"/>
-                <w:szCs w:val="18"/>
-                <w:vertAlign w:val="subscript"/>
-              </w:rPr>
-              <w:t xml:space="preserve">comm</w:t>
-            </w:r>
-            <w:r>
-              <w:rPr>
-                <w:rFonts w:ascii="Times New Roman" w:cs="Times New Roman" w:eastAsia="Times New Roman" w:hAnsi="Times New Roman"/>
-                <w:sz w:val="18"/>
-                <w:szCs w:val="18"/>
-              </w:rPr>
-              <w:t xml:space="preserve">=0</w:t>
+              <w:t xml:space="preserve">Conventional PI-AGC</w:t>
             </w:r>
           </w:p>
         </w:tc>
@@ -4719,7 +4669,7 @@
                 <w:sz w:val="18"/>
                 <w:szCs w:val="18"/>
               </w:rPr>
-              <w:t xml:space="preserve">Peak Δδ</w:t>
+              <w:t xml:space="preserve">Nadir</w:t>
             </w:r>
           </w:p>
         </w:tc>
@@ -4749,7 +4699,7 @@
                 <w:sz w:val="18"/>
                 <w:szCs w:val="18"/>
               </w:rPr>
-              <w:t xml:space="preserve">20.7°</w:t>
+              <w:t xml:space="preserve">49.10 Hz</w:t>
             </w:r>
           </w:p>
         </w:tc>
@@ -4811,7 +4761,7 @@
                 <w:sz w:val="18"/>
                 <w:szCs w:val="18"/>
               </w:rPr>
-              <w:t xml:space="preserve">STATCOM, </w:t>
+              <w:t xml:space="preserve">CNN-LSTM + SVC, </w:t>
             </w:r>
             <w:r>
               <w:rPr>
@@ -4836,7 +4786,7 @@
                 <w:sz w:val="18"/>
                 <w:szCs w:val="18"/>
               </w:rPr>
-              <w:t xml:space="preserve">=200 ms</w:t>
+              <w:t xml:space="preserve">=0 / 200 ms</w:t>
             </w:r>
           </w:p>
         </w:tc>
@@ -4866,7 +4816,7 @@
                 <w:sz w:val="18"/>
                 <w:szCs w:val="18"/>
               </w:rPr>
-              <w:t xml:space="preserve">Peak Δδ</w:t>
+              <w:t xml:space="preserve">Nadir</w:t>
             </w:r>
           </w:p>
         </w:tc>
@@ -4896,7 +4846,7 @@
                 <w:sz w:val="18"/>
                 <w:szCs w:val="18"/>
               </w:rPr>
-              <w:t xml:space="preserve">43.1°</w:t>
+              <w:t xml:space="preserve">48.30 Hz (before action)</w:t>
             </w:r>
           </w:p>
         </w:tc>
@@ -4928,7 +4878,7 @@
                 <w:sz w:val="18"/>
                 <w:szCs w:val="18"/>
               </w:rPr>
-              <w:t xml:space="preserve"/>
+              <w:t xml:space="preserve">Two-panel Δδ (G10)</w:t>
             </w:r>
           </w:p>
         </w:tc>
@@ -4958,7 +4908,7 @@
                 <w:sz w:val="18"/>
                 <w:szCs w:val="18"/>
               </w:rPr>
-              <w:t xml:space="preserve">SVC, </w:t>
+              <w:t xml:space="preserve">STATCOM, </w:t>
             </w:r>
             <w:r>
               <w:rPr>
@@ -5043,7 +4993,7 @@
                 <w:sz w:val="18"/>
                 <w:szCs w:val="18"/>
               </w:rPr>
-              <w:t xml:space="preserve">34.6°</w:t>
+              <w:t xml:space="preserve">45.1°</w:t>
             </w:r>
           </w:p>
         </w:tc>
@@ -5075,7 +5025,7 @@
                 <w:sz w:val="18"/>
                 <w:szCs w:val="18"/>
               </w:rPr>
-              <w:t xml:space="preserve">Bus 44 voltage (wind variability)</w:t>
+              <w:t xml:space="preserve"/>
             </w:r>
           </w:p>
         </w:tc>
@@ -5105,7 +5055,32 @@
                 <w:sz w:val="18"/>
                 <w:szCs w:val="18"/>
               </w:rPr>
-              <w:t xml:space="preserve">SG-only baseline</w:t>
+              <w:t xml:space="preserve">STATCOM, </w:t>
+            </w:r>
+            <w:r>
+              <w:rPr>
+                <w:rFonts w:ascii="Times New Roman" w:cs="Times New Roman" w:eastAsia="Times New Roman" w:hAnsi="Times New Roman"/>
+                <w:sz w:val="18"/>
+                <w:szCs w:val="18"/>
+              </w:rPr>
+              <w:t xml:space="preserve">T</w:t>
+            </w:r>
+            <w:r>
+              <w:rPr>
+                <w:rFonts w:ascii="Times New Roman" w:cs="Times New Roman" w:eastAsia="Times New Roman" w:hAnsi="Times New Roman"/>
+                <w:sz w:val="18"/>
+                <w:szCs w:val="18"/>
+                <w:vertAlign w:val="subscript"/>
+              </w:rPr>
+              <w:t xml:space="preserve">comm</w:t>
+            </w:r>
+            <w:r>
+              <w:rPr>
+                <w:rFonts w:ascii="Times New Roman" w:cs="Times New Roman" w:eastAsia="Times New Roman" w:hAnsi="Times New Roman"/>
+                <w:sz w:val="18"/>
+                <w:szCs w:val="18"/>
+              </w:rPr>
+              <w:t xml:space="preserve">=200 ms</w:t>
             </w:r>
           </w:p>
         </w:tc>
@@ -5135,7 +5110,7 @@
                 <w:sz w:val="18"/>
                 <w:szCs w:val="18"/>
               </w:rPr>
-              <w:t xml:space="preserve">Nadir / time &lt; 0.90 p.u.</w:t>
+              <w:t xml:space="preserve">Peak Δδ</w:t>
             </w:r>
           </w:p>
         </w:tc>
@@ -5165,7 +5140,7 @@
                 <w:sz w:val="18"/>
                 <w:szCs w:val="18"/>
               </w:rPr>
-              <w:t xml:space="preserve">0.889 p.u. / 1.0 s</w:t>
+              <w:t xml:space="preserve">71.6°</w:t>
             </w:r>
           </w:p>
         </w:tc>
@@ -5227,7 +5202,32 @@
                 <w:sz w:val="18"/>
                 <w:szCs w:val="18"/>
               </w:rPr>
-              <w:t xml:space="preserve">50% RES, no control</w:t>
+              <w:t xml:space="preserve">SVC, </w:t>
+            </w:r>
+            <w:r>
+              <w:rPr>
+                <w:rFonts w:ascii="Times New Roman" w:cs="Times New Roman" w:eastAsia="Times New Roman" w:hAnsi="Times New Roman"/>
+                <w:sz w:val="18"/>
+                <w:szCs w:val="18"/>
+              </w:rPr>
+              <w:t xml:space="preserve">T</w:t>
+            </w:r>
+            <w:r>
+              <w:rPr>
+                <w:rFonts w:ascii="Times New Roman" w:cs="Times New Roman" w:eastAsia="Times New Roman" w:hAnsi="Times New Roman"/>
+                <w:sz w:val="18"/>
+                <w:szCs w:val="18"/>
+                <w:vertAlign w:val="subscript"/>
+              </w:rPr>
+              <w:t xml:space="preserve">comm</w:t>
+            </w:r>
+            <w:r>
+              <w:rPr>
+                <w:rFonts w:ascii="Times New Roman" w:cs="Times New Roman" w:eastAsia="Times New Roman" w:hAnsi="Times New Roman"/>
+                <w:sz w:val="18"/>
+                <w:szCs w:val="18"/>
+              </w:rPr>
+              <w:t xml:space="preserve">=0</w:t>
             </w:r>
           </w:p>
         </w:tc>
@@ -5257,7 +5257,7 @@
                 <w:sz w:val="18"/>
                 <w:szCs w:val="18"/>
               </w:rPr>
-              <w:t xml:space="preserve">Nadir / time &lt; 0.90 p.u.</w:t>
+              <w:t xml:space="preserve">Peak Δδ</w:t>
             </w:r>
           </w:p>
         </w:tc>
@@ -5287,7 +5287,7 @@
                 <w:sz w:val="18"/>
                 <w:szCs w:val="18"/>
               </w:rPr>
-              <w:t xml:space="preserve">0.831 p.u. / 4.2 s</w:t>
+              <w:t xml:space="preserve">49.5°</w:t>
             </w:r>
           </w:p>
         </w:tc>
@@ -5319,7 +5319,7 @@
                 <w:sz w:val="18"/>
                 <w:szCs w:val="18"/>
               </w:rPr>
-              <w:t xml:space="preserve"/>
+              <w:t xml:space="preserve">Bus 44 voltage (wind variability)</w:t>
             </w:r>
           </w:p>
         </w:tc>
@@ -5349,32 +5349,7 @@
                 <w:sz w:val="18"/>
                 <w:szCs w:val="18"/>
               </w:rPr>
-              <w:t xml:space="preserve">CNN-LSTM + SVC, </w:t>
-            </w:r>
-            <w:r>
-              <w:rPr>
-                <w:rFonts w:ascii="Times New Roman" w:cs="Times New Roman" w:eastAsia="Times New Roman" w:hAnsi="Times New Roman"/>
-                <w:sz w:val="18"/>
-                <w:szCs w:val="18"/>
-              </w:rPr>
-              <w:t xml:space="preserve">T</w:t>
-            </w:r>
-            <w:r>
-              <w:rPr>
-                <w:rFonts w:ascii="Times New Roman" w:cs="Times New Roman" w:eastAsia="Times New Roman" w:hAnsi="Times New Roman"/>
-                <w:sz w:val="18"/>
-                <w:szCs w:val="18"/>
-                <w:vertAlign w:val="subscript"/>
-              </w:rPr>
-              <w:t xml:space="preserve">comm</w:t>
-            </w:r>
-            <w:r>
-              <w:rPr>
-                <w:rFonts w:ascii="Times New Roman" w:cs="Times New Roman" w:eastAsia="Times New Roman" w:hAnsi="Times New Roman"/>
-                <w:sz w:val="18"/>
-                <w:szCs w:val="18"/>
-              </w:rPr>
-              <w:t xml:space="preserve">=0</w:t>
+              <w:t xml:space="preserve">SG-only baseline</w:t>
             </w:r>
           </w:p>
         </w:tc>
@@ -5434,7 +5409,7 @@
                 <w:sz w:val="18"/>
                 <w:szCs w:val="18"/>
               </w:rPr>
-              <w:t xml:space="preserve">0.859 p.u. / 1.4 s</w:t>
+              <w:t xml:space="preserve">0.889 p.u. / 1.0 s</w:t>
             </w:r>
           </w:p>
         </w:tc>
@@ -5496,32 +5471,7 @@
                 <w:sz w:val="18"/>
                 <w:szCs w:val="18"/>
               </w:rPr>
-              <w:t xml:space="preserve">CNN-LSTM + SVC, </w:t>
-            </w:r>
-            <w:r>
-              <w:rPr>
-                <w:rFonts w:ascii="Times New Roman" w:cs="Times New Roman" w:eastAsia="Times New Roman" w:hAnsi="Times New Roman"/>
-                <w:sz w:val="18"/>
-                <w:szCs w:val="18"/>
-              </w:rPr>
-              <w:t xml:space="preserve">T</w:t>
-            </w:r>
-            <w:r>
-              <w:rPr>
-                <w:rFonts w:ascii="Times New Roman" w:cs="Times New Roman" w:eastAsia="Times New Roman" w:hAnsi="Times New Roman"/>
-                <w:sz w:val="18"/>
-                <w:szCs w:val="18"/>
-                <w:vertAlign w:val="subscript"/>
-              </w:rPr>
-              <w:t xml:space="preserve">comm</w:t>
-            </w:r>
-            <w:r>
-              <w:rPr>
-                <w:rFonts w:ascii="Times New Roman" w:cs="Times New Roman" w:eastAsia="Times New Roman" w:hAnsi="Times New Roman"/>
-                <w:sz w:val="18"/>
-                <w:szCs w:val="18"/>
-              </w:rPr>
-              <w:t xml:space="preserve">=200 ms</w:t>
+              <w:t xml:space="preserve">50% RES, no control</w:t>
             </w:r>
           </w:p>
         </w:tc>
@@ -5581,7 +5531,7 @@
                 <w:sz w:val="18"/>
                 <w:szCs w:val="18"/>
               </w:rPr>
-              <w:t xml:space="preserve">0.843 p.u. / 1.4 s</w:t>
+              <w:t xml:space="preserve">0.831 p.u. / 4.2 s</w:t>
             </w:r>
           </w:p>
         </w:tc>
@@ -5613,7 +5563,7 @@
                 <w:sz w:val="18"/>
                 <w:szCs w:val="18"/>
               </w:rPr>
-              <w:t xml:space="preserve">Bus 44 voltage collapse</w:t>
+              <w:t xml:space="preserve"/>
             </w:r>
           </w:p>
         </w:tc>
@@ -5643,7 +5593,32 @@
                 <w:sz w:val="18"/>
                 <w:szCs w:val="18"/>
               </w:rPr>
-              <w:t xml:space="preserve">NC</w:t>
+              <w:t xml:space="preserve">CNN-LSTM + SVC, </w:t>
+            </w:r>
+            <w:r>
+              <w:rPr>
+                <w:rFonts w:ascii="Times New Roman" w:cs="Times New Roman" w:eastAsia="Times New Roman" w:hAnsi="Times New Roman"/>
+                <w:sz w:val="18"/>
+                <w:szCs w:val="18"/>
+              </w:rPr>
+              <w:t xml:space="preserve">T</w:t>
+            </w:r>
+            <w:r>
+              <w:rPr>
+                <w:rFonts w:ascii="Times New Roman" w:cs="Times New Roman" w:eastAsia="Times New Roman" w:hAnsi="Times New Roman"/>
+                <w:sz w:val="18"/>
+                <w:szCs w:val="18"/>
+                <w:vertAlign w:val="subscript"/>
+              </w:rPr>
+              <w:t xml:space="preserve">comm</w:t>
+            </w:r>
+            <w:r>
+              <w:rPr>
+                <w:rFonts w:ascii="Times New Roman" w:cs="Times New Roman" w:eastAsia="Times New Roman" w:hAnsi="Times New Roman"/>
+                <w:sz w:val="18"/>
+                <w:szCs w:val="18"/>
+              </w:rPr>
+              <w:t xml:space="preserve">=0</w:t>
             </w:r>
           </w:p>
         </w:tc>
@@ -5673,7 +5648,7 @@
                 <w:sz w:val="18"/>
                 <w:szCs w:val="18"/>
               </w:rPr>
-              <w:t xml:space="preserve">Final state</w:t>
+              <w:t xml:space="preserve">Nadir / time &lt; 0.90 p.u.</w:t>
             </w:r>
           </w:p>
         </w:tc>
@@ -5703,7 +5678,7 @@
                 <w:sz w:val="18"/>
                 <w:szCs w:val="18"/>
               </w:rPr>
-              <w:t xml:space="preserve">Collapse &lt; 0.60 p.u.</w:t>
+              <w:t xml:space="preserve">0.859 p.u. / 1.4 s</w:t>
             </w:r>
           </w:p>
         </w:tc>
@@ -5765,7 +5740,32 @@
                 <w:sz w:val="18"/>
                 <w:szCs w:val="18"/>
               </w:rPr>
-              <w:t xml:space="preserve">CC</w:t>
+              <w:t xml:space="preserve">CNN-LSTM + SVC, </w:t>
+            </w:r>
+            <w:r>
+              <w:rPr>
+                <w:rFonts w:ascii="Times New Roman" w:cs="Times New Roman" w:eastAsia="Times New Roman" w:hAnsi="Times New Roman"/>
+                <w:sz w:val="18"/>
+                <w:szCs w:val="18"/>
+              </w:rPr>
+              <w:t xml:space="preserve">T</w:t>
+            </w:r>
+            <w:r>
+              <w:rPr>
+                <w:rFonts w:ascii="Times New Roman" w:cs="Times New Roman" w:eastAsia="Times New Roman" w:hAnsi="Times New Roman"/>
+                <w:sz w:val="18"/>
+                <w:szCs w:val="18"/>
+                <w:vertAlign w:val="subscript"/>
+              </w:rPr>
+              <w:t xml:space="preserve">comm</w:t>
+            </w:r>
+            <w:r>
+              <w:rPr>
+                <w:rFonts w:ascii="Times New Roman" w:cs="Times New Roman" w:eastAsia="Times New Roman" w:hAnsi="Times New Roman"/>
+                <w:sz w:val="18"/>
+                <w:szCs w:val="18"/>
+              </w:rPr>
+              <w:t xml:space="preserve">=200 ms</w:t>
             </w:r>
           </w:p>
         </w:tc>
@@ -5795,7 +5795,7 @@
                 <w:sz w:val="18"/>
                 <w:szCs w:val="18"/>
               </w:rPr>
-              <w:t xml:space="preserve">Nadir / final</w:t>
+              <w:t xml:space="preserve">Nadir / time &lt; 0.90 p.u.</w:t>
             </w:r>
           </w:p>
         </w:tc>
@@ -5825,7 +5825,7 @@
                 <w:sz w:val="18"/>
                 <w:szCs w:val="18"/>
               </w:rPr>
-              <w:t xml:space="preserve">0.785 / 0.86 p.u.</w:t>
+              <w:t xml:space="preserve">0.843 p.u. / 1.4 s</w:t>
             </w:r>
           </w:p>
         </w:tc>
@@ -5857,7 +5857,7 @@
                 <w:sz w:val="18"/>
                 <w:szCs w:val="18"/>
               </w:rPr>
-              <w:t xml:space="preserve"/>
+              <w:t xml:space="preserve">Bus 44 voltage collapse</w:t>
             </w:r>
           </w:p>
         </w:tc>
@@ -5887,32 +5887,7 @@
                 <w:sz w:val="18"/>
                 <w:szCs w:val="18"/>
               </w:rPr>
-              <w:t xml:space="preserve">PF, </w:t>
-            </w:r>
-            <w:r>
-              <w:rPr>
-                <w:rFonts w:ascii="Times New Roman" w:cs="Times New Roman" w:eastAsia="Times New Roman" w:hAnsi="Times New Roman"/>
-                <w:sz w:val="18"/>
-                <w:szCs w:val="18"/>
-              </w:rPr>
-              <w:t xml:space="preserve">T</w:t>
-            </w:r>
-            <w:r>
-              <w:rPr>
-                <w:rFonts w:ascii="Times New Roman" w:cs="Times New Roman" w:eastAsia="Times New Roman" w:hAnsi="Times New Roman"/>
-                <w:sz w:val="18"/>
-                <w:szCs w:val="18"/>
-                <w:vertAlign w:val="subscript"/>
-              </w:rPr>
-              <w:t xml:space="preserve">comm</w:t>
-            </w:r>
-            <w:r>
-              <w:rPr>
-                <w:rFonts w:ascii="Times New Roman" w:cs="Times New Roman" w:eastAsia="Times New Roman" w:hAnsi="Times New Roman"/>
-                <w:sz w:val="18"/>
-                <w:szCs w:val="18"/>
-              </w:rPr>
-              <w:t xml:space="preserve">=0</w:t>
+              <w:t xml:space="preserve">NC</w:t>
             </w:r>
           </w:p>
         </w:tc>
@@ -5942,7 +5917,7 @@
                 <w:sz w:val="18"/>
                 <w:szCs w:val="18"/>
               </w:rPr>
-              <w:t xml:space="preserve">Nadir / time &lt; 0.90 p.u.</w:t>
+              <w:t xml:space="preserve">Final state</w:t>
             </w:r>
           </w:p>
         </w:tc>
@@ -5972,7 +5947,7 @@
                 <w:sz w:val="18"/>
                 <w:szCs w:val="18"/>
               </w:rPr>
-              <w:t xml:space="preserve">0.858 p.u. / 1.0 s</w:t>
+              <w:t xml:space="preserve">Collapse &lt; 0.60 p.u.</w:t>
             </w:r>
           </w:p>
         </w:tc>
@@ -6034,32 +6009,7 @@
                 <w:sz w:val="18"/>
                 <w:szCs w:val="18"/>
               </w:rPr>
-              <w:t xml:space="preserve">PF, </w:t>
-            </w:r>
-            <w:r>
-              <w:rPr>
-                <w:rFonts w:ascii="Times New Roman" w:cs="Times New Roman" w:eastAsia="Times New Roman" w:hAnsi="Times New Roman"/>
-                <w:sz w:val="18"/>
-                <w:szCs w:val="18"/>
-              </w:rPr>
-              <w:t xml:space="preserve">T</w:t>
-            </w:r>
-            <w:r>
-              <w:rPr>
-                <w:rFonts w:ascii="Times New Roman" w:cs="Times New Roman" w:eastAsia="Times New Roman" w:hAnsi="Times New Roman"/>
-                <w:sz w:val="18"/>
-                <w:szCs w:val="18"/>
-                <w:vertAlign w:val="subscript"/>
-              </w:rPr>
-              <w:t xml:space="preserve">comm</w:t>
-            </w:r>
-            <w:r>
-              <w:rPr>
-                <w:rFonts w:ascii="Times New Roman" w:cs="Times New Roman" w:eastAsia="Times New Roman" w:hAnsi="Times New Roman"/>
-                <w:sz w:val="18"/>
-                <w:szCs w:val="18"/>
-              </w:rPr>
-              <w:t xml:space="preserve">=200 ms</w:t>
+              <w:t xml:space="preserve">CC</w:t>
             </w:r>
           </w:p>
         </w:tc>
@@ -6089,7 +6039,7 @@
                 <w:sz w:val="18"/>
                 <w:szCs w:val="18"/>
               </w:rPr>
-              <w:t xml:space="preserve">Nadir / time &lt; 0.90 p.u.</w:t>
+              <w:t xml:space="preserve">Nadir / final</w:t>
             </w:r>
           </w:p>
         </w:tc>
@@ -6119,7 +6069,7 @@
                 <w:sz w:val="18"/>
                 <w:szCs w:val="18"/>
               </w:rPr>
-              <w:t xml:space="preserve">0.827 p.u. / 1.5 s</w:t>
+              <w:t xml:space="preserve">0.785 / 0.86 p.u.</w:t>
             </w:r>
           </w:p>
         </w:tc>
@@ -6151,7 +6101,7 @@
                 <w:sz w:val="18"/>
                 <w:szCs w:val="18"/>
               </w:rPr>
-              <w:t xml:space="preserve">Frequency deviation (a), 39-bus</w:t>
+              <w:t xml:space="preserve"/>
             </w:r>
           </w:p>
         </w:tc>
@@ -6181,7 +6131,32 @@
                 <w:sz w:val="18"/>
                 <w:szCs w:val="18"/>
               </w:rPr>
-              <w:t xml:space="preserve">No control / PI-AGC</w:t>
+              <w:t xml:space="preserve">PF, </w:t>
+            </w:r>
+            <w:r>
+              <w:rPr>
+                <w:rFonts w:ascii="Times New Roman" w:cs="Times New Roman" w:eastAsia="Times New Roman" w:hAnsi="Times New Roman"/>
+                <w:sz w:val="18"/>
+                <w:szCs w:val="18"/>
+              </w:rPr>
+              <w:t xml:space="preserve">T</w:t>
+            </w:r>
+            <w:r>
+              <w:rPr>
+                <w:rFonts w:ascii="Times New Roman" w:cs="Times New Roman" w:eastAsia="Times New Roman" w:hAnsi="Times New Roman"/>
+                <w:sz w:val="18"/>
+                <w:szCs w:val="18"/>
+                <w:vertAlign w:val="subscript"/>
+              </w:rPr>
+              <w:t xml:space="preserve">comm</w:t>
+            </w:r>
+            <w:r>
+              <w:rPr>
+                <w:rFonts w:ascii="Times New Roman" w:cs="Times New Roman" w:eastAsia="Times New Roman" w:hAnsi="Times New Roman"/>
+                <w:sz w:val="18"/>
+                <w:szCs w:val="18"/>
+              </w:rPr>
+              <w:t xml:space="preserve">=0</w:t>
             </w:r>
           </w:p>
         </w:tc>
@@ -6211,7 +6186,7 @@
                 <w:sz w:val="18"/>
                 <w:szCs w:val="18"/>
               </w:rPr>
-              <w:t xml:space="preserve">Δf nadir</w:t>
+              <w:t xml:space="preserve">Nadir / time &lt; 0.90 p.u.</w:t>
             </w:r>
           </w:p>
         </w:tc>
@@ -6241,7 +6216,7 @@
                 <w:sz w:val="18"/>
                 <w:szCs w:val="18"/>
               </w:rPr>
-              <w:t xml:space="preserve">−1.70 / −0.90 Hz</w:t>
+              <w:t xml:space="preserve">0.858 p.u. / 1.0 s</w:t>
             </w:r>
           </w:p>
         </w:tc>
@@ -6303,7 +6278,32 @@
                 <w:sz w:val="18"/>
                 <w:szCs w:val="18"/>
               </w:rPr>
-              <w:t xml:space="preserve">CNN-LSTM + SVC</w:t>
+              <w:t xml:space="preserve">PF, </w:t>
+            </w:r>
+            <w:r>
+              <w:rPr>
+                <w:rFonts w:ascii="Times New Roman" w:cs="Times New Roman" w:eastAsia="Times New Roman" w:hAnsi="Times New Roman"/>
+                <w:sz w:val="18"/>
+                <w:szCs w:val="18"/>
+              </w:rPr>
+              <w:t xml:space="preserve">T</w:t>
+            </w:r>
+            <w:r>
+              <w:rPr>
+                <w:rFonts w:ascii="Times New Roman" w:cs="Times New Roman" w:eastAsia="Times New Roman" w:hAnsi="Times New Roman"/>
+                <w:sz w:val="18"/>
+                <w:szCs w:val="18"/>
+                <w:vertAlign w:val="subscript"/>
+              </w:rPr>
+              <w:t xml:space="preserve">comm</w:t>
+            </w:r>
+            <w:r>
+              <w:rPr>
+                <w:rFonts w:ascii="Times New Roman" w:cs="Times New Roman" w:eastAsia="Times New Roman" w:hAnsi="Times New Roman"/>
+                <w:sz w:val="18"/>
+                <w:szCs w:val="18"/>
+              </w:rPr>
+              <w:t xml:space="preserve">=200 ms</w:t>
             </w:r>
           </w:p>
         </w:tc>
@@ -6333,7 +6333,7 @@
                 <w:sz w:val="18"/>
                 <w:szCs w:val="18"/>
               </w:rPr>
-              <w:t xml:space="preserve">Δf nadir</w:t>
+              <w:t xml:space="preserve">Nadir / time &lt; 0.90 p.u.</w:t>
             </w:r>
           </w:p>
         </w:tc>
@@ -6363,7 +6363,7 @@
                 <w:sz w:val="18"/>
                 <w:szCs w:val="18"/>
               </w:rPr>
-              <w:t xml:space="preserve">−1.70 Hz (before action)</w:t>
+              <w:t xml:space="preserve">0.827 p.u. / 1.5 s</w:t>
             </w:r>
           </w:p>
         </w:tc>
@@ -6395,7 +6395,7 @@
                 <w:sz w:val="18"/>
                 <w:szCs w:val="18"/>
               </w:rPr>
-              <w:t xml:space="preserve">Frequency deviation (b)</w:t>
+              <w:t xml:space="preserve">Frequency deviation (a), 39-bus</w:t>
             </w:r>
           </w:p>
         </w:tc>
@@ -6425,7 +6425,7 @@
                 <w:sz w:val="18"/>
                 <w:szCs w:val="18"/>
               </w:rPr>
-              <w:t xml:space="preserve">9 / 39 / 118-bus, CNN-LSTM + SVC</w:t>
+              <w:t xml:space="preserve">No control / PI-AGC</w:t>
             </w:r>
           </w:p>
         </w:tc>
@@ -6485,7 +6485,7 @@
                 <w:sz w:val="18"/>
                 <w:szCs w:val="18"/>
               </w:rPr>
-              <w:t xml:space="preserve">−0.57 / −0.67 / −0.75 Hz</w:t>
+              <w:t xml:space="preserve">−1.70 / −0.90 Hz</w:t>
             </w:r>
           </w:p>
         </w:tc>
@@ -6547,7 +6547,7 @@
                 <w:sz w:val="18"/>
                 <w:szCs w:val="18"/>
               </w:rPr>
-              <w:t xml:space="preserve">9 / 39 / 118-bus, second dip</w:t>
+              <w:t xml:space="preserve">CNN-LSTM + SVC</w:t>
             </w:r>
           </w:p>
         </w:tc>
@@ -6577,7 +6577,7 @@
                 <w:sz w:val="18"/>
                 <w:szCs w:val="18"/>
               </w:rPr>
-              <w:t xml:space="preserve">No control → CNN-LSTM</w:t>
+              <w:t xml:space="preserve">Δf nadir</w:t>
             </w:r>
           </w:p>
         </w:tc>
@@ -6607,7 +6607,7 @@
                 <w:sz w:val="18"/>
                 <w:szCs w:val="18"/>
               </w:rPr>
-              <w:t xml:space="preserve">−0.27/−0.31/−0.35 → ≈ −0.04 Hz</w:t>
+              <w:t xml:space="preserve">−1.70 Hz (before action)</w:t>
             </w:r>
           </w:p>
         </w:tc>
@@ -6639,7 +6639,7 @@
                 <w:sz w:val="18"/>
                 <w:szCs w:val="18"/>
               </w:rPr>
-              <w:t xml:space="preserve">Frequency and ROCOF (UFLS)</w:t>
+              <w:t xml:space="preserve">Frequency deviation (b)</w:t>
             </w:r>
           </w:p>
         </w:tc>
@@ -6669,7 +6669,7 @@
                 <w:sz w:val="18"/>
                 <w:szCs w:val="18"/>
               </w:rPr>
-              <w:t xml:space="preserve">NC</w:t>
+              <w:t xml:space="preserve">9 / 39 / 118-bus, CNN-LSTM + SVC</w:t>
             </w:r>
           </w:p>
         </w:tc>
@@ -6699,7 +6699,7 @@
                 <w:sz w:val="18"/>
                 <w:szCs w:val="18"/>
               </w:rPr>
-              <w:t xml:space="preserve">Nadir / UFLS / |ROCOF|max</w:t>
+              <w:t xml:space="preserve">Δf nadir</w:t>
             </w:r>
           </w:p>
         </w:tc>
@@ -6729,7 +6729,7 @@
                 <w:sz w:val="18"/>
                 <w:szCs w:val="18"/>
               </w:rPr>
-              <w:t xml:space="preserve">48.02 Hz / stages 1+2 / 2.48 Hz/s</w:t>
+              <w:t xml:space="preserve">−0.57 / −0.67 / −0.75 Hz</w:t>
             </w:r>
           </w:p>
         </w:tc>
@@ -6791,7 +6791,7 @@
                 <w:sz w:val="18"/>
                 <w:szCs w:val="18"/>
               </w:rPr>
-              <w:t xml:space="preserve">CC/PI-AGC</w:t>
+              <w:t xml:space="preserve">9 / 39 / 118-bus, second dip</w:t>
             </w:r>
           </w:p>
         </w:tc>
@@ -6821,7 +6821,7 @@
                 <w:sz w:val="18"/>
                 <w:szCs w:val="18"/>
               </w:rPr>
-              <w:t xml:space="preserve">Nadir / UFLS / |ROCOF|max</w:t>
+              <w:t xml:space="preserve">No control → CNN-LSTM</w:t>
             </w:r>
           </w:p>
         </w:tc>
@@ -6851,7 +6851,7 @@
                 <w:sz w:val="18"/>
                 <w:szCs w:val="18"/>
               </w:rPr>
-              <w:t xml:space="preserve">48.22 Hz / stages 1+2 / 2.45 Hz/s</w:t>
+              <w:t xml:space="preserve">−0.27/−0.31/−0.35 → ≈ −0.04 Hz</w:t>
             </w:r>
           </w:p>
         </w:tc>
@@ -6883,7 +6883,7 @@
                 <w:sz w:val="18"/>
                 <w:szCs w:val="18"/>
               </w:rPr>
-              <w:t xml:space="preserve"/>
+              <w:t xml:space="preserve">Frequency and ROCOF (UFLS)</w:t>
             </w:r>
           </w:p>
         </w:tc>
@@ -6913,32 +6913,7 @@
                 <w:sz w:val="18"/>
                 <w:szCs w:val="18"/>
               </w:rPr>
-              <w:t xml:space="preserve">PF, </w:t>
-            </w:r>
-            <w:r>
-              <w:rPr>
-                <w:rFonts w:ascii="Times New Roman" w:cs="Times New Roman" w:eastAsia="Times New Roman" w:hAnsi="Times New Roman"/>
-                <w:sz w:val="18"/>
-                <w:szCs w:val="18"/>
-              </w:rPr>
-              <w:t xml:space="preserve">T</w:t>
-            </w:r>
-            <w:r>
-              <w:rPr>
-                <w:rFonts w:ascii="Times New Roman" w:cs="Times New Roman" w:eastAsia="Times New Roman" w:hAnsi="Times New Roman"/>
-                <w:sz w:val="18"/>
-                <w:szCs w:val="18"/>
-                <w:vertAlign w:val="subscript"/>
-              </w:rPr>
-              <w:t xml:space="preserve">comm</w:t>
-            </w:r>
-            <w:r>
-              <w:rPr>
-                <w:rFonts w:ascii="Times New Roman" w:cs="Times New Roman" w:eastAsia="Times New Roman" w:hAnsi="Times New Roman"/>
-                <w:sz w:val="18"/>
-                <w:szCs w:val="18"/>
-              </w:rPr>
-              <w:t xml:space="preserve">=0</w:t>
+              <w:t xml:space="preserve">NC</w:t>
             </w:r>
           </w:p>
         </w:tc>
@@ -6998,7 +6973,7 @@
                 <w:sz w:val="18"/>
                 <w:szCs w:val="18"/>
               </w:rPr>
-              <w:t xml:space="preserve">48.28 Hz / stages 1+2 / 2.48 Hz/s</w:t>
+              <w:t xml:space="preserve">48.02 Hz / stages 1+2 / 2.48 Hz/s</w:t>
             </w:r>
           </w:p>
         </w:tc>
@@ -7060,32 +7035,7 @@
                 <w:sz w:val="18"/>
                 <w:szCs w:val="18"/>
               </w:rPr>
-              <w:t xml:space="preserve">PF, </w:t>
-            </w:r>
-            <w:r>
-              <w:rPr>
-                <w:rFonts w:ascii="Times New Roman" w:cs="Times New Roman" w:eastAsia="Times New Roman" w:hAnsi="Times New Roman"/>
-                <w:sz w:val="18"/>
-                <w:szCs w:val="18"/>
-              </w:rPr>
-              <w:t xml:space="preserve">T</w:t>
-            </w:r>
-            <w:r>
-              <w:rPr>
-                <w:rFonts w:ascii="Times New Roman" w:cs="Times New Roman" w:eastAsia="Times New Roman" w:hAnsi="Times New Roman"/>
-                <w:sz w:val="18"/>
-                <w:szCs w:val="18"/>
-                <w:vertAlign w:val="subscript"/>
-              </w:rPr>
-              <w:t xml:space="preserve">comm</w:t>
-            </w:r>
-            <w:r>
-              <w:rPr>
-                <w:rFonts w:ascii="Times New Roman" w:cs="Times New Roman" w:eastAsia="Times New Roman" w:hAnsi="Times New Roman"/>
-                <w:sz w:val="18"/>
-                <w:szCs w:val="18"/>
-              </w:rPr>
-              <w:t xml:space="preserve">=200 ms</w:t>
+              <w:t xml:space="preserve">CC/PI-AGC</w:t>
             </w:r>
           </w:p>
         </w:tc>
@@ -7145,7 +7095,7 @@
                 <w:sz w:val="18"/>
                 <w:szCs w:val="18"/>
               </w:rPr>
-              <w:t xml:space="preserve">48.09 Hz / stages 1+2 / 2.48 Hz/s</w:t>
+              <w:t xml:space="preserve">48.22 Hz / stages 1+2 / 2.45 Hz/s</w:t>
             </w:r>
           </w:p>
         </w:tc>
@@ -7207,7 +7157,32 @@
                 <w:sz w:val="18"/>
                 <w:szCs w:val="18"/>
               </w:rPr>
-              <w:t xml:space="preserve">All cases</w:t>
+              <w:t xml:space="preserve">PF, </w:t>
+            </w:r>
+            <w:r>
+              <w:rPr>
+                <w:rFonts w:ascii="Times New Roman" w:cs="Times New Roman" w:eastAsia="Times New Roman" w:hAnsi="Times New Roman"/>
+                <w:sz w:val="18"/>
+                <w:szCs w:val="18"/>
+              </w:rPr>
+              <w:t xml:space="preserve">T</w:t>
+            </w:r>
+            <w:r>
+              <w:rPr>
+                <w:rFonts w:ascii="Times New Roman" w:cs="Times New Roman" w:eastAsia="Times New Roman" w:hAnsi="Times New Roman"/>
+                <w:sz w:val="18"/>
+                <w:szCs w:val="18"/>
+                <w:vertAlign w:val="subscript"/>
+              </w:rPr>
+              <w:t xml:space="preserve">comm</w:t>
+            </w:r>
+            <w:r>
+              <w:rPr>
+                <w:rFonts w:ascii="Times New Roman" w:cs="Times New Roman" w:eastAsia="Times New Roman" w:hAnsi="Times New Roman"/>
+                <w:sz w:val="18"/>
+                <w:szCs w:val="18"/>
+              </w:rPr>
+              <w:t xml:space="preserve">=0</w:t>
             </w:r>
           </w:p>
         </w:tc>
@@ -7237,7 +7212,7 @@
                 <w:sz w:val="18"/>
                 <w:szCs w:val="18"/>
               </w:rPr>
-              <w:t xml:space="preserve">UFLS-1 / UFLS-2 pickup (NC)</w:t>
+              <w:t xml:space="preserve">Nadir / UFLS / |ROCOF|max</w:t>
             </w:r>
           </w:p>
         </w:tc>
@@ -7267,7 +7242,7 @@
                 <w:sz w:val="18"/>
                 <w:szCs w:val="18"/>
               </w:rPr>
-              <w:t xml:space="preserve">0.92 s / 1.13 s (before SVC action)</w:t>
+              <w:t xml:space="preserve">48.28 Hz / stages 1+2 / 2.48 Hz/s</w:t>
             </w:r>
           </w:p>
         </w:tc>
@@ -7299,7 +7274,7 @@
                 <w:sz w:val="18"/>
                 <w:szCs w:val="18"/>
               </w:rPr>
-              <w:t xml:space="preserve">Generator and BESS power</w:t>
+              <w:t xml:space="preserve"/>
             </w:r>
           </w:p>
         </w:tc>
@@ -7329,7 +7304,32 @@
                 <w:sz w:val="18"/>
                 <w:szCs w:val="18"/>
               </w:rPr>
-              <w:t xml:space="preserve">BESS Bus 3 / Bus 29</w:t>
+              <w:t xml:space="preserve">PF, </w:t>
+            </w:r>
+            <w:r>
+              <w:rPr>
+                <w:rFonts w:ascii="Times New Roman" w:cs="Times New Roman" w:eastAsia="Times New Roman" w:hAnsi="Times New Roman"/>
+                <w:sz w:val="18"/>
+                <w:szCs w:val="18"/>
+              </w:rPr>
+              <w:t xml:space="preserve">T</w:t>
+            </w:r>
+            <w:r>
+              <w:rPr>
+                <w:rFonts w:ascii="Times New Roman" w:cs="Times New Roman" w:eastAsia="Times New Roman" w:hAnsi="Times New Roman"/>
+                <w:sz w:val="18"/>
+                <w:szCs w:val="18"/>
+                <w:vertAlign w:val="subscript"/>
+              </w:rPr>
+              <w:t xml:space="preserve">comm</w:t>
+            </w:r>
+            <w:r>
+              <w:rPr>
+                <w:rFonts w:ascii="Times New Roman" w:cs="Times New Roman" w:eastAsia="Times New Roman" w:hAnsi="Times New Roman"/>
+                <w:sz w:val="18"/>
+                <w:szCs w:val="18"/>
+              </w:rPr>
+              <w:t xml:space="preserve">=200 ms</w:t>
             </w:r>
           </w:p>
         </w:tc>
@@ -7359,7 +7359,7 @@
                 <w:sz w:val="18"/>
                 <w:szCs w:val="18"/>
               </w:rPr>
-              <w:t xml:space="preserve">Full output reached</w:t>
+              <w:t xml:space="preserve">Nadir / UFLS / |ROCOF|max</w:t>
             </w:r>
           </w:p>
         </w:tc>
@@ -7389,7 +7389,7 @@
                 <w:sz w:val="18"/>
                 <w:szCs w:val="18"/>
               </w:rPr>
-              <w:t xml:space="preserve">1.219 s / 1.331 s</w:t>
+              <w:t xml:space="preserve">48.09 Hz / stages 1+2 / 2.48 Hz/s</w:t>
             </w:r>
           </w:p>
         </w:tc>
@@ -7451,7 +7451,7 @@
                 <w:sz w:val="18"/>
                 <w:szCs w:val="18"/>
               </w:rPr>
-              <w:t xml:space="preserve">BESS total</w:t>
+              <w:t xml:space="preserve">All cases</w:t>
             </w:r>
           </w:p>
         </w:tc>
@@ -7481,7 +7481,7 @@
                 <w:sz w:val="18"/>
                 <w:szCs w:val="18"/>
               </w:rPr>
-              <w:t xml:space="preserve">Delivered in first-swing window (0.50–0.70 s)</w:t>
+              <w:t xml:space="preserve">UFLS-1 / UFLS-2 pickup (NC)</w:t>
             </w:r>
           </w:p>
         </w:tc>
@@ -7511,7 +7511,7 @@
                 <w:sz w:val="18"/>
                 <w:szCs w:val="18"/>
               </w:rPr>
-              <w:t xml:space="preserve">0 MW</w:t>
+              <w:t xml:space="preserve">0.92 s / 1.13 s (before SVC action)</w:t>
             </w:r>
           </w:p>
         </w:tc>
@@ -7543,7 +7543,7 @@
                 <w:sz w:val="18"/>
                 <w:szCs w:val="18"/>
               </w:rPr>
-              <w:t xml:space="preserve">G10 NC / CC / PF</w:t>
+              <w:t xml:space="preserve">Generator and BESS power</w:t>
             </w:r>
           </w:p>
         </w:tc>
@@ -7573,7 +7573,7 @@
                 <w:sz w:val="18"/>
                 <w:szCs w:val="18"/>
               </w:rPr>
-              <w:t xml:space="preserve">NC</w:t>
+              <w:t xml:space="preserve">BESS Bus 3 / Bus 29</w:t>
             </w:r>
           </w:p>
         </w:tc>
@@ -7603,7 +7603,7 @@
                 <w:sz w:val="18"/>
                 <w:szCs w:val="18"/>
               </w:rPr>
-              <w:t xml:space="preserve">Loss of synchronism</w:t>
+              <w:t xml:space="preserve">Full output reached</w:t>
             </w:r>
           </w:p>
         </w:tc>
@@ -7633,7 +7633,7 @@
                 <w:sz w:val="18"/>
                 <w:szCs w:val="18"/>
               </w:rPr>
-              <w:t xml:space="preserve">1.44 s</w:t>
+              <w:t xml:space="preserve">1.219 s / 1.331 s</w:t>
             </w:r>
           </w:p>
         </w:tc>
@@ -7695,7 +7695,7 @@
                 <w:sz w:val="18"/>
                 <w:szCs w:val="18"/>
               </w:rPr>
-              <w:t xml:space="preserve">CC</w:t>
+              <w:t xml:space="preserve">BESS total</w:t>
             </w:r>
           </w:p>
         </w:tc>
@@ -7725,7 +7725,7 @@
                 <w:sz w:val="18"/>
                 <w:szCs w:val="18"/>
               </w:rPr>
-              <w:t xml:space="preserve">Loss of synchronism</w:t>
+              <w:t xml:space="preserve">Delivered in first-swing window (0.50–0.70 s)</w:t>
             </w:r>
           </w:p>
         </w:tc>
@@ -7755,7 +7755,7 @@
                 <w:sz w:val="18"/>
                 <w:szCs w:val="18"/>
               </w:rPr>
-              <w:t xml:space="preserve">1.68 s</w:t>
+              <w:t xml:space="preserve">0 MW</w:t>
             </w:r>
           </w:p>
         </w:tc>
@@ -7787,7 +7787,7 @@
                 <w:sz w:val="18"/>
                 <w:szCs w:val="18"/>
               </w:rPr>
-              <w:t xml:space="preserve"/>
+              <w:t xml:space="preserve">G10 NC / CC / PF</w:t>
             </w:r>
           </w:p>
         </w:tc>
@@ -7817,32 +7817,7 @@
                 <w:sz w:val="18"/>
                 <w:szCs w:val="18"/>
               </w:rPr>
-              <w:t xml:space="preserve">PF, </w:t>
-            </w:r>
-            <w:r>
-              <w:rPr>
-                <w:rFonts w:ascii="Times New Roman" w:cs="Times New Roman" w:eastAsia="Times New Roman" w:hAnsi="Times New Roman"/>
-                <w:sz w:val="18"/>
-                <w:szCs w:val="18"/>
-              </w:rPr>
-              <w:t xml:space="preserve">T</w:t>
-            </w:r>
-            <w:r>
-              <w:rPr>
-                <w:rFonts w:ascii="Times New Roman" w:cs="Times New Roman" w:eastAsia="Times New Roman" w:hAnsi="Times New Roman"/>
-                <w:sz w:val="18"/>
-                <w:szCs w:val="18"/>
-                <w:vertAlign w:val="subscript"/>
-              </w:rPr>
-              <w:t xml:space="preserve">comm</w:t>
-            </w:r>
-            <w:r>
-              <w:rPr>
-                <w:rFonts w:ascii="Times New Roman" w:cs="Times New Roman" w:eastAsia="Times New Roman" w:hAnsi="Times New Roman"/>
-                <w:sz w:val="18"/>
-                <w:szCs w:val="18"/>
-              </w:rPr>
-              <w:t xml:space="preserve">=0</w:t>
+              <w:t xml:space="preserve">NC</w:t>
             </w:r>
           </w:p>
         </w:tc>
@@ -7872,7 +7847,7 @@
                 <w:sz w:val="18"/>
                 <w:szCs w:val="18"/>
               </w:rPr>
-              <w:t xml:space="preserve">Peak δ</w:t>
+              <w:t xml:space="preserve">Loss of synchronism</w:t>
             </w:r>
           </w:p>
         </w:tc>
@@ -7902,7 +7877,7 @@
                 <w:sz w:val="18"/>
                 <w:szCs w:val="18"/>
               </w:rPr>
-              <w:t xml:space="preserve">51.6°</w:t>
+              <w:t xml:space="preserve">1.47 s</w:t>
             </w:r>
           </w:p>
         </w:tc>
@@ -7964,32 +7939,7 @@
                 <w:sz w:val="18"/>
                 <w:szCs w:val="18"/>
               </w:rPr>
-              <w:t xml:space="preserve">PF, </w:t>
-            </w:r>
-            <w:r>
-              <w:rPr>
-                <w:rFonts w:ascii="Times New Roman" w:cs="Times New Roman" w:eastAsia="Times New Roman" w:hAnsi="Times New Roman"/>
-                <w:sz w:val="18"/>
-                <w:szCs w:val="18"/>
-              </w:rPr>
-              <w:t xml:space="preserve">T</w:t>
-            </w:r>
-            <w:r>
-              <w:rPr>
-                <w:rFonts w:ascii="Times New Roman" w:cs="Times New Roman" w:eastAsia="Times New Roman" w:hAnsi="Times New Roman"/>
-                <w:sz w:val="18"/>
-                <w:szCs w:val="18"/>
-                <w:vertAlign w:val="subscript"/>
-              </w:rPr>
-              <w:t xml:space="preserve">comm</w:t>
-            </w:r>
-            <w:r>
-              <w:rPr>
-                <w:rFonts w:ascii="Times New Roman" w:cs="Times New Roman" w:eastAsia="Times New Roman" w:hAnsi="Times New Roman"/>
-                <w:sz w:val="18"/>
-                <w:szCs w:val="18"/>
-              </w:rPr>
-              <w:t xml:space="preserve">=200 ms</w:t>
+              <w:t xml:space="preserve">CC</w:t>
             </w:r>
           </w:p>
         </w:tc>
@@ -8019,7 +7969,7 @@
                 <w:sz w:val="18"/>
                 <w:szCs w:val="18"/>
               </w:rPr>
-              <w:t xml:space="preserve">Peak δ</w:t>
+              <w:t xml:space="preserve">Loss of synchronism</w:t>
             </w:r>
           </w:p>
         </w:tc>
@@ -8049,7 +7999,7 @@
                 <w:sz w:val="18"/>
                 <w:szCs w:val="18"/>
               </w:rPr>
-              <w:t xml:space="preserve">79.5°</w:t>
+              <w:t xml:space="preserve">1.60 s</w:t>
             </w:r>
           </w:p>
         </w:tc>
@@ -8081,7 +8031,7 @@
                 <w:sz w:val="18"/>
                 <w:szCs w:val="18"/>
               </w:rPr>
-              <w:t xml:space="preserve">STATCOM saturation</w:t>
+              <w:t xml:space="preserve"/>
             </w:r>
           </w:p>
         </w:tc>
@@ -8111,7 +8061,32 @@
                 <w:sz w:val="18"/>
                 <w:szCs w:val="18"/>
               </w:rPr>
-              <w:t xml:space="preserve">Case T alone (140 Mvar)</w:t>
+              <w:t xml:space="preserve">PF, </w:t>
+            </w:r>
+            <w:r>
+              <w:rPr>
+                <w:rFonts w:ascii="Times New Roman" w:cs="Times New Roman" w:eastAsia="Times New Roman" w:hAnsi="Times New Roman"/>
+                <w:sz w:val="18"/>
+                <w:szCs w:val="18"/>
+              </w:rPr>
+              <w:t xml:space="preserve">T</w:t>
+            </w:r>
+            <w:r>
+              <w:rPr>
+                <w:rFonts w:ascii="Times New Roman" w:cs="Times New Roman" w:eastAsia="Times New Roman" w:hAnsi="Times New Roman"/>
+                <w:sz w:val="18"/>
+                <w:szCs w:val="18"/>
+                <w:vertAlign w:val="subscript"/>
+              </w:rPr>
+              <w:t xml:space="preserve">comm</w:t>
+            </w:r>
+            <w:r>
+              <w:rPr>
+                <w:rFonts w:ascii="Times New Roman" w:cs="Times New Roman" w:eastAsia="Times New Roman" w:hAnsi="Times New Roman"/>
+                <w:sz w:val="18"/>
+                <w:szCs w:val="18"/>
+              </w:rPr>
+              <w:t xml:space="preserve">=0</w:t>
             </w:r>
           </w:p>
         </w:tc>
@@ -8141,7 +8116,7 @@
                 <w:sz w:val="18"/>
                 <w:szCs w:val="18"/>
               </w:rPr>
-              <w:t xml:space="preserve">Peak δ / margin</w:t>
+              <w:t xml:space="preserve">Peak δ</w:t>
             </w:r>
           </w:p>
         </w:tc>
@@ -8171,7 +8146,7 @@
                 <w:sz w:val="18"/>
                 <w:szCs w:val="18"/>
               </w:rPr>
-              <w:t xml:space="preserve">64.9° / 115°</w:t>
+              <w:t xml:space="preserve">64.1°</w:t>
             </w:r>
           </w:p>
         </w:tc>
@@ -8233,7 +8208,32 @@
                 <w:sz w:val="18"/>
                 <w:szCs w:val="18"/>
               </w:rPr>
-              <w:t xml:space="preserve">Combined (205 Mvar demand, capped 150)</w:t>
+              <w:t xml:space="preserve">PF, </w:t>
+            </w:r>
+            <w:r>
+              <w:rPr>
+                <w:rFonts w:ascii="Times New Roman" w:cs="Times New Roman" w:eastAsia="Times New Roman" w:hAnsi="Times New Roman"/>
+                <w:sz w:val="18"/>
+                <w:szCs w:val="18"/>
+              </w:rPr>
+              <w:t xml:space="preserve">T</w:t>
+            </w:r>
+            <w:r>
+              <w:rPr>
+                <w:rFonts w:ascii="Times New Roman" w:cs="Times New Roman" w:eastAsia="Times New Roman" w:hAnsi="Times New Roman"/>
+                <w:sz w:val="18"/>
+                <w:szCs w:val="18"/>
+                <w:vertAlign w:val="subscript"/>
+              </w:rPr>
+              <w:t xml:space="preserve">comm</w:t>
+            </w:r>
+            <w:r>
+              <w:rPr>
+                <w:rFonts w:ascii="Times New Roman" w:cs="Times New Roman" w:eastAsia="Times New Roman" w:hAnsi="Times New Roman"/>
+                <w:sz w:val="18"/>
+                <w:szCs w:val="18"/>
+              </w:rPr>
+              <w:t xml:space="preserve">=200 ms</w:t>
             </w:r>
           </w:p>
         </w:tc>
@@ -8263,7 +8263,7 @@
                 <w:sz w:val="18"/>
                 <w:szCs w:val="18"/>
               </w:rPr>
-              <w:t xml:space="preserve">Peak δ / margin</w:t>
+              <w:t xml:space="preserve">Peak δ</w:t>
             </w:r>
           </w:p>
         </w:tc>
@@ -8293,7 +8293,7 @@
                 <w:sz w:val="18"/>
                 <w:szCs w:val="18"/>
               </w:rPr>
-              <w:t xml:space="preserve">81.2° / 99°</w:t>
+              <w:t xml:space="preserve">90.6°</w:t>
             </w:r>
           </w:p>
         </w:tc>
@@ -8325,7 +8325,7 @@
                 <w:sz w:val="18"/>
                 <w:szCs w:val="18"/>
               </w:rPr>
-              <w:t xml:space="preserve"/>
+              <w:t xml:space="preserve">STATCOM saturation</w:t>
             </w:r>
           </w:p>
         </w:tc>
@@ -8355,7 +8355,7 @@
                 <w:sz w:val="18"/>
                 <w:szCs w:val="18"/>
               </w:rPr>
-              <w:t xml:space="preserve">Combined</w:t>
+              <w:t xml:space="preserve">Case T alone (140 Mvar)</w:t>
             </w:r>
           </w:p>
         </w:tc>
@@ -8385,7 +8385,7 @@
                 <w:sz w:val="18"/>
                 <w:szCs w:val="18"/>
               </w:rPr>
-              <w:t xml:space="preserve">Saturation window</w:t>
+              <w:t xml:space="preserve">Peak δ / margin</w:t>
             </w:r>
           </w:p>
         </w:tc>
@@ -8415,7 +8415,7 @@
                 <w:sz w:val="18"/>
                 <w:szCs w:val="18"/>
               </w:rPr>
-              <w:t xml:space="preserve">0.809–1.59 s</w:t>
+              <w:t xml:space="preserve">64.1° / 116°</w:t>
             </w:r>
           </w:p>
         </w:tc>
@@ -8427,6 +8427,250 @@
             <w:tcBorders>
               <w:top w:val="none" w:color="FFFFFF" w:sz="0"/>
               <w:left w:val="none" w:color="FFFFFF" w:sz="0"/>
+              <w:bottom w:val="none" w:color="FFFFFF" w:sz="0"/>
+              <w:right w:val="none" w:color="FFFFFF" w:sz="0"/>
+            </w:tcBorders>
+            <w:tcMar>
+              <w:top w:type="dxa" w:w="50"/>
+              <w:left w:type="dxa" w:w="90"/>
+              <w:bottom w:type="dxa" w:w="50"/>
+              <w:right w:type="dxa" w:w="90"/>
+            </w:tcMar>
+          </w:tcPr>
+          <w:p>
+            <w:pPr>
+              <w:jc w:val="left"/>
+            </w:pPr>
+            <w:r>
+              <w:rPr>
+                <w:rFonts w:ascii="Times New Roman" w:cs="Times New Roman" w:eastAsia="Times New Roman" w:hAnsi="Times New Roman"/>
+                <w:sz w:val="18"/>
+                <w:szCs w:val="18"/>
+              </w:rPr>
+              <w:t xml:space="preserve"/>
+            </w:r>
+          </w:p>
+        </w:tc>
+        <w:tc>
+          <w:tcPr>
+            <w:tcW w:type="dxa" w:w="3000"/>
+            <w:tcBorders>
+              <w:top w:val="none" w:color="FFFFFF" w:sz="0"/>
+              <w:left w:val="none" w:color="FFFFFF" w:sz="0"/>
+              <w:bottom w:val="none" w:color="FFFFFF" w:sz="0"/>
+              <w:right w:val="none" w:color="FFFFFF" w:sz="0"/>
+            </w:tcBorders>
+            <w:tcMar>
+              <w:top w:type="dxa" w:w="50"/>
+              <w:left w:type="dxa" w:w="90"/>
+              <w:bottom w:type="dxa" w:w="50"/>
+              <w:right w:type="dxa" w:w="90"/>
+            </w:tcMar>
+          </w:tcPr>
+          <w:p>
+            <w:pPr>
+              <w:jc w:val="center"/>
+            </w:pPr>
+            <w:r>
+              <w:rPr>
+                <w:rFonts w:ascii="Times New Roman" w:cs="Times New Roman" w:eastAsia="Times New Roman" w:hAnsi="Times New Roman"/>
+                <w:sz w:val="18"/>
+                <w:szCs w:val="18"/>
+              </w:rPr>
+              <w:t xml:space="preserve">Combined (170 Mvar demand, capped 150)</w:t>
+            </w:r>
+          </w:p>
+        </w:tc>
+        <w:tc>
+          <w:tcPr>
+            <w:tcW w:type="dxa" w:w="2000"/>
+            <w:tcBorders>
+              <w:top w:val="none" w:color="FFFFFF" w:sz="0"/>
+              <w:left w:val="none" w:color="FFFFFF" w:sz="0"/>
+              <w:bottom w:val="none" w:color="FFFFFF" w:sz="0"/>
+              <w:right w:val="none" w:color="FFFFFF" w:sz="0"/>
+            </w:tcBorders>
+            <w:tcMar>
+              <w:top w:type="dxa" w:w="50"/>
+              <w:left w:type="dxa" w:w="90"/>
+              <w:bottom w:type="dxa" w:w="50"/>
+              <w:right w:type="dxa" w:w="90"/>
+            </w:tcMar>
+          </w:tcPr>
+          <w:p>
+            <w:pPr>
+              <w:jc w:val="center"/>
+            </w:pPr>
+            <w:r>
+              <w:rPr>
+                <w:rFonts w:ascii="Times New Roman" w:cs="Times New Roman" w:eastAsia="Times New Roman" w:hAnsi="Times New Roman"/>
+                <w:sz w:val="18"/>
+                <w:szCs w:val="18"/>
+              </w:rPr>
+              <w:t xml:space="preserve">Peak δ / margin</w:t>
+            </w:r>
+          </w:p>
+        </w:tc>
+        <w:tc>
+          <w:tcPr>
+            <w:tcW w:type="dxa" w:w="2060"/>
+            <w:tcBorders>
+              <w:top w:val="none" w:color="FFFFFF" w:sz="0"/>
+              <w:left w:val="none" w:color="FFFFFF" w:sz="0"/>
+              <w:bottom w:val="none" w:color="FFFFFF" w:sz="0"/>
+              <w:right w:val="none" w:color="FFFFFF" w:sz="0"/>
+            </w:tcBorders>
+            <w:tcMar>
+              <w:top w:type="dxa" w:w="50"/>
+              <w:left w:type="dxa" w:w="90"/>
+              <w:bottom w:type="dxa" w:w="50"/>
+              <w:right w:type="dxa" w:w="90"/>
+            </w:tcMar>
+          </w:tcPr>
+          <w:p>
+            <w:pPr>
+              <w:jc w:val="center"/>
+            </w:pPr>
+            <w:r>
+              <w:rPr>
+                <w:rFonts w:ascii="Times New Roman" w:cs="Times New Roman" w:eastAsia="Times New Roman" w:hAnsi="Times New Roman"/>
+                <w:sz w:val="18"/>
+                <w:szCs w:val="18"/>
+              </w:rPr>
+              <w:t xml:space="preserve">73.2° / 107°</w:t>
+            </w:r>
+          </w:p>
+        </w:tc>
+      </w:tr>
+      <w:tr>
+        <w:tc>
+          <w:tcPr>
+            <w:tcW w:type="dxa" w:w="2300"/>
+            <w:tcBorders>
+              <w:top w:val="none" w:color="FFFFFF" w:sz="0"/>
+              <w:left w:val="none" w:color="FFFFFF" w:sz="0"/>
+              <w:bottom w:val="none" w:color="FFFFFF" w:sz="0"/>
+              <w:right w:val="none" w:color="FFFFFF" w:sz="0"/>
+            </w:tcBorders>
+            <w:tcMar>
+              <w:top w:type="dxa" w:w="50"/>
+              <w:left w:type="dxa" w:w="90"/>
+              <w:bottom w:type="dxa" w:w="50"/>
+              <w:right w:type="dxa" w:w="90"/>
+            </w:tcMar>
+          </w:tcPr>
+          <w:p>
+            <w:pPr>
+              <w:jc w:val="left"/>
+            </w:pPr>
+            <w:r>
+              <w:rPr>
+                <w:rFonts w:ascii="Times New Roman" w:cs="Times New Roman" w:eastAsia="Times New Roman" w:hAnsi="Times New Roman"/>
+                <w:sz w:val="18"/>
+                <w:szCs w:val="18"/>
+              </w:rPr>
+              <w:t xml:space="preserve"/>
+            </w:r>
+          </w:p>
+        </w:tc>
+        <w:tc>
+          <w:tcPr>
+            <w:tcW w:type="dxa" w:w="3000"/>
+            <w:tcBorders>
+              <w:top w:val="none" w:color="FFFFFF" w:sz="0"/>
+              <w:left w:val="none" w:color="FFFFFF" w:sz="0"/>
+              <w:bottom w:val="none" w:color="FFFFFF" w:sz="0"/>
+              <w:right w:val="none" w:color="FFFFFF" w:sz="0"/>
+            </w:tcBorders>
+            <w:tcMar>
+              <w:top w:type="dxa" w:w="50"/>
+              <w:left w:type="dxa" w:w="90"/>
+              <w:bottom w:type="dxa" w:w="50"/>
+              <w:right w:type="dxa" w:w="90"/>
+            </w:tcMar>
+          </w:tcPr>
+          <w:p>
+            <w:pPr>
+              <w:jc w:val="center"/>
+            </w:pPr>
+            <w:r>
+              <w:rPr>
+                <w:rFonts w:ascii="Times New Roman" w:cs="Times New Roman" w:eastAsia="Times New Roman" w:hAnsi="Times New Roman"/>
+                <w:sz w:val="18"/>
+                <w:szCs w:val="18"/>
+              </w:rPr>
+              <w:t xml:space="preserve">Combined</w:t>
+            </w:r>
+          </w:p>
+        </w:tc>
+        <w:tc>
+          <w:tcPr>
+            <w:tcW w:type="dxa" w:w="2000"/>
+            <w:tcBorders>
+              <w:top w:val="none" w:color="FFFFFF" w:sz="0"/>
+              <w:left w:val="none" w:color="FFFFFF" w:sz="0"/>
+              <w:bottom w:val="none" w:color="FFFFFF" w:sz="0"/>
+              <w:right w:val="none" w:color="FFFFFF" w:sz="0"/>
+            </w:tcBorders>
+            <w:tcMar>
+              <w:top w:type="dxa" w:w="50"/>
+              <w:left w:type="dxa" w:w="90"/>
+              <w:bottom w:type="dxa" w:w="50"/>
+              <w:right w:type="dxa" w:w="90"/>
+            </w:tcMar>
+          </w:tcPr>
+          <w:p>
+            <w:pPr>
+              <w:jc w:val="center"/>
+            </w:pPr>
+            <w:r>
+              <w:rPr>
+                <w:rFonts w:ascii="Times New Roman" w:cs="Times New Roman" w:eastAsia="Times New Roman" w:hAnsi="Times New Roman"/>
+                <w:sz w:val="18"/>
+                <w:szCs w:val="18"/>
+              </w:rPr>
+              <w:t xml:space="preserve">Saturation window</w:t>
+            </w:r>
+          </w:p>
+        </w:tc>
+        <w:tc>
+          <w:tcPr>
+            <w:tcW w:type="dxa" w:w="2060"/>
+            <w:tcBorders>
+              <w:top w:val="none" w:color="FFFFFF" w:sz="0"/>
+              <w:left w:val="none" w:color="FFFFFF" w:sz="0"/>
+              <w:bottom w:val="none" w:color="FFFFFF" w:sz="0"/>
+              <w:right w:val="none" w:color="FFFFFF" w:sz="0"/>
+            </w:tcBorders>
+            <w:tcMar>
+              <w:top w:type="dxa" w:w="50"/>
+              <w:left w:type="dxa" w:w="90"/>
+              <w:bottom w:type="dxa" w:w="50"/>
+              <w:right w:type="dxa" w:w="90"/>
+            </w:tcMar>
+          </w:tcPr>
+          <w:p>
+            <w:pPr>
+              <w:jc w:val="center"/>
+            </w:pPr>
+            <w:r>
+              <w:rPr>
+                <w:rFonts w:ascii="Times New Roman" w:cs="Times New Roman" w:eastAsia="Times New Roman" w:hAnsi="Times New Roman"/>
+                <w:sz w:val="18"/>
+                <w:szCs w:val="18"/>
+              </w:rPr>
+              <w:t xml:space="preserve">0.640–3.23 s</w:t>
+            </w:r>
+          </w:p>
+        </w:tc>
+      </w:tr>
+      <w:tr>
+        <w:tc>
+          <w:tcPr>
+            <w:tcW w:type="dxa" w:w="2300"/>
+            <w:tcBorders>
+              <w:top w:val="none" w:color="FFFFFF" w:sz="0"/>
+              <w:left w:val="none" w:color="FFFFFF" w:sz="0"/>
               <w:bottom w:val="single" w:color="000000" w:sz="4"/>
               <w:right w:val="none" w:color="FFFFFF" w:sz="0"/>
             </w:tcBorders>
@@ -8477,7 +8721,7 @@
                 <w:sz w:val="18"/>
                 <w:szCs w:val="18"/>
               </w:rPr>
-              <w:t xml:space="preserve">No control</w:t>
+              <w:t xml:space="preserve">No control (combined)</w:t>
             </w:r>
           </w:p>
         </w:tc>
@@ -8537,7 +8781,7 @@
                 <w:sz w:val="18"/>
                 <w:szCs w:val="18"/>
               </w:rPr>
-              <w:t xml:space="preserve">1.70 s</w:t>
+              <w:t xml:space="preserve">1.33 s</w:t>
             </w:r>
           </w:p>
         </w:tc>
@@ -8880,7 +9124,7 @@
                 <w:sz w:val="18"/>
                 <w:szCs w:val="18"/>
               </w:rPr>
-              <w:t xml:space="preserve">52.9° (stable)</w:t>
+              <w:t xml:space="preserve">64.1° (stable)</w:t>
             </w:r>
           </w:p>
         </w:tc>
@@ -8940,7 +9184,7 @@
                 <w:sz w:val="18"/>
                 <w:szCs w:val="18"/>
               </w:rPr>
-              <w:t xml:space="preserve">97.1° (stable)</w:t>
+              <w:t xml:space="preserve">68.5° (stable)</w:t>
             </w:r>
           </w:p>
         </w:tc>
@@ -9032,7 +9276,7 @@
                 <w:sz w:val="18"/>
                 <w:szCs w:val="18"/>
               </w:rPr>
-              <w:t xml:space="preserve">66.2° (stable)</w:t>
+              <w:t xml:space="preserve">70.0° (stable)</w:t>
             </w:r>
           </w:p>
         </w:tc>
@@ -9092,7 +9336,7 @@
                 <w:sz w:val="18"/>
                 <w:szCs w:val="18"/>
               </w:rPr>
-              <w:t xml:space="preserve">116.4° (stable)</w:t>
+              <w:t xml:space="preserve">74.7° (stable)</w:t>
             </w:r>
           </w:p>
         </w:tc>
@@ -9184,7 +9428,7 @@
                 <w:sz w:val="18"/>
                 <w:szCs w:val="18"/>
               </w:rPr>
-              <w:t xml:space="preserve">81.8° (stable)</w:t>
+              <w:t xml:space="preserve">76.4° (stable)</w:t>
             </w:r>
           </w:p>
         </w:tc>
@@ -9244,7 +9488,7 @@
                 <w:sz w:val="18"/>
                 <w:szCs w:val="18"/>
               </w:rPr>
-              <w:t xml:space="preserve">136.2° (stable)</w:t>
+              <w:t xml:space="preserve">81.3° (stable)</w:t>
             </w:r>
           </w:p>
         </w:tc>
@@ -9336,7 +9580,7 @@
                 <w:sz w:val="18"/>
                 <w:szCs w:val="18"/>
               </w:rPr>
-              <w:t xml:space="preserve">99.3° (stable)</w:t>
+              <w:t xml:space="preserve">83.2° (stable)</w:t>
             </w:r>
           </w:p>
         </w:tc>
@@ -9396,7 +9640,7 @@
                 <w:sz w:val="18"/>
                 <w:szCs w:val="18"/>
               </w:rPr>
-              <w:t xml:space="preserve">156.1° (stable)</w:t>
+              <w:t xml:space="preserve">88.5° (stable)</w:t>
             </w:r>
           </w:p>
         </w:tc>
@@ -9488,7 +9732,7 @@
                 <w:sz w:val="18"/>
                 <w:szCs w:val="18"/>
               </w:rPr>
-              <w:t xml:space="preserve">117.4° (stable)</w:t>
+              <w:t xml:space="preserve">90.6° (stable)</w:t>
             </w:r>
           </w:p>
         </w:tc>
@@ -9548,7 +9792,7 @@
                 <w:sz w:val="18"/>
                 <w:szCs w:val="18"/>
               </w:rPr>
-              <w:t xml:space="preserve">Unstable</w:t>
+              <w:t xml:space="preserve">96.3° (stable)</w:t>
             </w:r>
           </w:p>
         </w:tc>
@@ -9640,7 +9884,7 @@
                 <w:sz w:val="18"/>
                 <w:szCs w:val="18"/>
               </w:rPr>
-              <w:t xml:space="preserve">135.3° (stable)</w:t>
+              <w:t xml:space="preserve">98.5° (stable)</w:t>
             </w:r>
           </w:p>
         </w:tc>
@@ -9700,7 +9944,7 @@
                 <w:sz w:val="18"/>
                 <w:szCs w:val="18"/>
               </w:rPr>
-              <w:t xml:space="preserve">Unstable</w:t>
+              <w:t xml:space="preserve">104.7° (stable)</w:t>
             </w:r>
           </w:p>
         </w:tc>
@@ -9792,7 +10036,7 @@
                 <w:sz w:val="18"/>
                 <w:szCs w:val="18"/>
               </w:rPr>
-              <w:t xml:space="preserve">152.0° (stable)</w:t>
+              <w:t xml:space="preserve">107.2° (stable)</w:t>
             </w:r>
           </w:p>
         </w:tc>
@@ -9852,7 +10096,7 @@
                 <w:sz w:val="18"/>
                 <w:szCs w:val="18"/>
               </w:rPr>
-              <w:t xml:space="preserve">Unstable</w:t>
+              <w:t xml:space="preserve">114.2° (stable)</w:t>
             </w:r>
           </w:p>
         </w:tc>
@@ -9944,7 +10188,7 @@
                 <w:sz w:val="18"/>
                 <w:szCs w:val="18"/>
               </w:rPr>
-              <w:t xml:space="preserve">Unstable</w:t>
+              <w:t xml:space="preserve">117.0° (stable)</w:t>
             </w:r>
           </w:p>
         </w:tc>
@@ -10004,7 +10248,7 @@
                 <w:sz w:val="18"/>
                 <w:szCs w:val="18"/>
               </w:rPr>
-              <w:t xml:space="preserve">Unstable</w:t>
+              <w:t xml:space="preserve">125.1° (stable)</w:t>
             </w:r>
           </w:p>
         </w:tc>
@@ -10016,6 +10260,310 @@
             <w:tcBorders>
               <w:top w:val="none" w:color="FFFFFF" w:sz="0"/>
               <w:left w:val="none" w:color="FFFFFF" w:sz="0"/>
+              <w:bottom w:val="none" w:color="FFFFFF" w:sz="0"/>
+              <w:right w:val="none" w:color="FFFFFF" w:sz="0"/>
+            </w:tcBorders>
+            <w:tcMar>
+              <w:top w:type="dxa" w:w="50"/>
+              <w:left w:type="dxa" w:w="90"/>
+              <w:bottom w:type="dxa" w:w="50"/>
+              <w:right w:type="dxa" w:w="90"/>
+            </w:tcMar>
+          </w:tcPr>
+          <w:p>
+            <w:pPr>
+              <w:jc w:val="left"/>
+            </w:pPr>
+            <w:r>
+              <w:rPr>
+                <w:rFonts w:ascii="Times New Roman" w:cs="Times New Roman" w:eastAsia="Times New Roman" w:hAnsi="Times New Roman"/>
+                <w:sz w:val="18"/>
+                <w:szCs w:val="18"/>
+              </w:rPr>
+              <w:t xml:space="preserve">400</w:t>
+            </w:r>
+          </w:p>
+        </w:tc>
+        <w:tc>
+          <w:tcPr>
+            <w:tcW w:type="dxa" w:w="2000"/>
+            <w:tcBorders>
+              <w:top w:val="none" w:color="FFFFFF" w:sz="0"/>
+              <w:left w:val="none" w:color="FFFFFF" w:sz="0"/>
+              <w:bottom w:val="none" w:color="FFFFFF" w:sz="0"/>
+              <w:right w:val="none" w:color="FFFFFF" w:sz="0"/>
+            </w:tcBorders>
+            <w:tcMar>
+              <w:top w:type="dxa" w:w="50"/>
+              <w:left w:type="dxa" w:w="90"/>
+              <w:bottom w:type="dxa" w:w="50"/>
+              <w:right w:type="dxa" w:w="90"/>
+            </w:tcMar>
+          </w:tcPr>
+          <w:p>
+            <w:pPr>
+              <w:jc w:val="center"/>
+            </w:pPr>
+            <w:r>
+              <w:rPr>
+                <w:rFonts w:ascii="Times New Roman" w:cs="Times New Roman" w:eastAsia="Times New Roman" w:hAnsi="Times New Roman"/>
+                <w:sz w:val="18"/>
+                <w:szCs w:val="18"/>
+              </w:rPr>
+              <w:t xml:space="preserve">1.049</w:t>
+            </w:r>
+          </w:p>
+        </w:tc>
+        <w:tc>
+          <w:tcPr>
+            <w:tcW w:type="dxa" w:w="2000"/>
+            <w:tcBorders>
+              <w:top w:val="none" w:color="FFFFFF" w:sz="0"/>
+              <w:left w:val="none" w:color="FFFFFF" w:sz="0"/>
+              <w:bottom w:val="none" w:color="FFFFFF" w:sz="0"/>
+              <w:right w:val="none" w:color="FFFFFF" w:sz="0"/>
+            </w:tcBorders>
+            <w:tcMar>
+              <w:top w:type="dxa" w:w="50"/>
+              <w:left w:type="dxa" w:w="90"/>
+              <w:bottom w:type="dxa" w:w="50"/>
+              <w:right w:type="dxa" w:w="90"/>
+            </w:tcMar>
+          </w:tcPr>
+          <w:p>
+            <w:pPr>
+              <w:jc w:val="center"/>
+            </w:pPr>
+            <w:r>
+              <w:rPr>
+                <w:rFonts w:ascii="Times New Roman" w:cs="Times New Roman" w:eastAsia="Times New Roman" w:hAnsi="Times New Roman"/>
+                <w:sz w:val="18"/>
+                <w:szCs w:val="18"/>
+              </w:rPr>
+              <w:t xml:space="preserve">128.5° (stable)</w:t>
+            </w:r>
+          </w:p>
+        </w:tc>
+        <w:tc>
+          <w:tcPr>
+            <w:tcW w:type="dxa" w:w="2000"/>
+            <w:tcBorders>
+              <w:top w:val="none" w:color="FFFFFF" w:sz="0"/>
+              <w:left w:val="none" w:color="FFFFFF" w:sz="0"/>
+              <w:bottom w:val="none" w:color="FFFFFF" w:sz="0"/>
+              <w:right w:val="none" w:color="FFFFFF" w:sz="0"/>
+            </w:tcBorders>
+            <w:tcMar>
+              <w:top w:type="dxa" w:w="50"/>
+              <w:left w:type="dxa" w:w="90"/>
+              <w:bottom w:type="dxa" w:w="50"/>
+              <w:right w:type="dxa" w:w="90"/>
+            </w:tcMar>
+          </w:tcPr>
+          <w:p>
+            <w:pPr>
+              <w:jc w:val="center"/>
+            </w:pPr>
+            <w:r>
+              <w:rPr>
+                <w:rFonts w:ascii="Times New Roman" w:cs="Times New Roman" w:eastAsia="Times New Roman" w:hAnsi="Times New Roman"/>
+                <w:sz w:val="18"/>
+                <w:szCs w:val="18"/>
+              </w:rPr>
+              <w:t xml:space="preserve">1.169</w:t>
+            </w:r>
+          </w:p>
+        </w:tc>
+        <w:tc>
+          <w:tcPr>
+            <w:tcW w:type="dxa" w:w="1860"/>
+            <w:tcBorders>
+              <w:top w:val="none" w:color="FFFFFF" w:sz="0"/>
+              <w:left w:val="none" w:color="FFFFFF" w:sz="0"/>
+              <w:bottom w:val="none" w:color="FFFFFF" w:sz="0"/>
+              <w:right w:val="none" w:color="FFFFFF" w:sz="0"/>
+            </w:tcBorders>
+            <w:tcMar>
+              <w:top w:type="dxa" w:w="50"/>
+              <w:left w:type="dxa" w:w="90"/>
+              <w:bottom w:type="dxa" w:w="50"/>
+              <w:right w:type="dxa" w:w="90"/>
+            </w:tcMar>
+          </w:tcPr>
+          <w:p>
+            <w:pPr>
+              <w:jc w:val="center"/>
+            </w:pPr>
+            <w:r>
+              <w:rPr>
+                <w:rFonts w:ascii="Times New Roman" w:cs="Times New Roman" w:eastAsia="Times New Roman" w:hAnsi="Times New Roman"/>
+                <w:sz w:val="18"/>
+                <w:szCs w:val="18"/>
+              </w:rPr>
+              <w:t xml:space="preserve">139.4° (stable)</w:t>
+            </w:r>
+          </w:p>
+        </w:tc>
+      </w:tr>
+      <w:tr>
+        <w:tc>
+          <w:tcPr>
+            <w:tcW w:type="dxa" w:w="1500"/>
+            <w:tcBorders>
+              <w:top w:val="none" w:color="FFFFFF" w:sz="0"/>
+              <w:left w:val="none" w:color="FFFFFF" w:sz="0"/>
+              <w:bottom w:val="none" w:color="FFFFFF" w:sz="0"/>
+              <w:right w:val="none" w:color="FFFFFF" w:sz="0"/>
+            </w:tcBorders>
+            <w:tcMar>
+              <w:top w:type="dxa" w:w="50"/>
+              <w:left w:type="dxa" w:w="90"/>
+              <w:bottom w:type="dxa" w:w="50"/>
+              <w:right w:type="dxa" w:w="90"/>
+            </w:tcMar>
+          </w:tcPr>
+          <w:p>
+            <w:pPr>
+              <w:jc w:val="left"/>
+            </w:pPr>
+            <w:r>
+              <w:rPr>
+                <w:rFonts w:ascii="Times New Roman" w:cs="Times New Roman" w:eastAsia="Times New Roman" w:hAnsi="Times New Roman"/>
+                <w:sz w:val="18"/>
+                <w:szCs w:val="18"/>
+              </w:rPr>
+              <w:t xml:space="preserve">450</w:t>
+            </w:r>
+          </w:p>
+        </w:tc>
+        <w:tc>
+          <w:tcPr>
+            <w:tcW w:type="dxa" w:w="2000"/>
+            <w:tcBorders>
+              <w:top w:val="none" w:color="FFFFFF" w:sz="0"/>
+              <w:left w:val="none" w:color="FFFFFF" w:sz="0"/>
+              <w:bottom w:val="none" w:color="FFFFFF" w:sz="0"/>
+              <w:right w:val="none" w:color="FFFFFF" w:sz="0"/>
+            </w:tcBorders>
+            <w:tcMar>
+              <w:top w:type="dxa" w:w="50"/>
+              <w:left w:type="dxa" w:w="90"/>
+              <w:bottom w:type="dxa" w:w="50"/>
+              <w:right w:type="dxa" w:w="90"/>
+            </w:tcMar>
+          </w:tcPr>
+          <w:p>
+            <w:pPr>
+              <w:jc w:val="center"/>
+            </w:pPr>
+            <w:r>
+              <w:rPr>
+                <w:rFonts w:ascii="Times New Roman" w:cs="Times New Roman" w:eastAsia="Times New Roman" w:hAnsi="Times New Roman"/>
+                <w:sz w:val="18"/>
+                <w:szCs w:val="18"/>
+              </w:rPr>
+              <w:t xml:space="preserve">1.099</w:t>
+            </w:r>
+          </w:p>
+        </w:tc>
+        <w:tc>
+          <w:tcPr>
+            <w:tcW w:type="dxa" w:w="2000"/>
+            <w:tcBorders>
+              <w:top w:val="none" w:color="FFFFFF" w:sz="0"/>
+              <w:left w:val="none" w:color="FFFFFF" w:sz="0"/>
+              <w:bottom w:val="none" w:color="FFFFFF" w:sz="0"/>
+              <w:right w:val="none" w:color="FFFFFF" w:sz="0"/>
+            </w:tcBorders>
+            <w:tcMar>
+              <w:top w:type="dxa" w:w="50"/>
+              <w:left w:type="dxa" w:w="90"/>
+              <w:bottom w:type="dxa" w:w="50"/>
+              <w:right w:type="dxa" w:w="90"/>
+            </w:tcMar>
+          </w:tcPr>
+          <w:p>
+            <w:pPr>
+              <w:jc w:val="center"/>
+            </w:pPr>
+            <w:r>
+              <w:rPr>
+                <w:rFonts w:ascii="Times New Roman" w:cs="Times New Roman" w:eastAsia="Times New Roman" w:hAnsi="Times New Roman"/>
+                <w:sz w:val="18"/>
+                <w:szCs w:val="18"/>
+              </w:rPr>
+              <w:t xml:space="preserve">145.7° (stable)</w:t>
+            </w:r>
+          </w:p>
+        </w:tc>
+        <w:tc>
+          <w:tcPr>
+            <w:tcW w:type="dxa" w:w="2000"/>
+            <w:tcBorders>
+              <w:top w:val="none" w:color="FFFFFF" w:sz="0"/>
+              <w:left w:val="none" w:color="FFFFFF" w:sz="0"/>
+              <w:bottom w:val="none" w:color="FFFFFF" w:sz="0"/>
+              <w:right w:val="none" w:color="FFFFFF" w:sz="0"/>
+            </w:tcBorders>
+            <w:tcMar>
+              <w:top w:type="dxa" w:w="50"/>
+              <w:left w:type="dxa" w:w="90"/>
+              <w:bottom w:type="dxa" w:w="50"/>
+              <w:right w:type="dxa" w:w="90"/>
+            </w:tcMar>
+          </w:tcPr>
+          <w:p>
+            <w:pPr>
+              <w:jc w:val="center"/>
+            </w:pPr>
+            <w:r>
+              <w:rPr>
+                <w:rFonts w:ascii="Times New Roman" w:cs="Times New Roman" w:eastAsia="Times New Roman" w:hAnsi="Times New Roman"/>
+                <w:sz w:val="18"/>
+                <w:szCs w:val="18"/>
+              </w:rPr>
+              <w:t xml:space="preserve">1.219</w:t>
+            </w:r>
+          </w:p>
+        </w:tc>
+        <w:tc>
+          <w:tcPr>
+            <w:tcW w:type="dxa" w:w="1860"/>
+            <w:tcBorders>
+              <w:top w:val="none" w:color="FFFFFF" w:sz="0"/>
+              <w:left w:val="none" w:color="FFFFFF" w:sz="0"/>
+              <w:bottom w:val="none" w:color="FFFFFF" w:sz="0"/>
+              <w:right w:val="none" w:color="FFFFFF" w:sz="0"/>
+            </w:tcBorders>
+            <w:tcMar>
+              <w:top w:type="dxa" w:w="50"/>
+              <w:left w:type="dxa" w:w="90"/>
+              <w:bottom w:type="dxa" w:w="50"/>
+              <w:right w:type="dxa" w:w="90"/>
+            </w:tcMar>
+          </w:tcPr>
+          <w:p>
+            <w:pPr>
+              <w:jc w:val="center"/>
+            </w:pPr>
+            <w:r>
+              <w:rPr>
+                <w:rFonts w:ascii="Times New Roman" w:cs="Times New Roman" w:eastAsia="Times New Roman" w:hAnsi="Times New Roman"/>
+                <w:sz w:val="18"/>
+                <w:szCs w:val="18"/>
+              </w:rPr>
+              <w:t xml:space="preserve">Unstable</w:t>
+            </w:r>
+          </w:p>
+        </w:tc>
+      </w:tr>
+      <w:tr>
+        <w:tc>
+          <w:tcPr>
+            <w:tcW w:type="dxa" w:w="1500"/>
+            <w:tcBorders>
+              <w:top w:val="none" w:color="FFFFFF" w:sz="0"/>
+              <w:left w:val="none" w:color="FFFFFF" w:sz="0"/>
               <w:bottom w:val="single" w:color="000000" w:sz="4"/>
               <w:right w:val="none" w:color="FFFFFF" w:sz="0"/>
             </w:tcBorders>
@@ -10036,7 +10584,7 @@
                 <w:sz w:val="18"/>
                 <w:szCs w:val="18"/>
               </w:rPr>
-              <w:t xml:space="preserve">400–500</w:t>
+              <w:t xml:space="preserve">500</w:t>
             </w:r>
           </w:p>
         </w:tc>
@@ -10066,7 +10614,7 @@
                 <w:sz w:val="18"/>
                 <w:szCs w:val="18"/>
               </w:rPr>
-              <w:t xml:space="preserve">1.049–1.149</w:t>
+              <w:t xml:space="preserve">1.149</w:t>
             </w:r>
           </w:p>
         </w:tc>
@@ -10126,7 +10674,7 @@
                 <w:sz w:val="18"/>
                 <w:szCs w:val="18"/>
               </w:rPr>
-              <w:t xml:space="preserve">1.169–1.269</w:t>
+              <w:t xml:space="preserve">1.269</w:t>
             </w:r>
           </w:p>
         </w:tc>
@@ -10174,7 +10722,7 @@
           <w:sz w:val="16"/>
           <w:szCs w:val="16"/>
         </w:rPr>
-        <w:t xml:space="preserve">Critical Tcomm ≈ 342 ms for STATCOM (≈ 891 ms total after fault onset) and ≈ 150–200 ms for SVC.</w:t>
+        <w:t xml:space="preserve">Critical Tcomm ≈ 452 ms for STATCOM (action at 1.102 s) and ≈ 416 ms for SVC (action at 1.185 s). All G10 values come from one shared model (g10_model.py).</w:t>
       </w:r>
     </w:p>
     <w:sectPr>

</xml_diff>

<commit_message>
Fix remaining physics issues and align all 11 figures with the paper
- G1/G4/G7 now come from the swing equation (zero slope at fault onset);
  G10 sits closest to the fault and accelerates most (4.5 deg vs 1.9-2.8)
- Bus 16 STATCOM requirement from paper Tables 12/31 (148.2 / 168.4 Mvar)
- New shared frequency model (freq_model.py): G6 trip 650 MW (Table 4),
  governor/AGC from Table 3, H_sys = 1.72 s (Table 8), smooth UFLS,
  CNN-LSTM-dispatched BESS instead of SVC for the frequency cases
- Generator panel uses Table 4 set-points and headroom
- Bus 44 figures both start at 0.942 p.u. (Table 20); NC collapse is
  smooth to the 0.621 p.u. minimum with no step
- Tables read every value from the model result files; make_all.sh
  rebuilds everything

Co-Authored-By: Claude Opus 5.5 <noreply@anthropic.com>
Claude-Session: https://claude.ai/code/session_017mvBckRxt83VPQqr9i583E
</commit_message>
<xml_diff>
--- a/figures/Timing_and_Results_Tables.docx
+++ b/figures/Timing_and_Results_Tables.docx
@@ -1460,7 +1460,7 @@
                 <w:sz w:val="18"/>
                 <w:szCs w:val="18"/>
               </w:rPr>
-              <w:t xml:space="preserve">System frequency</w:t>
+              <w:t xml:space="preserve">System frequency (G6 trip)</w:t>
             </w:r>
           </w:p>
         </w:tc>
@@ -1490,7 +1490,7 @@
                 <w:sz w:val="18"/>
                 <w:szCs w:val="18"/>
               </w:rPr>
-              <w:t xml:space="preserve">SVC</w:t>
+              <w:t xml:space="preserve">BESS</w:t>
             </w:r>
           </w:p>
         </w:tc>
@@ -1580,7 +1580,7 @@
                 <w:sz w:val="18"/>
                 <w:szCs w:val="18"/>
               </w:rPr>
-              <w:t xml:space="preserve">1.169</w:t>
+              <w:t xml:space="preserve">1.019 + ramp</w:t>
             </w:r>
           </w:p>
         </w:tc>
@@ -1610,7 +1610,7 @@
                 <w:sz w:val="18"/>
                 <w:szCs w:val="18"/>
               </w:rPr>
-              <w:t xml:space="preserve">1.369</w:t>
+              <w:t xml:space="preserve">1.219 + ramp</w:t>
             </w:r>
           </w:p>
         </w:tc>
@@ -2400,7 +2400,7 @@
                 <w:sz w:val="18"/>
                 <w:szCs w:val="18"/>
               </w:rPr>
-              <w:t xml:space="preserve">SVC</w:t>
+              <w:t xml:space="preserve">BESS</w:t>
             </w:r>
           </w:p>
         </w:tc>
@@ -2490,7 +2490,7 @@
                 <w:sz w:val="18"/>
                 <w:szCs w:val="18"/>
               </w:rPr>
-              <w:t xml:space="preserve">1.169</w:t>
+              <w:t xml:space="preserve">1.019 + ramp</w:t>
             </w:r>
           </w:p>
         </w:tc>
@@ -2582,7 +2582,7 @@
                 <w:sz w:val="18"/>
                 <w:szCs w:val="18"/>
               </w:rPr>
-              <w:t xml:space="preserve">SVC</w:t>
+              <w:t xml:space="preserve">BESS</w:t>
             </w:r>
           </w:p>
         </w:tc>
@@ -2672,7 +2672,7 @@
                 <w:sz w:val="18"/>
                 <w:szCs w:val="18"/>
               </w:rPr>
-              <w:t xml:space="preserve">1.169</w:t>
+              <w:t xml:space="preserve">1.019 + ramp</w:t>
             </w:r>
           </w:p>
         </w:tc>
@@ -2702,7 +2702,7 @@
                 <w:sz w:val="18"/>
                 <w:szCs w:val="18"/>
               </w:rPr>
-              <w:t xml:space="preserve">1.369</w:t>
+              <w:t xml:space="preserve">1.219 + ramp</w:t>
             </w:r>
           </w:p>
         </w:tc>
@@ -2854,7 +2854,7 @@
                 <w:sz w:val="18"/>
                 <w:szCs w:val="18"/>
               </w:rPr>
-              <w:t xml:space="preserve">1.019 (ramp 250 MW/s)</w:t>
+              <w:t xml:space="preserve">1.019 + ramp</w:t>
             </w:r>
           </w:p>
         </w:tc>
@@ -2884,7 +2884,7 @@
                 <w:sz w:val="18"/>
                 <w:szCs w:val="18"/>
               </w:rPr>
-              <w:t xml:space="preserve">1.219</w:t>
+              <w:t xml:space="preserve">1.219 + ramp</w:t>
             </w:r>
           </w:p>
         </w:tc>
@@ -3892,7 +3892,7 @@
                 <w:sz w:val="18"/>
                 <w:szCs w:val="18"/>
               </w:rPr>
-              <w:t xml:space="preserve">46.5° / 58.4° / 66.1° (26.5° / 33.4° / 38.1°)</w:t>
+              <w:t xml:space="preserve">26.2° / 34.1° / 39.6° (6.2° / 9.1° / 11.6°)</w:t>
             </w:r>
           </w:p>
         </w:tc>
@@ -3924,7 +3924,7 @@
                 <w:sz w:val="18"/>
                 <w:szCs w:val="18"/>
               </w:rPr>
-              <w:t xml:space="preserve">Rotor angle (G10)</w:t>
+              <w:t xml:space="preserve"/>
             </w:r>
           </w:p>
         </w:tc>
@@ -3954,7 +3954,7 @@
                 <w:sz w:val="18"/>
                 <w:szCs w:val="18"/>
               </w:rPr>
-              <w:t xml:space="preserve">No control</w:t>
+              <w:t xml:space="preserve">G10 vs G1 / G4 / G7</w:t>
             </w:r>
           </w:p>
         </w:tc>
@@ -3984,7 +3984,7 @@
                 <w:sz w:val="18"/>
                 <w:szCs w:val="18"/>
               </w:rPr>
-              <w:t xml:space="preserve">180° crossing</w:t>
+              <w:t xml:space="preserve">Rise during fault (0.10–0.25 s)</w:t>
             </w:r>
           </w:p>
         </w:tc>
@@ -4014,7 +4014,7 @@
                 <w:sz w:val="18"/>
                 <w:szCs w:val="18"/>
               </w:rPr>
-              <w:t xml:space="preserve">1.47 s</w:t>
+              <w:t xml:space="preserve">4.5° vs 1.9° / 2.4° / 2.8°</w:t>
             </w:r>
           </w:p>
         </w:tc>
@@ -4046,7 +4046,7 @@
                 <w:sz w:val="18"/>
                 <w:szCs w:val="18"/>
               </w:rPr>
-              <w:t xml:space="preserve"/>
+              <w:t xml:space="preserve">Rotor angle (G10)</w:t>
             </w:r>
           </w:p>
         </w:tc>
@@ -4076,32 +4076,7 @@
                 <w:sz w:val="18"/>
                 <w:szCs w:val="18"/>
               </w:rPr>
-              <w:t xml:space="preserve">STATCOM, </w:t>
-            </w:r>
-            <w:r>
-              <w:rPr>
-                <w:rFonts w:ascii="Times New Roman" w:cs="Times New Roman" w:eastAsia="Times New Roman" w:hAnsi="Times New Roman"/>
-                <w:sz w:val="18"/>
-                <w:szCs w:val="18"/>
-              </w:rPr>
-              <w:t xml:space="preserve">T</w:t>
-            </w:r>
-            <w:r>
-              <w:rPr>
-                <w:rFonts w:ascii="Times New Roman" w:cs="Times New Roman" w:eastAsia="Times New Roman" w:hAnsi="Times New Roman"/>
-                <w:sz w:val="18"/>
-                <w:szCs w:val="18"/>
-                <w:vertAlign w:val="subscript"/>
-              </w:rPr>
-              <w:t xml:space="preserve">comm</w:t>
-            </w:r>
-            <w:r>
-              <w:rPr>
-                <w:rFonts w:ascii="Times New Roman" w:cs="Times New Roman" w:eastAsia="Times New Roman" w:hAnsi="Times New Roman"/>
-                <w:sz w:val="18"/>
-                <w:szCs w:val="18"/>
-              </w:rPr>
-              <w:t xml:space="preserve">=0</w:t>
+              <w:t xml:space="preserve">No control</w:t>
             </w:r>
           </w:p>
         </w:tc>
@@ -4131,7 +4106,7 @@
                 <w:sz w:val="18"/>
                 <w:szCs w:val="18"/>
               </w:rPr>
-              <w:t xml:space="preserve">Peak δ</w:t>
+              <w:t xml:space="preserve">180° crossing</w:t>
             </w:r>
           </w:p>
         </w:tc>
@@ -4161,7 +4136,7 @@
                 <w:sz w:val="18"/>
                 <w:szCs w:val="18"/>
               </w:rPr>
-              <w:t xml:space="preserve">64.1°</w:t>
+              <w:t xml:space="preserve">1.33 s</w:t>
             </w:r>
           </w:p>
         </w:tc>
@@ -4248,7 +4223,7 @@
                 <w:sz w:val="18"/>
                 <w:szCs w:val="18"/>
               </w:rPr>
-              <w:t xml:space="preserve">=200 ms</w:t>
+              <w:t xml:space="preserve">=0</w:t>
             </w:r>
           </w:p>
         </w:tc>
@@ -4308,7 +4283,7 @@
                 <w:sz w:val="18"/>
                 <w:szCs w:val="18"/>
               </w:rPr>
-              <w:t xml:space="preserve">90.6°</w:t>
+              <w:t xml:space="preserve">75.0°</w:t>
             </w:r>
           </w:p>
         </w:tc>
@@ -4370,7 +4345,7 @@
                 <w:sz w:val="18"/>
                 <w:szCs w:val="18"/>
               </w:rPr>
-              <w:t xml:space="preserve">SVC, </w:t>
+              <w:t xml:space="preserve">STATCOM, </w:t>
             </w:r>
             <w:r>
               <w:rPr>
@@ -4395,7 +4370,7 @@
                 <w:sz w:val="18"/>
                 <w:szCs w:val="18"/>
               </w:rPr>
-              <w:t xml:space="preserve">=0</w:t>
+              <w:t xml:space="preserve">=200 ms</w:t>
             </w:r>
           </w:p>
         </w:tc>
@@ -4455,7 +4430,7 @@
                 <w:sz w:val="18"/>
                 <w:szCs w:val="18"/>
               </w:rPr>
-              <w:t xml:space="preserve">68.5°</w:t>
+              <w:t xml:space="preserve">106.0°</w:t>
             </w:r>
           </w:p>
         </w:tc>
@@ -4487,7 +4462,7 @@
                 <w:sz w:val="18"/>
                 <w:szCs w:val="18"/>
               </w:rPr>
-              <w:t xml:space="preserve">System frequency</w:t>
+              <w:t xml:space="preserve"/>
             </w:r>
           </w:p>
         </w:tc>
@@ -4517,7 +4492,32 @@
                 <w:sz w:val="18"/>
                 <w:szCs w:val="18"/>
               </w:rPr>
-              <w:t xml:space="preserve">No control</w:t>
+              <w:t xml:space="preserve">SVC, </w:t>
+            </w:r>
+            <w:r>
+              <w:rPr>
+                <w:rFonts w:ascii="Times New Roman" w:cs="Times New Roman" w:eastAsia="Times New Roman" w:hAnsi="Times New Roman"/>
+                <w:sz w:val="18"/>
+                <w:szCs w:val="18"/>
+              </w:rPr>
+              <w:t xml:space="preserve">T</w:t>
+            </w:r>
+            <w:r>
+              <w:rPr>
+                <w:rFonts w:ascii="Times New Roman" w:cs="Times New Roman" w:eastAsia="Times New Roman" w:hAnsi="Times New Roman"/>
+                <w:sz w:val="18"/>
+                <w:szCs w:val="18"/>
+                <w:vertAlign w:val="subscript"/>
+              </w:rPr>
+              <w:t xml:space="preserve">comm</w:t>
+            </w:r>
+            <w:r>
+              <w:rPr>
+                <w:rFonts w:ascii="Times New Roman" w:cs="Times New Roman" w:eastAsia="Times New Roman" w:hAnsi="Times New Roman"/>
+                <w:sz w:val="18"/>
+                <w:szCs w:val="18"/>
+              </w:rPr>
+              <w:t xml:space="preserve">=0</w:t>
             </w:r>
           </w:p>
         </w:tc>
@@ -4547,7 +4547,7 @@
                 <w:sz w:val="18"/>
                 <w:szCs w:val="18"/>
               </w:rPr>
-              <w:t xml:space="preserve">Nadir</w:t>
+              <w:t xml:space="preserve">Peak δ</w:t>
             </w:r>
           </w:p>
         </w:tc>
@@ -4577,7 +4577,7 @@
                 <w:sz w:val="18"/>
                 <w:szCs w:val="18"/>
               </w:rPr>
-              <w:t xml:space="preserve">48.30 Hz</w:t>
+              <w:t xml:space="preserve">79.8°</w:t>
             </w:r>
           </w:p>
         </w:tc>
@@ -4609,7 +4609,7 @@
                 <w:sz w:val="18"/>
                 <w:szCs w:val="18"/>
               </w:rPr>
-              <w:t xml:space="preserve"/>
+              <w:t xml:space="preserve">Two-panel Δδ (G10)</w:t>
             </w:r>
           </w:p>
         </w:tc>
@@ -4639,7 +4639,32 @@
                 <w:sz w:val="18"/>
                 <w:szCs w:val="18"/>
               </w:rPr>
-              <w:t xml:space="preserve">Conventional PI-AGC</w:t>
+              <w:t xml:space="preserve">STATCOM, </w:t>
+            </w:r>
+            <w:r>
+              <w:rPr>
+                <w:rFonts w:ascii="Times New Roman" w:cs="Times New Roman" w:eastAsia="Times New Roman" w:hAnsi="Times New Roman"/>
+                <w:sz w:val="18"/>
+                <w:szCs w:val="18"/>
+              </w:rPr>
+              <w:t xml:space="preserve">T</w:t>
+            </w:r>
+            <w:r>
+              <w:rPr>
+                <w:rFonts w:ascii="Times New Roman" w:cs="Times New Roman" w:eastAsia="Times New Roman" w:hAnsi="Times New Roman"/>
+                <w:sz w:val="18"/>
+                <w:szCs w:val="18"/>
+                <w:vertAlign w:val="subscript"/>
+              </w:rPr>
+              <w:t xml:space="preserve">comm</w:t>
+            </w:r>
+            <w:r>
+              <w:rPr>
+                <w:rFonts w:ascii="Times New Roman" w:cs="Times New Roman" w:eastAsia="Times New Roman" w:hAnsi="Times New Roman"/>
+                <w:sz w:val="18"/>
+                <w:szCs w:val="18"/>
+              </w:rPr>
+              <w:t xml:space="preserve">=0</w:t>
             </w:r>
           </w:p>
         </w:tc>
@@ -4669,7 +4694,7 @@
                 <w:sz w:val="18"/>
                 <w:szCs w:val="18"/>
               </w:rPr>
-              <w:t xml:space="preserve">Nadir</w:t>
+              <w:t xml:space="preserve">Peak Δδ</w:t>
             </w:r>
           </w:p>
         </w:tc>
@@ -4699,7 +4724,7 @@
                 <w:sz w:val="18"/>
                 <w:szCs w:val="18"/>
               </w:rPr>
-              <w:t xml:space="preserve">49.10 Hz</w:t>
+              <w:t xml:space="preserve">56.0°</w:t>
             </w:r>
           </w:p>
         </w:tc>
@@ -4761,7 +4786,7 @@
                 <w:sz w:val="18"/>
                 <w:szCs w:val="18"/>
               </w:rPr>
-              <w:t xml:space="preserve">CNN-LSTM + SVC, </w:t>
+              <w:t xml:space="preserve">STATCOM, </w:t>
             </w:r>
             <w:r>
               <w:rPr>
@@ -4786,7 +4811,7 @@
                 <w:sz w:val="18"/>
                 <w:szCs w:val="18"/>
               </w:rPr>
-              <w:t xml:space="preserve">=0 / 200 ms</w:t>
+              <w:t xml:space="preserve">=200 ms</w:t>
             </w:r>
           </w:p>
         </w:tc>
@@ -4816,7 +4841,7 @@
                 <w:sz w:val="18"/>
                 <w:szCs w:val="18"/>
               </w:rPr>
-              <w:t xml:space="preserve">Nadir</w:t>
+              <w:t xml:space="preserve">Peak Δδ</w:t>
             </w:r>
           </w:p>
         </w:tc>
@@ -4846,7 +4871,7 @@
                 <w:sz w:val="18"/>
                 <w:szCs w:val="18"/>
               </w:rPr>
-              <w:t xml:space="preserve">48.30 Hz (before action)</w:t>
+              <w:t xml:space="preserve">87.0°</w:t>
             </w:r>
           </w:p>
         </w:tc>
@@ -4878,7 +4903,7 @@
                 <w:sz w:val="18"/>
                 <w:szCs w:val="18"/>
               </w:rPr>
-              <w:t xml:space="preserve">Two-panel Δδ (G10)</w:t>
+              <w:t xml:space="preserve"/>
             </w:r>
           </w:p>
         </w:tc>
@@ -4908,7 +4933,7 @@
                 <w:sz w:val="18"/>
                 <w:szCs w:val="18"/>
               </w:rPr>
-              <w:t xml:space="preserve">STATCOM, </w:t>
+              <w:t xml:space="preserve">SVC, </w:t>
             </w:r>
             <w:r>
               <w:rPr>
@@ -4993,7 +5018,7 @@
                 <w:sz w:val="18"/>
                 <w:szCs w:val="18"/>
               </w:rPr>
-              <w:t xml:space="preserve">45.1°</w:t>
+              <w:t xml:space="preserve">60.8°</w:t>
             </w:r>
           </w:p>
         </w:tc>
@@ -5025,7 +5050,7 @@
                 <w:sz w:val="18"/>
                 <w:szCs w:val="18"/>
               </w:rPr>
-              <w:t xml:space="preserve"/>
+              <w:t xml:space="preserve">System frequency / ROCOF (G6 trip, 650 MW)</w:t>
             </w:r>
           </w:p>
         </w:tc>
@@ -5055,32 +5080,7 @@
                 <w:sz w:val="18"/>
                 <w:szCs w:val="18"/>
               </w:rPr>
-              <w:t xml:space="preserve">STATCOM, </w:t>
-            </w:r>
-            <w:r>
-              <w:rPr>
-                <w:rFonts w:ascii="Times New Roman" w:cs="Times New Roman" w:eastAsia="Times New Roman" w:hAnsi="Times New Roman"/>
-                <w:sz w:val="18"/>
-                <w:szCs w:val="18"/>
-              </w:rPr>
-              <w:t xml:space="preserve">T</w:t>
-            </w:r>
-            <w:r>
-              <w:rPr>
-                <w:rFonts w:ascii="Times New Roman" w:cs="Times New Roman" w:eastAsia="Times New Roman" w:hAnsi="Times New Roman"/>
-                <w:sz w:val="18"/>
-                <w:szCs w:val="18"/>
-                <w:vertAlign w:val="subscript"/>
-              </w:rPr>
-              <w:t xml:space="preserve">comm</w:t>
-            </w:r>
-            <w:r>
-              <w:rPr>
-                <w:rFonts w:ascii="Times New Roman" w:cs="Times New Roman" w:eastAsia="Times New Roman" w:hAnsi="Times New Roman"/>
-                <w:sz w:val="18"/>
-                <w:szCs w:val="18"/>
-              </w:rPr>
-              <w:t xml:space="preserve">=200 ms</w:t>
+              <w:t xml:space="preserve">No control (governor)</w:t>
             </w:r>
           </w:p>
         </w:tc>
@@ -5110,7 +5110,7 @@
                 <w:sz w:val="18"/>
                 <w:szCs w:val="18"/>
               </w:rPr>
-              <w:t xml:space="preserve">Peak Δδ</w:t>
+              <w:t xml:space="preserve">Nadir / UFLS / |ROCOF|max</w:t>
             </w:r>
           </w:p>
         </w:tc>
@@ -5140,7 +5140,7 @@
                 <w:sz w:val="18"/>
                 <w:szCs w:val="18"/>
               </w:rPr>
-              <w:t xml:space="preserve">71.6°</w:t>
+              <w:t xml:space="preserve">48.79 Hz / stage 1 (t = 1.30 s) / 1.48 Hz/s</w:t>
             </w:r>
           </w:p>
         </w:tc>
@@ -5202,32 +5202,7 @@
                 <w:sz w:val="18"/>
                 <w:szCs w:val="18"/>
               </w:rPr>
-              <w:t xml:space="preserve">SVC, </w:t>
-            </w:r>
-            <w:r>
-              <w:rPr>
-                <w:rFonts w:ascii="Times New Roman" w:cs="Times New Roman" w:eastAsia="Times New Roman" w:hAnsi="Times New Roman"/>
-                <w:sz w:val="18"/>
-                <w:szCs w:val="18"/>
-              </w:rPr>
-              <w:t xml:space="preserve">T</w:t>
-            </w:r>
-            <w:r>
-              <w:rPr>
-                <w:rFonts w:ascii="Times New Roman" w:cs="Times New Roman" w:eastAsia="Times New Roman" w:hAnsi="Times New Roman"/>
-                <w:sz w:val="18"/>
-                <w:szCs w:val="18"/>
-                <w:vertAlign w:val="subscript"/>
-              </w:rPr>
-              <w:t xml:space="preserve">comm</w:t>
-            </w:r>
-            <w:r>
-              <w:rPr>
-                <w:rFonts w:ascii="Times New Roman" w:cs="Times New Roman" w:eastAsia="Times New Roman" w:hAnsi="Times New Roman"/>
-                <w:sz w:val="18"/>
-                <w:szCs w:val="18"/>
-              </w:rPr>
-              <w:t xml:space="preserve">=0</w:t>
+              <w:t xml:space="preserve">PI-AGC (governor + AGC)</w:t>
             </w:r>
           </w:p>
         </w:tc>
@@ -5257,7 +5232,7 @@
                 <w:sz w:val="18"/>
                 <w:szCs w:val="18"/>
               </w:rPr>
-              <w:t xml:space="preserve">Peak Δδ</w:t>
+              <w:t xml:space="preserve">Nadir / UFLS / |ROCOF|max</w:t>
             </w:r>
           </w:p>
         </w:tc>
@@ -5287,7 +5262,7 @@
                 <w:sz w:val="18"/>
                 <w:szCs w:val="18"/>
               </w:rPr>
-              <w:t xml:space="preserve">49.5°</w:t>
+              <w:t xml:space="preserve">48.80 Hz / stage 1 (t = 1.30 s) / 1.48 Hz/s</w:t>
             </w:r>
           </w:p>
         </w:tc>
@@ -5319,7 +5294,7 @@
                 <w:sz w:val="18"/>
                 <w:szCs w:val="18"/>
               </w:rPr>
-              <w:t xml:space="preserve">Bus 44 voltage (wind variability)</w:t>
+              <w:t xml:space="preserve"/>
             </w:r>
           </w:p>
         </w:tc>
@@ -5349,7 +5324,32 @@
                 <w:sz w:val="18"/>
                 <w:szCs w:val="18"/>
               </w:rPr>
-              <w:t xml:space="preserve">SG-only baseline</w:t>
+              <w:t xml:space="preserve">CNN-LSTM + BESS, </w:t>
+            </w:r>
+            <w:r>
+              <w:rPr>
+                <w:rFonts w:ascii="Times New Roman" w:cs="Times New Roman" w:eastAsia="Times New Roman" w:hAnsi="Times New Roman"/>
+                <w:sz w:val="18"/>
+                <w:szCs w:val="18"/>
+              </w:rPr>
+              <w:t xml:space="preserve">T</w:t>
+            </w:r>
+            <w:r>
+              <w:rPr>
+                <w:rFonts w:ascii="Times New Roman" w:cs="Times New Roman" w:eastAsia="Times New Roman" w:hAnsi="Times New Roman"/>
+                <w:sz w:val="18"/>
+                <w:szCs w:val="18"/>
+                <w:vertAlign w:val="subscript"/>
+              </w:rPr>
+              <w:t xml:space="preserve">comm</w:t>
+            </w:r>
+            <w:r>
+              <w:rPr>
+                <w:rFonts w:ascii="Times New Roman" w:cs="Times New Roman" w:eastAsia="Times New Roman" w:hAnsi="Times New Roman"/>
+                <w:sz w:val="18"/>
+                <w:szCs w:val="18"/>
+              </w:rPr>
+              <w:t xml:space="preserve">=0</w:t>
             </w:r>
           </w:p>
         </w:tc>
@@ -5379,7 +5379,7 @@
                 <w:sz w:val="18"/>
                 <w:szCs w:val="18"/>
               </w:rPr>
-              <w:t xml:space="preserve">Nadir / time &lt; 0.90 p.u.</w:t>
+              <w:t xml:space="preserve">Nadir / UFLS / |ROCOF|max</w:t>
             </w:r>
           </w:p>
         </w:tc>
@@ -5409,7 +5409,7 @@
                 <w:sz w:val="18"/>
                 <w:szCs w:val="18"/>
               </w:rPr>
-              <w:t xml:space="preserve">0.889 p.u. / 1.0 s</w:t>
+              <w:t xml:space="preserve">48.89 Hz / stage 1 (t = 1.37 s) / 1.48 Hz/s</w:t>
             </w:r>
           </w:p>
         </w:tc>
@@ -5471,7 +5471,32 @@
                 <w:sz w:val="18"/>
                 <w:szCs w:val="18"/>
               </w:rPr>
-              <w:t xml:space="preserve">50% RES, no control</w:t>
+              <w:t xml:space="preserve">CNN-LSTM + BESS, </w:t>
+            </w:r>
+            <w:r>
+              <w:rPr>
+                <w:rFonts w:ascii="Times New Roman" w:cs="Times New Roman" w:eastAsia="Times New Roman" w:hAnsi="Times New Roman"/>
+                <w:sz w:val="18"/>
+                <w:szCs w:val="18"/>
+              </w:rPr>
+              <w:t xml:space="preserve">T</w:t>
+            </w:r>
+            <w:r>
+              <w:rPr>
+                <w:rFonts w:ascii="Times New Roman" w:cs="Times New Roman" w:eastAsia="Times New Roman" w:hAnsi="Times New Roman"/>
+                <w:sz w:val="18"/>
+                <w:szCs w:val="18"/>
+                <w:vertAlign w:val="subscript"/>
+              </w:rPr>
+              <w:t xml:space="preserve">comm</w:t>
+            </w:r>
+            <w:r>
+              <w:rPr>
+                <w:rFonts w:ascii="Times New Roman" w:cs="Times New Roman" w:eastAsia="Times New Roman" w:hAnsi="Times New Roman"/>
+                <w:sz w:val="18"/>
+                <w:szCs w:val="18"/>
+              </w:rPr>
+              <w:t xml:space="preserve">=200 ms</w:t>
             </w:r>
           </w:p>
         </w:tc>
@@ -5501,7 +5526,7 @@
                 <w:sz w:val="18"/>
                 <w:szCs w:val="18"/>
               </w:rPr>
-              <w:t xml:space="preserve">Nadir / time &lt; 0.90 p.u.</w:t>
+              <w:t xml:space="preserve">Nadir / UFLS</w:t>
             </w:r>
           </w:p>
         </w:tc>
@@ -5531,7 +5556,7 @@
                 <w:sz w:val="18"/>
                 <w:szCs w:val="18"/>
               </w:rPr>
-              <w:t xml:space="preserve">0.831 p.u. / 4.2 s</w:t>
+              <w:t xml:space="preserve">48.87 Hz / stage 1 (t = 1.31 s)</w:t>
             </w:r>
           </w:p>
         </w:tc>
@@ -5593,32 +5618,7 @@
                 <w:sz w:val="18"/>
                 <w:szCs w:val="18"/>
               </w:rPr>
-              <w:t xml:space="preserve">CNN-LSTM + SVC, </w:t>
-            </w:r>
-            <w:r>
-              <w:rPr>
-                <w:rFonts w:ascii="Times New Roman" w:cs="Times New Roman" w:eastAsia="Times New Roman" w:hAnsi="Times New Roman"/>
-                <w:sz w:val="18"/>
-                <w:szCs w:val="18"/>
-              </w:rPr>
-              <w:t xml:space="preserve">T</w:t>
-            </w:r>
-            <w:r>
-              <w:rPr>
-                <w:rFonts w:ascii="Times New Roman" w:cs="Times New Roman" w:eastAsia="Times New Roman" w:hAnsi="Times New Roman"/>
-                <w:sz w:val="18"/>
-                <w:szCs w:val="18"/>
-                <w:vertAlign w:val="subscript"/>
-              </w:rPr>
-              <w:t xml:space="preserve">comm</w:t>
-            </w:r>
-            <w:r>
-              <w:rPr>
-                <w:rFonts w:ascii="Times New Roman" w:cs="Times New Roman" w:eastAsia="Times New Roman" w:hAnsi="Times New Roman"/>
-                <w:sz w:val="18"/>
-                <w:szCs w:val="18"/>
-              </w:rPr>
-              <w:t xml:space="preserve">=0</w:t>
+              <w:t xml:space="preserve">No control / PI-AGC / CNN-LSTM + BESS</w:t>
             </w:r>
           </w:p>
         </w:tc>
@@ -5648,7 +5648,7 @@
                 <w:sz w:val="18"/>
                 <w:szCs w:val="18"/>
               </w:rPr>
-              <w:t xml:space="preserve">Nadir / time &lt; 0.90 p.u.</w:t>
+              <w:t xml:space="preserve">Back above 49.8 Hz</w:t>
             </w:r>
           </w:p>
         </w:tc>
@@ -5678,7 +5678,7 @@
                 <w:sz w:val="18"/>
                 <w:szCs w:val="18"/>
               </w:rPr>
-              <w:t xml:space="preserve">0.859 p.u. / 1.4 s</w:t>
+              <w:t xml:space="preserve">7.5 / 6.6 / 4.3 s</w:t>
             </w:r>
           </w:p>
         </w:tc>
@@ -5710,7 +5710,7 @@
                 <w:sz w:val="18"/>
                 <w:szCs w:val="18"/>
               </w:rPr>
-              <w:t xml:space="preserve"/>
+              <w:t xml:space="preserve">Frequency deviation (b)</w:t>
             </w:r>
           </w:p>
         </w:tc>
@@ -5740,32 +5740,7 @@
                 <w:sz w:val="18"/>
                 <w:szCs w:val="18"/>
               </w:rPr>
-              <w:t xml:space="preserve">CNN-LSTM + SVC, </w:t>
-            </w:r>
-            <w:r>
-              <w:rPr>
-                <w:rFonts w:ascii="Times New Roman" w:cs="Times New Roman" w:eastAsia="Times New Roman" w:hAnsi="Times New Roman"/>
-                <w:sz w:val="18"/>
-                <w:szCs w:val="18"/>
-              </w:rPr>
-              <w:t xml:space="preserve">T</w:t>
-            </w:r>
-            <w:r>
-              <w:rPr>
-                <w:rFonts w:ascii="Times New Roman" w:cs="Times New Roman" w:eastAsia="Times New Roman" w:hAnsi="Times New Roman"/>
-                <w:sz w:val="18"/>
-                <w:szCs w:val="18"/>
-                <w:vertAlign w:val="subscript"/>
-              </w:rPr>
-              <w:t xml:space="preserve">comm</w:t>
-            </w:r>
-            <w:r>
-              <w:rPr>
-                <w:rFonts w:ascii="Times New Roman" w:cs="Times New Roman" w:eastAsia="Times New Roman" w:hAnsi="Times New Roman"/>
-                <w:sz w:val="18"/>
-                <w:szCs w:val="18"/>
-              </w:rPr>
-              <w:t xml:space="preserve">=200 ms</w:t>
+              <w:t xml:space="preserve">9 / 39 / 118-bus, no control</w:t>
             </w:r>
           </w:p>
         </w:tc>
@@ -5795,7 +5770,7 @@
                 <w:sz w:val="18"/>
                 <w:szCs w:val="18"/>
               </w:rPr>
-              <w:t xml:space="preserve">Nadir / time &lt; 0.90 p.u.</w:t>
+              <w:t xml:space="preserve">Δf nadir</w:t>
             </w:r>
           </w:p>
         </w:tc>
@@ -5825,7 +5800,7 @@
                 <w:sz w:val="18"/>
                 <w:szCs w:val="18"/>
               </w:rPr>
-              <w:t xml:space="preserve">0.843 p.u. / 1.4 s</w:t>
+              <w:t xml:space="preserve">-1.09 / -1.21 / -1.16 Hz</w:t>
             </w:r>
           </w:p>
         </w:tc>
@@ -5857,7 +5832,7 @@
                 <w:sz w:val="18"/>
                 <w:szCs w:val="18"/>
               </w:rPr>
-              <w:t xml:space="preserve">Bus 44 voltage collapse</w:t>
+              <w:t xml:space="preserve"/>
             </w:r>
           </w:p>
         </w:tc>
@@ -5887,7 +5862,7 @@
                 <w:sz w:val="18"/>
                 <w:szCs w:val="18"/>
               </w:rPr>
-              <w:t xml:space="preserve">NC</w:t>
+              <w:t xml:space="preserve">9 / 39 / 118-bus, CNN-LSTM + BESS</w:t>
             </w:r>
           </w:p>
         </w:tc>
@@ -5917,7 +5892,7 @@
                 <w:sz w:val="18"/>
                 <w:szCs w:val="18"/>
               </w:rPr>
-              <w:t xml:space="preserve">Final state</w:t>
+              <w:t xml:space="preserve">Δf nadir</w:t>
             </w:r>
           </w:p>
         </w:tc>
@@ -5947,7 +5922,7 @@
                 <w:sz w:val="18"/>
                 <w:szCs w:val="18"/>
               </w:rPr>
-              <w:t xml:space="preserve">Collapse &lt; 0.60 p.u.</w:t>
+              <w:t xml:space="preserve">-1.03 / -1.11 / -1.07 Hz</w:t>
             </w:r>
           </w:p>
         </w:tc>
@@ -5979,7 +5954,7 @@
                 <w:sz w:val="18"/>
                 <w:szCs w:val="18"/>
               </w:rPr>
-              <w:t xml:space="preserve"/>
+              <w:t xml:space="preserve">Generator and BESS power</w:t>
             </w:r>
           </w:p>
         </w:tc>
@@ -6009,7 +5984,7 @@
                 <w:sz w:val="18"/>
                 <w:szCs w:val="18"/>
               </w:rPr>
-              <w:t xml:space="preserve">CC</w:t>
+              <w:t xml:space="preserve">BESS Bus 3 / Bus 29</w:t>
             </w:r>
           </w:p>
         </w:tc>
@@ -6039,7 +6014,7 @@
                 <w:sz w:val="18"/>
                 <w:szCs w:val="18"/>
               </w:rPr>
-              <w:t xml:space="preserve">Nadir / final</w:t>
+              <w:t xml:space="preserve">Full output reached</w:t>
             </w:r>
           </w:p>
         </w:tc>
@@ -6069,7 +6044,7 @@
                 <w:sz w:val="18"/>
                 <w:szCs w:val="18"/>
               </w:rPr>
-              <w:t xml:space="preserve">0.785 / 0.86 p.u.</w:t>
+              <w:t xml:space="preserve">1.219 s / 1.331 s</w:t>
             </w:r>
           </w:p>
         </w:tc>
@@ -6131,32 +6106,7 @@
                 <w:sz w:val="18"/>
                 <w:szCs w:val="18"/>
               </w:rPr>
-              <w:t xml:space="preserve">PF, </w:t>
-            </w:r>
-            <w:r>
-              <w:rPr>
-                <w:rFonts w:ascii="Times New Roman" w:cs="Times New Roman" w:eastAsia="Times New Roman" w:hAnsi="Times New Roman"/>
-                <w:sz w:val="18"/>
-                <w:szCs w:val="18"/>
-              </w:rPr>
-              <w:t xml:space="preserve">T</w:t>
-            </w:r>
-            <w:r>
-              <w:rPr>
-                <w:rFonts w:ascii="Times New Roman" w:cs="Times New Roman" w:eastAsia="Times New Roman" w:hAnsi="Times New Roman"/>
-                <w:sz w:val="18"/>
-                <w:szCs w:val="18"/>
-                <w:vertAlign w:val="subscript"/>
-              </w:rPr>
-              <w:t xml:space="preserve">comm</w:t>
-            </w:r>
-            <w:r>
-              <w:rPr>
-                <w:rFonts w:ascii="Times New Roman" w:cs="Times New Roman" w:eastAsia="Times New Roman" w:hAnsi="Times New Roman"/>
-                <w:sz w:val="18"/>
-                <w:szCs w:val="18"/>
-              </w:rPr>
-              <w:t xml:space="preserve">=0</w:t>
+              <w:t xml:space="preserve">BESS total</w:t>
             </w:r>
           </w:p>
         </w:tc>
@@ -6186,7 +6136,7 @@
                 <w:sz w:val="18"/>
                 <w:szCs w:val="18"/>
               </w:rPr>
-              <w:t xml:space="preserve">Nadir / time &lt; 0.90 p.u.</w:t>
+              <w:t xml:space="preserve">Delivered in first-swing window (0.50–0.70 s)</w:t>
             </w:r>
           </w:p>
         </w:tc>
@@ -6216,7 +6166,7 @@
                 <w:sz w:val="18"/>
                 <w:szCs w:val="18"/>
               </w:rPr>
-              <w:t xml:space="preserve">0.858 p.u. / 1.0 s</w:t>
+              <w:t xml:space="preserve">0 MW</w:t>
             </w:r>
           </w:p>
         </w:tc>
@@ -6248,7 +6198,7 @@
                 <w:sz w:val="18"/>
                 <w:szCs w:val="18"/>
               </w:rPr>
-              <w:t xml:space="preserve"/>
+              <w:t xml:space="preserve">Bus 44 voltage (wind variability)</w:t>
             </w:r>
           </w:p>
         </w:tc>
@@ -6278,32 +6228,7 @@
                 <w:sz w:val="18"/>
                 <w:szCs w:val="18"/>
               </w:rPr>
-              <w:t xml:space="preserve">PF, </w:t>
-            </w:r>
-            <w:r>
-              <w:rPr>
-                <w:rFonts w:ascii="Times New Roman" w:cs="Times New Roman" w:eastAsia="Times New Roman" w:hAnsi="Times New Roman"/>
-                <w:sz w:val="18"/>
-                <w:szCs w:val="18"/>
-              </w:rPr>
-              <w:t xml:space="preserve">T</w:t>
-            </w:r>
-            <w:r>
-              <w:rPr>
-                <w:rFonts w:ascii="Times New Roman" w:cs="Times New Roman" w:eastAsia="Times New Roman" w:hAnsi="Times New Roman"/>
-                <w:sz w:val="18"/>
-                <w:szCs w:val="18"/>
-                <w:vertAlign w:val="subscript"/>
-              </w:rPr>
-              <w:t xml:space="preserve">comm</w:t>
-            </w:r>
-            <w:r>
-              <w:rPr>
-                <w:rFonts w:ascii="Times New Roman" w:cs="Times New Roman" w:eastAsia="Times New Roman" w:hAnsi="Times New Roman"/>
-                <w:sz w:val="18"/>
-                <w:szCs w:val="18"/>
-              </w:rPr>
-              <w:t xml:space="preserve">=200 ms</w:t>
+              <w:t xml:space="preserve">SG-only baseline</w:t>
             </w:r>
           </w:p>
         </w:tc>
@@ -6333,7 +6258,7 @@
                 <w:sz w:val="18"/>
                 <w:szCs w:val="18"/>
               </w:rPr>
-              <w:t xml:space="preserve">Nadir / time &lt; 0.90 p.u.</w:t>
+              <w:t xml:space="preserve">Min. / time &lt; 0.90 p.u.</w:t>
             </w:r>
           </w:p>
         </w:tc>
@@ -6363,7 +6288,7 @@
                 <w:sz w:val="18"/>
                 <w:szCs w:val="18"/>
               </w:rPr>
-              <w:t xml:space="preserve">0.827 p.u. / 1.5 s</w:t>
+              <w:t xml:space="preserve">0.878 p.u. / 1.5 s</w:t>
             </w:r>
           </w:p>
         </w:tc>
@@ -6395,7 +6320,7 @@
                 <w:sz w:val="18"/>
                 <w:szCs w:val="18"/>
               </w:rPr>
-              <w:t xml:space="preserve">Frequency deviation (a), 39-bus</w:t>
+              <w:t xml:space="preserve"/>
             </w:r>
           </w:p>
         </w:tc>
@@ -6425,7 +6350,7 @@
                 <w:sz w:val="18"/>
                 <w:szCs w:val="18"/>
               </w:rPr>
-              <w:t xml:space="preserve">No control / PI-AGC</w:t>
+              <w:t xml:space="preserve">50% RES, no control</w:t>
             </w:r>
           </w:p>
         </w:tc>
@@ -6455,7 +6380,7 @@
                 <w:sz w:val="18"/>
                 <w:szCs w:val="18"/>
               </w:rPr>
-              <w:t xml:space="preserve">Δf nadir</w:t>
+              <w:t xml:space="preserve">Min. / time &lt; 0.90 p.u.</w:t>
             </w:r>
           </w:p>
         </w:tc>
@@ -6485,7 +6410,7 @@
                 <w:sz w:val="18"/>
                 <w:szCs w:val="18"/>
               </w:rPr>
-              <w:t xml:space="preserve">−1.70 / −0.90 Hz</w:t>
+              <w:t xml:space="preserve">0.823 p.u. / 5.0 s</w:t>
             </w:r>
           </w:p>
         </w:tc>
@@ -6547,7 +6472,32 @@
                 <w:sz w:val="18"/>
                 <w:szCs w:val="18"/>
               </w:rPr>
-              <w:t xml:space="preserve">CNN-LSTM + SVC</w:t>
+              <w:t xml:space="preserve">CNN-LSTM + SVC, </w:t>
+            </w:r>
+            <w:r>
+              <w:rPr>
+                <w:rFonts w:ascii="Times New Roman" w:cs="Times New Roman" w:eastAsia="Times New Roman" w:hAnsi="Times New Roman"/>
+                <w:sz w:val="18"/>
+                <w:szCs w:val="18"/>
+              </w:rPr>
+              <w:t xml:space="preserve">T</w:t>
+            </w:r>
+            <w:r>
+              <w:rPr>
+                <w:rFonts w:ascii="Times New Roman" w:cs="Times New Roman" w:eastAsia="Times New Roman" w:hAnsi="Times New Roman"/>
+                <w:sz w:val="18"/>
+                <w:szCs w:val="18"/>
+                <w:vertAlign w:val="subscript"/>
+              </w:rPr>
+              <w:t xml:space="preserve">comm</w:t>
+            </w:r>
+            <w:r>
+              <w:rPr>
+                <w:rFonts w:ascii="Times New Roman" w:cs="Times New Roman" w:eastAsia="Times New Roman" w:hAnsi="Times New Roman"/>
+                <w:sz w:val="18"/>
+                <w:szCs w:val="18"/>
+              </w:rPr>
+              <w:t xml:space="preserve">=0</w:t>
             </w:r>
           </w:p>
         </w:tc>
@@ -6577,7 +6527,7 @@
                 <w:sz w:val="18"/>
                 <w:szCs w:val="18"/>
               </w:rPr>
-              <w:t xml:space="preserve">Δf nadir</w:t>
+              <w:t xml:space="preserve">Min. / time &lt; 0.90 p.u.</w:t>
             </w:r>
           </w:p>
         </w:tc>
@@ -6607,7 +6557,7 @@
                 <w:sz w:val="18"/>
                 <w:szCs w:val="18"/>
               </w:rPr>
-              <w:t xml:space="preserve">−1.70 Hz (before action)</w:t>
+              <w:t xml:space="preserve">0.838 p.u. / 1.8 s</w:t>
             </w:r>
           </w:p>
         </w:tc>
@@ -6639,7 +6589,7 @@
                 <w:sz w:val="18"/>
                 <w:szCs w:val="18"/>
               </w:rPr>
-              <w:t xml:space="preserve">Frequency deviation (b)</w:t>
+              <w:t xml:space="preserve"/>
             </w:r>
           </w:p>
         </w:tc>
@@ -6669,7 +6619,32 @@
                 <w:sz w:val="18"/>
                 <w:szCs w:val="18"/>
               </w:rPr>
-              <w:t xml:space="preserve">9 / 39 / 118-bus, CNN-LSTM + SVC</w:t>
+              <w:t xml:space="preserve">CNN-LSTM + SVC, </w:t>
+            </w:r>
+            <w:r>
+              <w:rPr>
+                <w:rFonts w:ascii="Times New Roman" w:cs="Times New Roman" w:eastAsia="Times New Roman" w:hAnsi="Times New Roman"/>
+                <w:sz w:val="18"/>
+                <w:szCs w:val="18"/>
+              </w:rPr>
+              <w:t xml:space="preserve">T</w:t>
+            </w:r>
+            <w:r>
+              <w:rPr>
+                <w:rFonts w:ascii="Times New Roman" w:cs="Times New Roman" w:eastAsia="Times New Roman" w:hAnsi="Times New Roman"/>
+                <w:sz w:val="18"/>
+                <w:szCs w:val="18"/>
+                <w:vertAlign w:val="subscript"/>
+              </w:rPr>
+              <w:t xml:space="preserve">comm</w:t>
+            </w:r>
+            <w:r>
+              <w:rPr>
+                <w:rFonts w:ascii="Times New Roman" w:cs="Times New Roman" w:eastAsia="Times New Roman" w:hAnsi="Times New Roman"/>
+                <w:sz w:val="18"/>
+                <w:szCs w:val="18"/>
+              </w:rPr>
+              <w:t xml:space="preserve">=200 ms</w:t>
             </w:r>
           </w:p>
         </w:tc>
@@ -6699,7 +6674,7 @@
                 <w:sz w:val="18"/>
                 <w:szCs w:val="18"/>
               </w:rPr>
-              <w:t xml:space="preserve">Δf nadir</w:t>
+              <w:t xml:space="preserve">Min. / time &lt; 0.90 p.u.</w:t>
             </w:r>
           </w:p>
         </w:tc>
@@ -6729,7 +6704,7 @@
                 <w:sz w:val="18"/>
                 <w:szCs w:val="18"/>
               </w:rPr>
-              <w:t xml:space="preserve">−0.57 / −0.67 / −0.75 Hz</w:t>
+              <w:t xml:space="preserve">0.828 p.u. / 1.8 s</w:t>
             </w:r>
           </w:p>
         </w:tc>
@@ -6761,7 +6736,7 @@
                 <w:sz w:val="18"/>
                 <w:szCs w:val="18"/>
               </w:rPr>
-              <w:t xml:space="preserve"/>
+              <w:t xml:space="preserve">Bus 44 voltage collapse</w:t>
             </w:r>
           </w:p>
         </w:tc>
@@ -6791,7 +6766,7 @@
                 <w:sz w:val="18"/>
                 <w:szCs w:val="18"/>
               </w:rPr>
-              <w:t xml:space="preserve">9 / 39 / 118-bus, second dip</w:t>
+              <w:t xml:space="preserve">All cases</w:t>
             </w:r>
           </w:p>
         </w:tc>
@@ -6821,7 +6796,7 @@
                 <w:sz w:val="18"/>
                 <w:szCs w:val="18"/>
               </w:rPr>
-              <w:t xml:space="preserve">No control → CNN-LSTM</w:t>
+              <w:t xml:space="preserve">Pre-disturbance voltage</w:t>
             </w:r>
           </w:p>
         </w:tc>
@@ -6851,7 +6826,7 @@
                 <w:sz w:val="18"/>
                 <w:szCs w:val="18"/>
               </w:rPr>
-              <w:t xml:space="preserve">−0.27/−0.31/−0.35 → ≈ −0.04 Hz</w:t>
+              <w:t xml:space="preserve">0.942 p.u.</w:t>
             </w:r>
           </w:p>
         </w:tc>
@@ -6883,7 +6858,7 @@
                 <w:sz w:val="18"/>
                 <w:szCs w:val="18"/>
               </w:rPr>
-              <w:t xml:space="preserve">Frequency and ROCOF (UFLS)</w:t>
+              <w:t xml:space="preserve"/>
             </w:r>
           </w:p>
         </w:tc>
@@ -6943,7 +6918,7 @@
                 <w:sz w:val="18"/>
                 <w:szCs w:val="18"/>
               </w:rPr>
-              <w:t xml:space="preserve">Nadir / UFLS / |ROCOF|max</w:t>
+              <w:t xml:space="preserve">Min. / at 10 s</w:t>
             </w:r>
           </w:p>
         </w:tc>
@@ -6973,7 +6948,7 @@
                 <w:sz w:val="18"/>
                 <w:szCs w:val="18"/>
               </w:rPr>
-              <w:t xml:space="preserve">48.02 Hz / stages 1+2 / 2.48 Hz/s</w:t>
+              <w:t xml:space="preserve">0.621 p.u. / 0.621 p.u. (collapse)</w:t>
             </w:r>
           </w:p>
         </w:tc>
@@ -7035,7 +7010,7 @@
                 <w:sz w:val="18"/>
                 <w:szCs w:val="18"/>
               </w:rPr>
-              <w:t xml:space="preserve">CC/PI-AGC</w:t>
+              <w:t xml:space="preserve">CC</w:t>
             </w:r>
           </w:p>
         </w:tc>
@@ -7065,7 +7040,7 @@
                 <w:sz w:val="18"/>
                 <w:szCs w:val="18"/>
               </w:rPr>
-              <w:t xml:space="preserve">Nadir / UFLS / |ROCOF|max</w:t>
+              <w:t xml:space="preserve">Min. / at 10 s</w:t>
             </w:r>
           </w:p>
         </w:tc>
@@ -7095,7 +7070,7 @@
                 <w:sz w:val="18"/>
                 <w:szCs w:val="18"/>
               </w:rPr>
-              <w:t xml:space="preserve">48.22 Hz / stages 1+2 / 2.45 Hz/s</w:t>
+              <w:t xml:space="preserve">0.782 p.u. / 0.860 p.u.</w:t>
             </w:r>
           </w:p>
         </w:tc>
@@ -7212,7 +7187,7 @@
                 <w:sz w:val="18"/>
                 <w:szCs w:val="18"/>
               </w:rPr>
-              <w:t xml:space="preserve">Nadir / UFLS / |ROCOF|max</w:t>
+              <w:t xml:space="preserve">Min. / time &lt; 0.90 p.u. / at 10 s</w:t>
             </w:r>
           </w:p>
         </w:tc>
@@ -7242,7 +7217,7 @@
                 <w:sz w:val="18"/>
                 <w:szCs w:val="18"/>
               </w:rPr>
-              <w:t xml:space="preserve">48.28 Hz / stages 1+2 / 2.48 Hz/s</w:t>
+              <w:t xml:space="preserve">0.894 p.u. / 0.18 s / 0.938 p.u.</w:t>
             </w:r>
           </w:p>
         </w:tc>
@@ -7359,7 +7334,7 @@
                 <w:sz w:val="18"/>
                 <w:szCs w:val="18"/>
               </w:rPr>
-              <w:t xml:space="preserve">Nadir / UFLS / |ROCOF|max</w:t>
+              <w:t xml:space="preserve">Min. / time &lt; 0.90 p.u.</w:t>
             </w:r>
           </w:p>
         </w:tc>
@@ -7389,7 +7364,7 @@
                 <w:sz w:val="18"/>
                 <w:szCs w:val="18"/>
               </w:rPr>
-              <w:t xml:space="preserve">48.09 Hz / stages 1+2 / 2.48 Hz/s</w:t>
+              <w:t xml:space="preserve">0.871 p.u. / 0.73 s</w:t>
             </w:r>
           </w:p>
         </w:tc>
@@ -7421,7 +7396,7 @@
                 <w:sz w:val="18"/>
                 <w:szCs w:val="18"/>
               </w:rPr>
-              <w:t xml:space="preserve"/>
+              <w:t xml:space="preserve">G10 NC / CC / PF</w:t>
             </w:r>
           </w:p>
         </w:tc>
@@ -7451,7 +7426,7 @@
                 <w:sz w:val="18"/>
                 <w:szCs w:val="18"/>
               </w:rPr>
-              <w:t xml:space="preserve">All cases</w:t>
+              <w:t xml:space="preserve">NC</w:t>
             </w:r>
           </w:p>
         </w:tc>
@@ -7481,7 +7456,7 @@
                 <w:sz w:val="18"/>
                 <w:szCs w:val="18"/>
               </w:rPr>
-              <w:t xml:space="preserve">UFLS-1 / UFLS-2 pickup (NC)</w:t>
+              <w:t xml:space="preserve">Loss of synchronism</w:t>
             </w:r>
           </w:p>
         </w:tc>
@@ -7511,7 +7486,7 @@
                 <w:sz w:val="18"/>
                 <w:szCs w:val="18"/>
               </w:rPr>
-              <w:t xml:space="preserve">0.92 s / 1.13 s (before SVC action)</w:t>
+              <w:t xml:space="preserve">1.33 s</w:t>
             </w:r>
           </w:p>
         </w:tc>
@@ -7543,7 +7518,7 @@
                 <w:sz w:val="18"/>
                 <w:szCs w:val="18"/>
               </w:rPr>
-              <w:t xml:space="preserve">Generator and BESS power</w:t>
+              <w:t xml:space="preserve"/>
             </w:r>
           </w:p>
         </w:tc>
@@ -7573,7 +7548,7 @@
                 <w:sz w:val="18"/>
                 <w:szCs w:val="18"/>
               </w:rPr>
-              <w:t xml:space="preserve">BESS Bus 3 / Bus 29</w:t>
+              <w:t xml:space="preserve">CC</w:t>
             </w:r>
           </w:p>
         </w:tc>
@@ -7603,7 +7578,7 @@
                 <w:sz w:val="18"/>
                 <w:szCs w:val="18"/>
               </w:rPr>
-              <w:t xml:space="preserve">Full output reached</w:t>
+              <w:t xml:space="preserve">Loss of synchronism</w:t>
             </w:r>
           </w:p>
         </w:tc>
@@ -7633,7 +7608,7 @@
                 <w:sz w:val="18"/>
                 <w:szCs w:val="18"/>
               </w:rPr>
-              <w:t xml:space="preserve">1.219 s / 1.331 s</w:t>
+              <w:t xml:space="preserve">1.40 s</w:t>
             </w:r>
           </w:p>
         </w:tc>
@@ -7695,7 +7670,32 @@
                 <w:sz w:val="18"/>
                 <w:szCs w:val="18"/>
               </w:rPr>
-              <w:t xml:space="preserve">BESS total</w:t>
+              <w:t xml:space="preserve">PF, </w:t>
+            </w:r>
+            <w:r>
+              <w:rPr>
+                <w:rFonts w:ascii="Times New Roman" w:cs="Times New Roman" w:eastAsia="Times New Roman" w:hAnsi="Times New Roman"/>
+                <w:sz w:val="18"/>
+                <w:szCs w:val="18"/>
+              </w:rPr>
+              <w:t xml:space="preserve">T</w:t>
+            </w:r>
+            <w:r>
+              <w:rPr>
+                <w:rFonts w:ascii="Times New Roman" w:cs="Times New Roman" w:eastAsia="Times New Roman" w:hAnsi="Times New Roman"/>
+                <w:sz w:val="18"/>
+                <w:szCs w:val="18"/>
+                <w:vertAlign w:val="subscript"/>
+              </w:rPr>
+              <w:t xml:space="preserve">comm</w:t>
+            </w:r>
+            <w:r>
+              <w:rPr>
+                <w:rFonts w:ascii="Times New Roman" w:cs="Times New Roman" w:eastAsia="Times New Roman" w:hAnsi="Times New Roman"/>
+                <w:sz w:val="18"/>
+                <w:szCs w:val="18"/>
+              </w:rPr>
+              <w:t xml:space="preserve">=0</w:t>
             </w:r>
           </w:p>
         </w:tc>
@@ -7725,7 +7725,7 @@
                 <w:sz w:val="18"/>
                 <w:szCs w:val="18"/>
               </w:rPr>
-              <w:t xml:space="preserve">Delivered in first-swing window (0.50–0.70 s)</w:t>
+              <w:t xml:space="preserve">Peak δ</w:t>
             </w:r>
           </w:p>
         </w:tc>
@@ -7755,7 +7755,7 @@
                 <w:sz w:val="18"/>
                 <w:szCs w:val="18"/>
               </w:rPr>
-              <w:t xml:space="preserve">0 MW</w:t>
+              <w:t xml:space="preserve">75.0°</w:t>
             </w:r>
           </w:p>
         </w:tc>
@@ -7787,7 +7787,7 @@
                 <w:sz w:val="18"/>
                 <w:szCs w:val="18"/>
               </w:rPr>
-              <w:t xml:space="preserve">G10 NC / CC / PF</w:t>
+              <w:t xml:space="preserve"/>
             </w:r>
           </w:p>
         </w:tc>
@@ -7817,7 +7817,32 @@
                 <w:sz w:val="18"/>
                 <w:szCs w:val="18"/>
               </w:rPr>
-              <w:t xml:space="preserve">NC</w:t>
+              <w:t xml:space="preserve">PF, </w:t>
+            </w:r>
+            <w:r>
+              <w:rPr>
+                <w:rFonts w:ascii="Times New Roman" w:cs="Times New Roman" w:eastAsia="Times New Roman" w:hAnsi="Times New Roman"/>
+                <w:sz w:val="18"/>
+                <w:szCs w:val="18"/>
+              </w:rPr>
+              <w:t xml:space="preserve">T</w:t>
+            </w:r>
+            <w:r>
+              <w:rPr>
+                <w:rFonts w:ascii="Times New Roman" w:cs="Times New Roman" w:eastAsia="Times New Roman" w:hAnsi="Times New Roman"/>
+                <w:sz w:val="18"/>
+                <w:szCs w:val="18"/>
+                <w:vertAlign w:val="subscript"/>
+              </w:rPr>
+              <w:t xml:space="preserve">comm</w:t>
+            </w:r>
+            <w:r>
+              <w:rPr>
+                <w:rFonts w:ascii="Times New Roman" w:cs="Times New Roman" w:eastAsia="Times New Roman" w:hAnsi="Times New Roman"/>
+                <w:sz w:val="18"/>
+                <w:szCs w:val="18"/>
+              </w:rPr>
+              <w:t xml:space="preserve">=200 ms</w:t>
             </w:r>
           </w:p>
         </w:tc>
@@ -7847,7 +7872,7 @@
                 <w:sz w:val="18"/>
                 <w:szCs w:val="18"/>
               </w:rPr>
-              <w:t xml:space="preserve">Loss of synchronism</w:t>
+              <w:t xml:space="preserve">Peak δ</w:t>
             </w:r>
           </w:p>
         </w:tc>
@@ -7877,7 +7902,7 @@
                 <w:sz w:val="18"/>
                 <w:szCs w:val="18"/>
               </w:rPr>
-              <w:t xml:space="preserve">1.47 s</w:t>
+              <w:t xml:space="preserve">106.0°</w:t>
             </w:r>
           </w:p>
         </w:tc>
@@ -7909,7 +7934,7 @@
                 <w:sz w:val="18"/>
                 <w:szCs w:val="18"/>
               </w:rPr>
-              <w:t xml:space="preserve"/>
+              <w:t xml:space="preserve">STATCOM saturation</w:t>
             </w:r>
           </w:p>
         </w:tc>
@@ -7939,7 +7964,7 @@
                 <w:sz w:val="18"/>
                 <w:szCs w:val="18"/>
               </w:rPr>
-              <w:t xml:space="preserve">CC</w:t>
+              <w:t xml:space="preserve">Case T alone (148 Mvar)</w:t>
             </w:r>
           </w:p>
         </w:tc>
@@ -7969,7 +7994,7 @@
                 <w:sz w:val="18"/>
                 <w:szCs w:val="18"/>
               </w:rPr>
-              <w:t xml:space="preserve">Loss of synchronism</w:t>
+              <w:t xml:space="preserve">Peak δ / margin</w:t>
             </w:r>
           </w:p>
         </w:tc>
@@ -7999,7 +8024,7 @@
                 <w:sz w:val="18"/>
                 <w:szCs w:val="18"/>
               </w:rPr>
-              <w:t xml:space="preserve">1.60 s</w:t>
+              <w:t xml:space="preserve">75.0° / 105°</w:t>
             </w:r>
           </w:p>
         </w:tc>
@@ -8061,32 +8086,7 @@
                 <w:sz w:val="18"/>
                 <w:szCs w:val="18"/>
               </w:rPr>
-              <w:t xml:space="preserve">PF, </w:t>
-            </w:r>
-            <w:r>
-              <w:rPr>
-                <w:rFonts w:ascii="Times New Roman" w:cs="Times New Roman" w:eastAsia="Times New Roman" w:hAnsi="Times New Roman"/>
-                <w:sz w:val="18"/>
-                <w:szCs w:val="18"/>
-              </w:rPr>
-              <w:t xml:space="preserve">T</w:t>
-            </w:r>
-            <w:r>
-              <w:rPr>
-                <w:rFonts w:ascii="Times New Roman" w:cs="Times New Roman" w:eastAsia="Times New Roman" w:hAnsi="Times New Roman"/>
-                <w:sz w:val="18"/>
-                <w:szCs w:val="18"/>
-                <w:vertAlign w:val="subscript"/>
-              </w:rPr>
-              <w:t xml:space="preserve">comm</w:t>
-            </w:r>
-            <w:r>
-              <w:rPr>
-                <w:rFonts w:ascii="Times New Roman" w:cs="Times New Roman" w:eastAsia="Times New Roman" w:hAnsi="Times New Roman"/>
-                <w:sz w:val="18"/>
-                <w:szCs w:val="18"/>
-              </w:rPr>
-              <w:t xml:space="preserve">=0</w:t>
+              <w:t xml:space="preserve">Combined (168 Mvar demand, capped 150)</w:t>
             </w:r>
           </w:p>
         </w:tc>
@@ -8116,7 +8116,7 @@
                 <w:sz w:val="18"/>
                 <w:szCs w:val="18"/>
               </w:rPr>
-              <w:t xml:space="preserve">Peak δ</w:t>
+              <w:t xml:space="preserve">Peak δ / margin</w:t>
             </w:r>
           </w:p>
         </w:tc>
@@ -8146,7 +8146,7 @@
                 <w:sz w:val="18"/>
                 <w:szCs w:val="18"/>
               </w:rPr>
-              <w:t xml:space="preserve">64.1°</w:t>
+              <w:t xml:space="preserve">79.2° / 101°</w:t>
             </w:r>
           </w:p>
         </w:tc>
@@ -8208,32 +8208,7 @@
                 <w:sz w:val="18"/>
                 <w:szCs w:val="18"/>
               </w:rPr>
-              <w:t xml:space="preserve">PF, </w:t>
-            </w:r>
-            <w:r>
-              <w:rPr>
-                <w:rFonts w:ascii="Times New Roman" w:cs="Times New Roman" w:eastAsia="Times New Roman" w:hAnsi="Times New Roman"/>
-                <w:sz w:val="18"/>
-                <w:szCs w:val="18"/>
-              </w:rPr>
-              <w:t xml:space="preserve">T</w:t>
-            </w:r>
-            <w:r>
-              <w:rPr>
-                <w:rFonts w:ascii="Times New Roman" w:cs="Times New Roman" w:eastAsia="Times New Roman" w:hAnsi="Times New Roman"/>
-                <w:sz w:val="18"/>
-                <w:szCs w:val="18"/>
-                <w:vertAlign w:val="subscript"/>
-              </w:rPr>
-              <w:t xml:space="preserve">comm</w:t>
-            </w:r>
-            <w:r>
-              <w:rPr>
-                <w:rFonts w:ascii="Times New Roman" w:cs="Times New Roman" w:eastAsia="Times New Roman" w:hAnsi="Times New Roman"/>
-                <w:sz w:val="18"/>
-                <w:szCs w:val="18"/>
-              </w:rPr>
-              <w:t xml:space="preserve">=200 ms</w:t>
+              <w:t xml:space="preserve">Combined</w:t>
             </w:r>
           </w:p>
         </w:tc>
@@ -8263,7 +8238,7 @@
                 <w:sz w:val="18"/>
                 <w:szCs w:val="18"/>
               </w:rPr>
-              <w:t xml:space="preserve">Peak δ</w:t>
+              <w:t xml:space="preserve">Saturation window</w:t>
             </w:r>
           </w:p>
         </w:tc>
@@ -8293,7 +8268,7 @@
                 <w:sz w:val="18"/>
                 <w:szCs w:val="18"/>
               </w:rPr>
-              <w:t xml:space="preserve">90.6°</w:t>
+              <w:t xml:space="preserve">0.640–1.00 s</w:t>
             </w:r>
           </w:p>
         </w:tc>
@@ -8305,7 +8280,7 @@
             <w:tcBorders>
               <w:top w:val="none" w:color="FFFFFF" w:sz="0"/>
               <w:left w:val="none" w:color="FFFFFF" w:sz="0"/>
-              <w:bottom w:val="none" w:color="FFFFFF" w:sz="0"/>
+              <w:bottom w:val="single" w:color="000000" w:sz="4"/>
               <w:right w:val="none" w:color="FFFFFF" w:sz="0"/>
             </w:tcBorders>
             <w:tcMar>
@@ -8325,7 +8300,7 @@
                 <w:sz w:val="18"/>
                 <w:szCs w:val="18"/>
               </w:rPr>
-              <w:t xml:space="preserve">STATCOM saturation</w:t>
+              <w:t xml:space="preserve"/>
             </w:r>
           </w:p>
         </w:tc>
@@ -8335,27 +8310,27 @@
             <w:tcBorders>
               <w:top w:val="none" w:color="FFFFFF" w:sz="0"/>
               <w:left w:val="none" w:color="FFFFFF" w:sz="0"/>
-              <w:bottom w:val="none" w:color="FFFFFF" w:sz="0"/>
-              <w:right w:val="none" w:color="FFFFFF" w:sz="0"/>
-            </w:tcBorders>
-            <w:tcMar>
-              <w:top w:type="dxa" w:w="50"/>
-              <w:left w:type="dxa" w:w="90"/>
-              <w:bottom w:type="dxa" w:w="50"/>
-              <w:right w:type="dxa" w:w="90"/>
-            </w:tcMar>
-          </w:tcPr>
-          <w:p>
-            <w:pPr>
-              <w:jc w:val="center"/>
-            </w:pPr>
-            <w:r>
-              <w:rPr>
-                <w:rFonts w:ascii="Times New Roman" w:cs="Times New Roman" w:eastAsia="Times New Roman" w:hAnsi="Times New Roman"/>
-                <w:sz w:val="18"/>
-                <w:szCs w:val="18"/>
-              </w:rPr>
-              <w:t xml:space="preserve">Case T alone (140 Mvar)</w:t>
+              <w:bottom w:val="single" w:color="000000" w:sz="4"/>
+              <w:right w:val="none" w:color="FFFFFF" w:sz="0"/>
+            </w:tcBorders>
+            <w:tcMar>
+              <w:top w:type="dxa" w:w="50"/>
+              <w:left w:type="dxa" w:w="90"/>
+              <w:bottom w:type="dxa" w:w="50"/>
+              <w:right w:type="dxa" w:w="90"/>
+            </w:tcMar>
+          </w:tcPr>
+          <w:p>
+            <w:pPr>
+              <w:jc w:val="center"/>
+            </w:pPr>
+            <w:r>
+              <w:rPr>
+                <w:rFonts w:ascii="Times New Roman" w:cs="Times New Roman" w:eastAsia="Times New Roman" w:hAnsi="Times New Roman"/>
+                <w:sz w:val="18"/>
+                <w:szCs w:val="18"/>
+              </w:rPr>
+              <w:t xml:space="preserve">No control (combined)</w:t>
             </w:r>
           </w:p>
         </w:tc>
@@ -8365,27 +8340,27 @@
             <w:tcBorders>
               <w:top w:val="none" w:color="FFFFFF" w:sz="0"/>
               <w:left w:val="none" w:color="FFFFFF" w:sz="0"/>
-              <w:bottom w:val="none" w:color="FFFFFF" w:sz="0"/>
-              <w:right w:val="none" w:color="FFFFFF" w:sz="0"/>
-            </w:tcBorders>
-            <w:tcMar>
-              <w:top w:type="dxa" w:w="50"/>
-              <w:left w:type="dxa" w:w="90"/>
-              <w:bottom w:type="dxa" w:w="50"/>
-              <w:right w:type="dxa" w:w="90"/>
-            </w:tcMar>
-          </w:tcPr>
-          <w:p>
-            <w:pPr>
-              <w:jc w:val="center"/>
-            </w:pPr>
-            <w:r>
-              <w:rPr>
-                <w:rFonts w:ascii="Times New Roman" w:cs="Times New Roman" w:eastAsia="Times New Roman" w:hAnsi="Times New Roman"/>
-                <w:sz w:val="18"/>
-                <w:szCs w:val="18"/>
-              </w:rPr>
-              <w:t xml:space="preserve">Peak δ / margin</w:t>
+              <w:bottom w:val="single" w:color="000000" w:sz="4"/>
+              <w:right w:val="none" w:color="FFFFFF" w:sz="0"/>
+            </w:tcBorders>
+            <w:tcMar>
+              <w:top w:type="dxa" w:w="50"/>
+              <w:left w:type="dxa" w:w="90"/>
+              <w:bottom w:type="dxa" w:w="50"/>
+              <w:right w:type="dxa" w:w="90"/>
+            </w:tcMar>
+          </w:tcPr>
+          <w:p>
+            <w:pPr>
+              <w:jc w:val="center"/>
+            </w:pPr>
+            <w:r>
+              <w:rPr>
+                <w:rFonts w:ascii="Times New Roman" w:cs="Times New Roman" w:eastAsia="Times New Roman" w:hAnsi="Times New Roman"/>
+                <w:sz w:val="18"/>
+                <w:szCs w:val="18"/>
+              </w:rPr>
+              <w:t xml:space="preserve">180° crossing</w:t>
             </w:r>
           </w:p>
         </w:tc>
@@ -8395,282 +8370,6 @@
             <w:tcBorders>
               <w:top w:val="none" w:color="FFFFFF" w:sz="0"/>
               <w:left w:val="none" w:color="FFFFFF" w:sz="0"/>
-              <w:bottom w:val="none" w:color="FFFFFF" w:sz="0"/>
-              <w:right w:val="none" w:color="FFFFFF" w:sz="0"/>
-            </w:tcBorders>
-            <w:tcMar>
-              <w:top w:type="dxa" w:w="50"/>
-              <w:left w:type="dxa" w:w="90"/>
-              <w:bottom w:type="dxa" w:w="50"/>
-              <w:right w:type="dxa" w:w="90"/>
-            </w:tcMar>
-          </w:tcPr>
-          <w:p>
-            <w:pPr>
-              <w:jc w:val="center"/>
-            </w:pPr>
-            <w:r>
-              <w:rPr>
-                <w:rFonts w:ascii="Times New Roman" w:cs="Times New Roman" w:eastAsia="Times New Roman" w:hAnsi="Times New Roman"/>
-                <w:sz w:val="18"/>
-                <w:szCs w:val="18"/>
-              </w:rPr>
-              <w:t xml:space="preserve">64.1° / 116°</w:t>
-            </w:r>
-          </w:p>
-        </w:tc>
-      </w:tr>
-      <w:tr>
-        <w:tc>
-          <w:tcPr>
-            <w:tcW w:type="dxa" w:w="2300"/>
-            <w:tcBorders>
-              <w:top w:val="none" w:color="FFFFFF" w:sz="0"/>
-              <w:left w:val="none" w:color="FFFFFF" w:sz="0"/>
-              <w:bottom w:val="none" w:color="FFFFFF" w:sz="0"/>
-              <w:right w:val="none" w:color="FFFFFF" w:sz="0"/>
-            </w:tcBorders>
-            <w:tcMar>
-              <w:top w:type="dxa" w:w="50"/>
-              <w:left w:type="dxa" w:w="90"/>
-              <w:bottom w:type="dxa" w:w="50"/>
-              <w:right w:type="dxa" w:w="90"/>
-            </w:tcMar>
-          </w:tcPr>
-          <w:p>
-            <w:pPr>
-              <w:jc w:val="left"/>
-            </w:pPr>
-            <w:r>
-              <w:rPr>
-                <w:rFonts w:ascii="Times New Roman" w:cs="Times New Roman" w:eastAsia="Times New Roman" w:hAnsi="Times New Roman"/>
-                <w:sz w:val="18"/>
-                <w:szCs w:val="18"/>
-              </w:rPr>
-              <w:t xml:space="preserve"/>
-            </w:r>
-          </w:p>
-        </w:tc>
-        <w:tc>
-          <w:tcPr>
-            <w:tcW w:type="dxa" w:w="3000"/>
-            <w:tcBorders>
-              <w:top w:val="none" w:color="FFFFFF" w:sz="0"/>
-              <w:left w:val="none" w:color="FFFFFF" w:sz="0"/>
-              <w:bottom w:val="none" w:color="FFFFFF" w:sz="0"/>
-              <w:right w:val="none" w:color="FFFFFF" w:sz="0"/>
-            </w:tcBorders>
-            <w:tcMar>
-              <w:top w:type="dxa" w:w="50"/>
-              <w:left w:type="dxa" w:w="90"/>
-              <w:bottom w:type="dxa" w:w="50"/>
-              <w:right w:type="dxa" w:w="90"/>
-            </w:tcMar>
-          </w:tcPr>
-          <w:p>
-            <w:pPr>
-              <w:jc w:val="center"/>
-            </w:pPr>
-            <w:r>
-              <w:rPr>
-                <w:rFonts w:ascii="Times New Roman" w:cs="Times New Roman" w:eastAsia="Times New Roman" w:hAnsi="Times New Roman"/>
-                <w:sz w:val="18"/>
-                <w:szCs w:val="18"/>
-              </w:rPr>
-              <w:t xml:space="preserve">Combined (170 Mvar demand, capped 150)</w:t>
-            </w:r>
-          </w:p>
-        </w:tc>
-        <w:tc>
-          <w:tcPr>
-            <w:tcW w:type="dxa" w:w="2000"/>
-            <w:tcBorders>
-              <w:top w:val="none" w:color="FFFFFF" w:sz="0"/>
-              <w:left w:val="none" w:color="FFFFFF" w:sz="0"/>
-              <w:bottom w:val="none" w:color="FFFFFF" w:sz="0"/>
-              <w:right w:val="none" w:color="FFFFFF" w:sz="0"/>
-            </w:tcBorders>
-            <w:tcMar>
-              <w:top w:type="dxa" w:w="50"/>
-              <w:left w:type="dxa" w:w="90"/>
-              <w:bottom w:type="dxa" w:w="50"/>
-              <w:right w:type="dxa" w:w="90"/>
-            </w:tcMar>
-          </w:tcPr>
-          <w:p>
-            <w:pPr>
-              <w:jc w:val="center"/>
-            </w:pPr>
-            <w:r>
-              <w:rPr>
-                <w:rFonts w:ascii="Times New Roman" w:cs="Times New Roman" w:eastAsia="Times New Roman" w:hAnsi="Times New Roman"/>
-                <w:sz w:val="18"/>
-                <w:szCs w:val="18"/>
-              </w:rPr>
-              <w:t xml:space="preserve">Peak δ / margin</w:t>
-            </w:r>
-          </w:p>
-        </w:tc>
-        <w:tc>
-          <w:tcPr>
-            <w:tcW w:type="dxa" w:w="2060"/>
-            <w:tcBorders>
-              <w:top w:val="none" w:color="FFFFFF" w:sz="0"/>
-              <w:left w:val="none" w:color="FFFFFF" w:sz="0"/>
-              <w:bottom w:val="none" w:color="FFFFFF" w:sz="0"/>
-              <w:right w:val="none" w:color="FFFFFF" w:sz="0"/>
-            </w:tcBorders>
-            <w:tcMar>
-              <w:top w:type="dxa" w:w="50"/>
-              <w:left w:type="dxa" w:w="90"/>
-              <w:bottom w:type="dxa" w:w="50"/>
-              <w:right w:type="dxa" w:w="90"/>
-            </w:tcMar>
-          </w:tcPr>
-          <w:p>
-            <w:pPr>
-              <w:jc w:val="center"/>
-            </w:pPr>
-            <w:r>
-              <w:rPr>
-                <w:rFonts w:ascii="Times New Roman" w:cs="Times New Roman" w:eastAsia="Times New Roman" w:hAnsi="Times New Roman"/>
-                <w:sz w:val="18"/>
-                <w:szCs w:val="18"/>
-              </w:rPr>
-              <w:t xml:space="preserve">73.2° / 107°</w:t>
-            </w:r>
-          </w:p>
-        </w:tc>
-      </w:tr>
-      <w:tr>
-        <w:tc>
-          <w:tcPr>
-            <w:tcW w:type="dxa" w:w="2300"/>
-            <w:tcBorders>
-              <w:top w:val="none" w:color="FFFFFF" w:sz="0"/>
-              <w:left w:val="none" w:color="FFFFFF" w:sz="0"/>
-              <w:bottom w:val="none" w:color="FFFFFF" w:sz="0"/>
-              <w:right w:val="none" w:color="FFFFFF" w:sz="0"/>
-            </w:tcBorders>
-            <w:tcMar>
-              <w:top w:type="dxa" w:w="50"/>
-              <w:left w:type="dxa" w:w="90"/>
-              <w:bottom w:type="dxa" w:w="50"/>
-              <w:right w:type="dxa" w:w="90"/>
-            </w:tcMar>
-          </w:tcPr>
-          <w:p>
-            <w:pPr>
-              <w:jc w:val="left"/>
-            </w:pPr>
-            <w:r>
-              <w:rPr>
-                <w:rFonts w:ascii="Times New Roman" w:cs="Times New Roman" w:eastAsia="Times New Roman" w:hAnsi="Times New Roman"/>
-                <w:sz w:val="18"/>
-                <w:szCs w:val="18"/>
-              </w:rPr>
-              <w:t xml:space="preserve"/>
-            </w:r>
-          </w:p>
-        </w:tc>
-        <w:tc>
-          <w:tcPr>
-            <w:tcW w:type="dxa" w:w="3000"/>
-            <w:tcBorders>
-              <w:top w:val="none" w:color="FFFFFF" w:sz="0"/>
-              <w:left w:val="none" w:color="FFFFFF" w:sz="0"/>
-              <w:bottom w:val="none" w:color="FFFFFF" w:sz="0"/>
-              <w:right w:val="none" w:color="FFFFFF" w:sz="0"/>
-            </w:tcBorders>
-            <w:tcMar>
-              <w:top w:type="dxa" w:w="50"/>
-              <w:left w:type="dxa" w:w="90"/>
-              <w:bottom w:type="dxa" w:w="50"/>
-              <w:right w:type="dxa" w:w="90"/>
-            </w:tcMar>
-          </w:tcPr>
-          <w:p>
-            <w:pPr>
-              <w:jc w:val="center"/>
-            </w:pPr>
-            <w:r>
-              <w:rPr>
-                <w:rFonts w:ascii="Times New Roman" w:cs="Times New Roman" w:eastAsia="Times New Roman" w:hAnsi="Times New Roman"/>
-                <w:sz w:val="18"/>
-                <w:szCs w:val="18"/>
-              </w:rPr>
-              <w:t xml:space="preserve">Combined</w:t>
-            </w:r>
-          </w:p>
-        </w:tc>
-        <w:tc>
-          <w:tcPr>
-            <w:tcW w:type="dxa" w:w="2000"/>
-            <w:tcBorders>
-              <w:top w:val="none" w:color="FFFFFF" w:sz="0"/>
-              <w:left w:val="none" w:color="FFFFFF" w:sz="0"/>
-              <w:bottom w:val="none" w:color="FFFFFF" w:sz="0"/>
-              <w:right w:val="none" w:color="FFFFFF" w:sz="0"/>
-            </w:tcBorders>
-            <w:tcMar>
-              <w:top w:type="dxa" w:w="50"/>
-              <w:left w:type="dxa" w:w="90"/>
-              <w:bottom w:type="dxa" w:w="50"/>
-              <w:right w:type="dxa" w:w="90"/>
-            </w:tcMar>
-          </w:tcPr>
-          <w:p>
-            <w:pPr>
-              <w:jc w:val="center"/>
-            </w:pPr>
-            <w:r>
-              <w:rPr>
-                <w:rFonts w:ascii="Times New Roman" w:cs="Times New Roman" w:eastAsia="Times New Roman" w:hAnsi="Times New Roman"/>
-                <w:sz w:val="18"/>
-                <w:szCs w:val="18"/>
-              </w:rPr>
-              <w:t xml:space="preserve">Saturation window</w:t>
-            </w:r>
-          </w:p>
-        </w:tc>
-        <w:tc>
-          <w:tcPr>
-            <w:tcW w:type="dxa" w:w="2060"/>
-            <w:tcBorders>
-              <w:top w:val="none" w:color="FFFFFF" w:sz="0"/>
-              <w:left w:val="none" w:color="FFFFFF" w:sz="0"/>
-              <w:bottom w:val="none" w:color="FFFFFF" w:sz="0"/>
-              <w:right w:val="none" w:color="FFFFFF" w:sz="0"/>
-            </w:tcBorders>
-            <w:tcMar>
-              <w:top w:type="dxa" w:w="50"/>
-              <w:left w:type="dxa" w:w="90"/>
-              <w:bottom w:type="dxa" w:w="50"/>
-              <w:right w:type="dxa" w:w="90"/>
-            </w:tcMar>
-          </w:tcPr>
-          <w:p>
-            <w:pPr>
-              <w:jc w:val="center"/>
-            </w:pPr>
-            <w:r>
-              <w:rPr>
-                <w:rFonts w:ascii="Times New Roman" w:cs="Times New Roman" w:eastAsia="Times New Roman" w:hAnsi="Times New Roman"/>
-                <w:sz w:val="18"/>
-                <w:szCs w:val="18"/>
-              </w:rPr>
-              <w:t xml:space="preserve">0.640–3.23 s</w:t>
-            </w:r>
-          </w:p>
-        </w:tc>
-      </w:tr>
-      <w:tr>
-        <w:tc>
-          <w:tcPr>
-            <w:tcW w:type="dxa" w:w="2300"/>
-            <w:tcBorders>
-              <w:top w:val="none" w:color="FFFFFF" w:sz="0"/>
-              <w:left w:val="none" w:color="FFFFFF" w:sz="0"/>
               <w:bottom w:val="single" w:color="000000" w:sz="4"/>
               <w:right w:val="none" w:color="FFFFFF" w:sz="0"/>
             </w:tcBorders>
@@ -8683,105 +8382,15 @@
           </w:tcPr>
           <w:p>
             <w:pPr>
-              <w:jc w:val="left"/>
-            </w:pPr>
-            <w:r>
-              <w:rPr>
-                <w:rFonts w:ascii="Times New Roman" w:cs="Times New Roman" w:eastAsia="Times New Roman" w:hAnsi="Times New Roman"/>
-                <w:sz w:val="18"/>
-                <w:szCs w:val="18"/>
-              </w:rPr>
-              <w:t xml:space="preserve"/>
-            </w:r>
-          </w:p>
-        </w:tc>
-        <w:tc>
-          <w:tcPr>
-            <w:tcW w:type="dxa" w:w="3000"/>
-            <w:tcBorders>
-              <w:top w:val="none" w:color="FFFFFF" w:sz="0"/>
-              <w:left w:val="none" w:color="FFFFFF" w:sz="0"/>
-              <w:bottom w:val="single" w:color="000000" w:sz="4"/>
-              <w:right w:val="none" w:color="FFFFFF" w:sz="0"/>
-            </w:tcBorders>
-            <w:tcMar>
-              <w:top w:type="dxa" w:w="50"/>
-              <w:left w:type="dxa" w:w="90"/>
-              <w:bottom w:type="dxa" w:w="50"/>
-              <w:right w:type="dxa" w:w="90"/>
-            </w:tcMar>
-          </w:tcPr>
-          <w:p>
-            <w:pPr>
-              <w:jc w:val="center"/>
-            </w:pPr>
-            <w:r>
-              <w:rPr>
-                <w:rFonts w:ascii="Times New Roman" w:cs="Times New Roman" w:eastAsia="Times New Roman" w:hAnsi="Times New Roman"/>
-                <w:sz w:val="18"/>
-                <w:szCs w:val="18"/>
-              </w:rPr>
-              <w:t xml:space="preserve">No control (combined)</w:t>
-            </w:r>
-          </w:p>
-        </w:tc>
-        <w:tc>
-          <w:tcPr>
-            <w:tcW w:type="dxa" w:w="2000"/>
-            <w:tcBorders>
-              <w:top w:val="none" w:color="FFFFFF" w:sz="0"/>
-              <w:left w:val="none" w:color="FFFFFF" w:sz="0"/>
-              <w:bottom w:val="single" w:color="000000" w:sz="4"/>
-              <w:right w:val="none" w:color="FFFFFF" w:sz="0"/>
-            </w:tcBorders>
-            <w:tcMar>
-              <w:top w:type="dxa" w:w="50"/>
-              <w:left w:type="dxa" w:w="90"/>
-              <w:bottom w:type="dxa" w:w="50"/>
-              <w:right w:type="dxa" w:w="90"/>
-            </w:tcMar>
-          </w:tcPr>
-          <w:p>
-            <w:pPr>
-              <w:jc w:val="center"/>
-            </w:pPr>
-            <w:r>
-              <w:rPr>
-                <w:rFonts w:ascii="Times New Roman" w:cs="Times New Roman" w:eastAsia="Times New Roman" w:hAnsi="Times New Roman"/>
-                <w:sz w:val="18"/>
-                <w:szCs w:val="18"/>
-              </w:rPr>
-              <w:t xml:space="preserve">180° crossing</w:t>
-            </w:r>
-          </w:p>
-        </w:tc>
-        <w:tc>
-          <w:tcPr>
-            <w:tcW w:type="dxa" w:w="2060"/>
-            <w:tcBorders>
-              <w:top w:val="none" w:color="FFFFFF" w:sz="0"/>
-              <w:left w:val="none" w:color="FFFFFF" w:sz="0"/>
-              <w:bottom w:val="single" w:color="000000" w:sz="4"/>
-              <w:right w:val="none" w:color="FFFFFF" w:sz="0"/>
-            </w:tcBorders>
-            <w:tcMar>
-              <w:top w:type="dxa" w:w="50"/>
-              <w:left w:type="dxa" w:w="90"/>
-              <w:bottom w:type="dxa" w:w="50"/>
-              <w:right w:type="dxa" w:w="90"/>
-            </w:tcMar>
-          </w:tcPr>
-          <w:p>
-            <w:pPr>
-              <w:jc w:val="center"/>
-            </w:pPr>
-            <w:r>
-              <w:rPr>
-                <w:rFonts w:ascii="Times New Roman" w:cs="Times New Roman" w:eastAsia="Times New Roman" w:hAnsi="Times New Roman"/>
-                <w:sz w:val="18"/>
-                <w:szCs w:val="18"/>
-              </w:rPr>
-              <w:t xml:space="preserve">1.33 s</w:t>
+              <w:jc w:val="center"/>
+            </w:pPr>
+            <w:r>
+              <w:rPr>
+                <w:rFonts w:ascii="Times New Roman" w:cs="Times New Roman" w:eastAsia="Times New Roman" w:hAnsi="Times New Roman"/>
+                <w:sz w:val="18"/>
+                <w:szCs w:val="18"/>
+              </w:rPr>
+              <w:t xml:space="preserve">1.27 s</w:t>
             </w:r>
           </w:p>
         </w:tc>
@@ -9124,7 +8733,7 @@
                 <w:sz w:val="18"/>
                 <w:szCs w:val="18"/>
               </w:rPr>
-              <w:t xml:space="preserve">64.1° (stable)</w:t>
+              <w:t xml:space="preserve">75.0° (stable)</w:t>
             </w:r>
           </w:p>
         </w:tc>
@@ -9184,7 +8793,7 @@
                 <w:sz w:val="18"/>
                 <w:szCs w:val="18"/>
               </w:rPr>
-              <w:t xml:space="preserve">68.5° (stable)</w:t>
+              <w:t xml:space="preserve">79.8° (stable)</w:t>
             </w:r>
           </w:p>
         </w:tc>
@@ -9276,7 +8885,7 @@
                 <w:sz w:val="18"/>
                 <w:szCs w:val="18"/>
               </w:rPr>
-              <w:t xml:space="preserve">70.0° (stable)</w:t>
+              <w:t xml:space="preserve">82.0° (stable)</w:t>
             </w:r>
           </w:p>
         </w:tc>
@@ -9336,7 +8945,7 @@
                 <w:sz w:val="18"/>
                 <w:szCs w:val="18"/>
               </w:rPr>
-              <w:t xml:space="preserve">74.7° (stable)</w:t>
+              <w:t xml:space="preserve">87.1° (stable)</w:t>
             </w:r>
           </w:p>
         </w:tc>
@@ -9428,7 +9037,7 @@
                 <w:sz w:val="18"/>
                 <w:szCs w:val="18"/>
               </w:rPr>
-              <w:t xml:space="preserve">76.4° (stable)</w:t>
+              <w:t xml:space="preserve">89.4° (stable)</w:t>
             </w:r>
           </w:p>
         </w:tc>
@@ -9488,7 +9097,7 @@
                 <w:sz w:val="18"/>
                 <w:szCs w:val="18"/>
               </w:rPr>
-              <w:t xml:space="preserve">81.3° (stable)</w:t>
+              <w:t xml:space="preserve">94.8° (stable)</w:t>
             </w:r>
           </w:p>
         </w:tc>
@@ -9580,7 +9189,7 @@
                 <w:sz w:val="18"/>
                 <w:szCs w:val="18"/>
               </w:rPr>
-              <w:t xml:space="preserve">83.2° (stable)</w:t>
+              <w:t xml:space="preserve">97.3° (stable)</w:t>
             </w:r>
           </w:p>
         </w:tc>
@@ -9640,7 +9249,7 @@
                 <w:sz w:val="18"/>
                 <w:szCs w:val="18"/>
               </w:rPr>
-              <w:t xml:space="preserve">88.5° (stable)</w:t>
+              <w:t xml:space="preserve">103.2° (stable)</w:t>
             </w:r>
           </w:p>
         </w:tc>
@@ -9732,7 +9341,7 @@
                 <w:sz w:val="18"/>
                 <w:szCs w:val="18"/>
               </w:rPr>
-              <w:t xml:space="preserve">90.6° (stable)</w:t>
+              <w:t xml:space="preserve">106.0° (stable)</w:t>
             </w:r>
           </w:p>
         </w:tc>
@@ -9792,7 +9401,7 @@
                 <w:sz w:val="18"/>
                 <w:szCs w:val="18"/>
               </w:rPr>
-              <w:t xml:space="preserve">96.3° (stable)</w:t>
+              <w:t xml:space="preserve">112.8° (stable)</w:t>
             </w:r>
           </w:p>
         </w:tc>
@@ -9884,7 +9493,7 @@
                 <w:sz w:val="18"/>
                 <w:szCs w:val="18"/>
               </w:rPr>
-              <w:t xml:space="preserve">98.5° (stable)</w:t>
+              <w:t xml:space="preserve">116.1° (stable)</w:t>
             </w:r>
           </w:p>
         </w:tc>
@@ -9944,7 +9553,7 @@
                 <w:sz w:val="18"/>
                 <w:szCs w:val="18"/>
               </w:rPr>
-              <w:t xml:space="preserve">104.7° (stable)</w:t>
+              <w:t xml:space="preserve">124.4° (stable)</w:t>
             </w:r>
           </w:p>
         </w:tc>
@@ -10036,7 +9645,7 @@
                 <w:sz w:val="18"/>
                 <w:szCs w:val="18"/>
               </w:rPr>
-              <w:t xml:space="preserve">107.2° (stable)</w:t>
+              <w:t xml:space="preserve">128.7° (stable)</w:t>
             </w:r>
           </w:p>
         </w:tc>
@@ -10096,7 +9705,7 @@
                 <w:sz w:val="18"/>
                 <w:szCs w:val="18"/>
               </w:rPr>
-              <w:t xml:space="preserve">114.2° (stable)</w:t>
+              <w:t xml:space="preserve">Unstable</w:t>
             </w:r>
           </w:p>
         </w:tc>
@@ -10188,7 +9797,7 @@
                 <w:sz w:val="18"/>
                 <w:szCs w:val="18"/>
               </w:rPr>
-              <w:t xml:space="preserve">117.0° (stable)</w:t>
+              <w:t xml:space="preserve">Unstable</w:t>
             </w:r>
           </w:p>
         </w:tc>
@@ -10248,7 +9857,7 @@
                 <w:sz w:val="18"/>
                 <w:szCs w:val="18"/>
               </w:rPr>
-              <w:t xml:space="preserve">125.1° (stable)</w:t>
+              <w:t xml:space="preserve">Unstable</w:t>
             </w:r>
           </w:p>
         </w:tc>
@@ -10340,7 +9949,7 @@
                 <w:sz w:val="18"/>
                 <w:szCs w:val="18"/>
               </w:rPr>
-              <w:t xml:space="preserve">128.5° (stable)</w:t>
+              <w:t xml:space="preserve">Unstable</w:t>
             </w:r>
           </w:p>
         </w:tc>
@@ -10400,7 +10009,7 @@
                 <w:sz w:val="18"/>
                 <w:szCs w:val="18"/>
               </w:rPr>
-              <w:t xml:space="preserve">139.4° (stable)</w:t>
+              <w:t xml:space="preserve">Unstable</w:t>
             </w:r>
           </w:p>
         </w:tc>
@@ -10492,7 +10101,7 @@
                 <w:sz w:val="18"/>
                 <w:szCs w:val="18"/>
               </w:rPr>
-              <w:t xml:space="preserve">145.7° (stable)</w:t>
+              <w:t xml:space="preserve">Unstable</w:t>
             </w:r>
           </w:p>
         </w:tc>
@@ -10722,7 +10331,7 @@
           <w:sz w:val="16"/>
           <w:szCs w:val="16"/>
         </w:rPr>
-        <w:t xml:space="preserve">Critical Tcomm ≈ 452 ms for STATCOM (action at 1.102 s) and ≈ 416 ms for SVC (action at 1.185 s). All G10 values come from one shared model (g10_model.py).</w:t>
+        <w:t xml:space="preserve">Critical Tcomm ≈ 334 ms for STATCOM (action at 0.983 s) and ≈ 299 ms for SVC (action at 1.069 s). All G10 values come from one shared model (g10_model.py).</w:t>
       </w:r>
     </w:p>
     <w:sectPr>

</xml_diff>